<commit_message>
Daily synthetic refresh: demo data through 2025-10-13
</commit_message>
<xml_diff>
--- a/outputs/reports/Marketing_Performance_Report_2025-10.docx
+++ b/outputs/reports/Marketing_Performance_Report_2025-10.docx
@@ -37,7 +37,7 @@
     </w:p>
     <w:p>
       <w:r>
-        <w:t>The synthetic portfolio acquired 496 players and generated 11.8% return on ad spend. D7 retention was 7.7%. Game iOS A produced the strongest D7 retention, while Game iOS A produced the lowest cost per D7 retained player.</w:t>
+        <w:t>The synthetic portfolio acquired 657 players and generated 19.2% return on ad spend. D7 retention was 8.8%. Search Android B produced the strongest D7 retention, while Search Android B produced the lowest cost per D7 retained player.</w:t>
       </w:r>
     </w:p>
     <w:tbl>
@@ -144,7 +144,7 @@
               <w:rPr>
                 <w:b/>
               </w:rPr>
-              <w:t>496</w:t>
+              <w:t>657</w:t>
             </w:r>
           </w:p>
         </w:tc>
@@ -161,7 +161,7 @@
               <w:rPr>
                 <w:b/>
               </w:rPr>
-              <w:t>69.4%</w:t>
+              <w:t>76.4%</w:t>
             </w:r>
           </w:p>
         </w:tc>
@@ -178,7 +178,7 @@
               <w:rPr>
                 <w:b/>
               </w:rPr>
-              <w:t>18.0%</w:t>
+              <w:t>19.6%</w:t>
             </w:r>
           </w:p>
         </w:tc>
@@ -195,7 +195,7 @@
               <w:rPr>
                 <w:b/>
               </w:rPr>
-              <w:t>7.7%</w:t>
+              <w:t>8.8%</w:t>
             </w:r>
           </w:p>
         </w:tc>
@@ -212,7 +212,7 @@
               <w:rPr>
                 <w:b/>
               </w:rPr>
-              <w:t>11.8%</w:t>
+              <w:t>19.2%</w:t>
             </w:r>
           </w:p>
         </w:tc>
@@ -419,7 +419,107 @@
               <w:rPr>
                 <w:sz w:val="15"/>
               </w:rPr>
-              <w:t>Game iOS A</w:t>
+              <w:t>Search Android B</w:t>
+            </w:r>
+          </w:p>
+        </w:tc>
+        <w:tc>
+          <w:tcPr>
+            <w:tcW w:type="dxa" w:w="1080"/>
+            <w:vAlign w:val="center"/>
+          </w:tcPr>
+          <w:p>
+            <w:r>
+              <w:rPr>
+                <w:sz w:val="15"/>
+              </w:rPr>
+              <w:t>Stopped</w:t>
+            </w:r>
+          </w:p>
+        </w:tc>
+        <w:tc>
+          <w:tcPr>
+            <w:tcW w:type="dxa" w:w="864"/>
+            <w:vAlign w:val="center"/>
+          </w:tcPr>
+          <w:p>
+            <w:r>
+              <w:rPr>
+                <w:sz w:val="15"/>
+              </w:rPr>
+              <w:t>13</w:t>
+            </w:r>
+          </w:p>
+        </w:tc>
+        <w:tc>
+          <w:tcPr>
+            <w:tcW w:type="dxa" w:w="936"/>
+            <w:vAlign w:val="center"/>
+          </w:tcPr>
+          <w:p>
+            <w:r>
+              <w:rPr>
+                <w:sz w:val="15"/>
+              </w:rPr>
+              <w:t>$0.23</w:t>
+            </w:r>
+          </w:p>
+        </w:tc>
+        <w:tc>
+          <w:tcPr>
+            <w:tcW w:type="dxa" w:w="1152"/>
+            <w:vAlign w:val="center"/>
+          </w:tcPr>
+          <w:p>
+            <w:r>
+              <w:rPr>
+                <w:sz w:val="15"/>
+              </w:rPr>
+              <w:t>27.3%</w:t>
+            </w:r>
+          </w:p>
+        </w:tc>
+        <w:tc>
+          <w:tcPr>
+            <w:tcW w:type="dxa" w:w="1296"/>
+            <w:vAlign w:val="center"/>
+          </w:tcPr>
+          <w:p>
+            <w:r>
+              <w:rPr>
+                <w:sz w:val="15"/>
+              </w:rPr>
+              <w:t>$1.00</w:t>
+            </w:r>
+          </w:p>
+        </w:tc>
+        <w:tc>
+          <w:tcPr>
+            <w:tcW w:type="dxa" w:w="864"/>
+            <w:vAlign w:val="center"/>
+          </w:tcPr>
+          <w:p>
+            <w:r>
+              <w:rPr>
+                <w:sz w:val="15"/>
+              </w:rPr>
+              <w:t>49.5%</w:t>
+            </w:r>
+          </w:p>
+        </w:tc>
+      </w:tr>
+      <w:tr>
+        <w:tc>
+          <w:tcPr>
+            <w:tcW w:type="dxa" w:w="2880"/>
+            <w:vAlign w:val="center"/>
+          </w:tcPr>
+          <w:p>
+            <w:r>
+              <w:rPr>
+                <w:sz w:val="15"/>
+              </w:rPr>
+              <w:t>Search Android A</w:t>
             </w:r>
           </w:p>
         </w:tc>
@@ -447,7 +547,7 @@
               <w:rPr>
                 <w:sz w:val="15"/>
               </w:rPr>
-              <w:t>89</w:t>
+              <w:t>27</w:t>
             </w:r>
           </w:p>
         </w:tc>
@@ -461,7 +561,7 @@
               <w:rPr>
                 <w:sz w:val="15"/>
               </w:rPr>
-              <w:t>$2.73</w:t>
+              <w:t>$2.55</w:t>
             </w:r>
           </w:p>
         </w:tc>
@@ -475,7 +575,7 @@
               <w:rPr>
                 <w:sz w:val="15"/>
               </w:rPr>
-              <w:t>11.1%</w:t>
+              <w:t>16.7%</w:t>
             </w:r>
           </w:p>
         </w:tc>
@@ -489,7 +589,7 @@
               <w:rPr>
                 <w:sz w:val="15"/>
               </w:rPr>
-              <w:t>$243.41</w:t>
+              <w:t>$34.49</w:t>
             </w:r>
           </w:p>
         </w:tc>
@@ -503,7 +603,7 @@
               <w:rPr>
                 <w:sz w:val="15"/>
               </w:rPr>
-              <w:t>14.4%</w:t>
+              <w:t>100.0%</w:t>
             </w:r>
           </w:p>
         </w:tc>
@@ -547,7 +647,7 @@
               <w:rPr>
                 <w:sz w:val="15"/>
               </w:rPr>
-              <w:t>65</w:t>
+              <w:t>98</w:t>
             </w:r>
           </w:p>
         </w:tc>
@@ -561,7 +661,7 @@
               <w:rPr>
                 <w:sz w:val="15"/>
               </w:rPr>
-              <w:t>$1.14</w:t>
+              <w:t>$1.13</w:t>
             </w:r>
           </w:p>
         </w:tc>
@@ -575,7 +675,7 @@
               <w:rPr>
                 <w:sz w:val="15"/>
               </w:rPr>
-              <w:t>0.0%</w:t>
+              <w:t>15.4%</w:t>
             </w:r>
           </w:p>
         </w:tc>
@@ -589,7 +689,7 @@
               <w:rPr>
                 <w:sz w:val="15"/>
               </w:rPr>
-              <w:t>$nan</w:t>
+              <w:t>$18.42</w:t>
             </w:r>
           </w:p>
         </w:tc>
@@ -603,7 +703,7 @@
               <w:rPr>
                 <w:sz w:val="15"/>
               </w:rPr>
-              <w:t>28.8%</w:t>
+              <w:t>27.6%</w:t>
             </w:r>
           </w:p>
         </w:tc>
@@ -619,7 +719,7 @@
               <w:rPr>
                 <w:sz w:val="15"/>
               </w:rPr>
-              <w:t>Search Android A</w:t>
+              <w:t>Search Android E</w:t>
             </w:r>
           </w:p>
         </w:tc>
@@ -647,7 +747,7 @@
               <w:rPr>
                 <w:sz w:val="15"/>
               </w:rPr>
-              <w:t>17</w:t>
+              <w:t>95</w:t>
             </w:r>
           </w:p>
         </w:tc>
@@ -661,7 +761,7 @@
               <w:rPr>
                 <w:sz w:val="15"/>
               </w:rPr>
-              <w:t>$2.51</w:t>
+              <w:t>$1.44</w:t>
             </w:r>
           </w:p>
         </w:tc>
@@ -675,7 +775,7 @@
               <w:rPr>
                 <w:sz w:val="15"/>
               </w:rPr>
-              <w:t>0.0%</w:t>
+              <w:t>13.9%</w:t>
             </w:r>
           </w:p>
         </w:tc>
@@ -689,7 +789,7 @@
               <w:rPr>
                 <w:sz w:val="15"/>
               </w:rPr>
-              <w:t>$nan</w:t>
+              <w:t>$27.40</w:t>
             </w:r>
           </w:p>
         </w:tc>
@@ -703,7 +803,7 @@
               <w:rPr>
                 <w:sz w:val="15"/>
               </w:rPr>
-              <w:t>22.6%</w:t>
+              <w:t>3.7%</w:t>
             </w:r>
           </w:p>
         </w:tc>
@@ -719,7 +819,7 @@
               <w:rPr>
                 <w:sz w:val="15"/>
               </w:rPr>
-              <w:t>Search Android B</w:t>
+              <w:t>Social iOS C</w:t>
             </w:r>
           </w:p>
         </w:tc>
@@ -733,7 +833,7 @@
               <w:rPr>
                 <w:sz w:val="15"/>
               </w:rPr>
-              <w:t>Stopped</w:t>
+              <w:t>Active</w:t>
             </w:r>
           </w:p>
         </w:tc>
@@ -747,7 +847,7 @@
               <w:rPr>
                 <w:sz w:val="15"/>
               </w:rPr>
-              <w:t>11</w:t>
+              <w:t>71</w:t>
             </w:r>
           </w:p>
         </w:tc>
@@ -761,7 +861,7 @@
               <w:rPr>
                 <w:sz w:val="15"/>
               </w:rPr>
-              <w:t>$0.27</w:t>
+              <w:t>$1.83</w:t>
             </w:r>
           </w:p>
         </w:tc>
@@ -775,7 +875,7 @@
               <w:rPr>
                 <w:sz w:val="15"/>
               </w:rPr>
-              <w:t>0.0%</w:t>
+              <w:t>7.7%</w:t>
             </w:r>
           </w:p>
         </w:tc>
@@ -789,7 +889,7 @@
               <w:rPr>
                 <w:sz w:val="15"/>
               </w:rPr>
-              <w:t>$nan</w:t>
+              <w:t>$64.99</w:t>
             </w:r>
           </w:p>
         </w:tc>
@@ -803,7 +903,107 @@
               <w:rPr>
                 <w:sz w:val="15"/>
               </w:rPr>
-              <w:t>39.0%</w:t>
+              <w:t>11.6%</w:t>
+            </w:r>
+          </w:p>
+        </w:tc>
+      </w:tr>
+      <w:tr>
+        <w:tc>
+          <w:tcPr>
+            <w:tcW w:type="dxa" w:w="2880"/>
+            <w:vAlign w:val="center"/>
+          </w:tcPr>
+          <w:p>
+            <w:r>
+              <w:rPr>
+                <w:sz w:val="15"/>
+              </w:rPr>
+              <w:t>Game iOS A</w:t>
+            </w:r>
+          </w:p>
+        </w:tc>
+        <w:tc>
+          <w:tcPr>
+            <w:tcW w:type="dxa" w:w="1080"/>
+            <w:vAlign w:val="center"/>
+          </w:tcPr>
+          <w:p>
+            <w:r>
+              <w:rPr>
+                <w:sz w:val="15"/>
+              </w:rPr>
+              <w:t>Active</w:t>
+            </w:r>
+          </w:p>
+        </w:tc>
+        <w:tc>
+          <w:tcPr>
+            <w:tcW w:type="dxa" w:w="864"/>
+            <w:vAlign w:val="center"/>
+          </w:tcPr>
+          <w:p>
+            <w:r>
+              <w:rPr>
+                <w:sz w:val="15"/>
+              </w:rPr>
+              <w:t>130</w:t>
+            </w:r>
+          </w:p>
+        </w:tc>
+        <w:tc>
+          <w:tcPr>
+            <w:tcW w:type="dxa" w:w="936"/>
+            <w:vAlign w:val="center"/>
+          </w:tcPr>
+          <w:p>
+            <w:r>
+              <w:rPr>
+                <w:sz w:val="15"/>
+              </w:rPr>
+              <w:t>$2.55</w:t>
+            </w:r>
+          </w:p>
+        </w:tc>
+        <w:tc>
+          <w:tcPr>
+            <w:tcW w:type="dxa" w:w="1152"/>
+            <w:vAlign w:val="center"/>
+          </w:tcPr>
+          <w:p>
+            <w:r>
+              <w:rPr>
+                <w:sz w:val="15"/>
+              </w:rPr>
+              <w:t>5.2%</w:t>
+            </w:r>
+          </w:p>
+        </w:tc>
+        <w:tc>
+          <w:tcPr>
+            <w:tcW w:type="dxa" w:w="1296"/>
+            <w:vAlign w:val="center"/>
+          </w:tcPr>
+          <w:p>
+            <w:r>
+              <w:rPr>
+                <w:sz w:val="15"/>
+              </w:rPr>
+              <w:t>$110.65</w:t>
+            </w:r>
+          </w:p>
+        </w:tc>
+        <w:tc>
+          <w:tcPr>
+            <w:tcW w:type="dxa" w:w="864"/>
+            <w:vAlign w:val="center"/>
+          </w:tcPr>
+          <w:p>
+            <w:r>
+              <w:rPr>
+                <w:sz w:val="15"/>
+              </w:rPr>
+              <w:t>21.6%</w:t>
             </w:r>
           </w:p>
         </w:tc>
@@ -833,7 +1033,7 @@
               <w:rPr>
                 <w:sz w:val="15"/>
               </w:rPr>
-              <w:t>Active</w:t>
+              <w:t>Stopped</w:t>
             </w:r>
           </w:p>
         </w:tc>
@@ -847,7 +1047,7 @@
               <w:rPr>
                 <w:sz w:val="15"/>
               </w:rPr>
-              <w:t>198</w:t>
+              <w:t>199</w:t>
             </w:r>
           </w:p>
         </w:tc>
@@ -861,7 +1061,7 @@
               <w:rPr>
                 <w:sz w:val="15"/>
               </w:rPr>
-              <w:t>$0.96</w:t>
+              <w:t>$0.98</w:t>
             </w:r>
           </w:p>
         </w:tc>
@@ -875,7 +1075,7 @@
               <w:rPr>
                 <w:sz w:val="15"/>
               </w:rPr>
-              <w:t>nan%</w:t>
+              <w:t>1.6%</w:t>
             </w:r>
           </w:p>
         </w:tc>
@@ -889,7 +1089,7 @@
               <w:rPr>
                 <w:sz w:val="15"/>
               </w:rPr>
-              <w:t>$nan</w:t>
+              <w:t>$195.27</w:t>
             </w:r>
           </w:p>
         </w:tc>
@@ -947,7 +1147,7 @@
               <w:rPr>
                 <w:sz w:val="15"/>
               </w:rPr>
-              <w:t>7</w:t>
+              <w:t>10</w:t>
             </w:r>
           </w:p>
         </w:tc>
@@ -961,7 +1161,7 @@
               <w:rPr>
                 <w:sz w:val="15"/>
               </w:rPr>
-              <w:t>$13.86</w:t>
+              <w:t>$14.44</w:t>
             </w:r>
           </w:p>
         </w:tc>
@@ -975,7 +1175,7 @@
               <w:rPr>
                 <w:sz w:val="15"/>
               </w:rPr>
-              <w:t>nan%</w:t>
+              <w:t>0.0%</w:t>
             </w:r>
           </w:p>
         </w:tc>
@@ -989,7 +1189,7 @@
               <w:rPr>
                 <w:sz w:val="15"/>
               </w:rPr>
-              <w:t>$nan</w:t>
+              <w:t>$n/a</w:t>
             </w:r>
           </w:p>
         </w:tc>
@@ -1003,207 +1203,7 @@
               <w:rPr>
                 <w:sz w:val="15"/>
               </w:rPr>
-              <w:t>12.6%</w:t>
-            </w:r>
-          </w:p>
-        </w:tc>
-      </w:tr>
-      <w:tr>
-        <w:tc>
-          <w:tcPr>
-            <w:tcW w:type="dxa" w:w="2880"/>
-            <w:vAlign w:val="center"/>
-          </w:tcPr>
-          <w:p>
-            <w:r>
-              <w:rPr>
-                <w:sz w:val="15"/>
-              </w:rPr>
-              <w:t>Social iOS C</w:t>
-            </w:r>
-          </w:p>
-        </w:tc>
-        <w:tc>
-          <w:tcPr>
-            <w:tcW w:type="dxa" w:w="1080"/>
-            <w:vAlign w:val="center"/>
-          </w:tcPr>
-          <w:p>
-            <w:r>
-              <w:rPr>
-                <w:sz w:val="15"/>
-              </w:rPr>
-              <w:t>Active</w:t>
-            </w:r>
-          </w:p>
-        </w:tc>
-        <w:tc>
-          <w:tcPr>
-            <w:tcW w:type="dxa" w:w="864"/>
-            <w:vAlign w:val="center"/>
-          </w:tcPr>
-          <w:p>
-            <w:r>
-              <w:rPr>
-                <w:sz w:val="15"/>
-              </w:rPr>
-              <w:t>42</w:t>
-            </w:r>
-          </w:p>
-        </w:tc>
-        <w:tc>
-          <w:tcPr>
-            <w:tcW w:type="dxa" w:w="936"/>
-            <w:vAlign w:val="center"/>
-          </w:tcPr>
-          <w:p>
-            <w:r>
-              <w:rPr>
-                <w:sz w:val="15"/>
-              </w:rPr>
-              <w:t>$1.85</w:t>
-            </w:r>
-          </w:p>
-        </w:tc>
-        <w:tc>
-          <w:tcPr>
-            <w:tcW w:type="dxa" w:w="1152"/>
-            <w:vAlign w:val="center"/>
-          </w:tcPr>
-          <w:p>
-            <w:r>
-              <w:rPr>
-                <w:sz w:val="15"/>
-              </w:rPr>
-              <w:t>nan%</w:t>
-            </w:r>
-          </w:p>
-        </w:tc>
-        <w:tc>
-          <w:tcPr>
-            <w:tcW w:type="dxa" w:w="1296"/>
-            <w:vAlign w:val="center"/>
-          </w:tcPr>
-          <w:p>
-            <w:r>
-              <w:rPr>
-                <w:sz w:val="15"/>
-              </w:rPr>
-              <w:t>$nan</w:t>
-            </w:r>
-          </w:p>
-        </w:tc>
-        <w:tc>
-          <w:tcPr>
-            <w:tcW w:type="dxa" w:w="864"/>
-            <w:vAlign w:val="center"/>
-          </w:tcPr>
-          <w:p>
-            <w:r>
-              <w:rPr>
-                <w:sz w:val="15"/>
-              </w:rPr>
-              <w:t>13.4%</w:t>
-            </w:r>
-          </w:p>
-        </w:tc>
-      </w:tr>
-      <w:tr>
-        <w:tc>
-          <w:tcPr>
-            <w:tcW w:type="dxa" w:w="2880"/>
-            <w:vAlign w:val="center"/>
-          </w:tcPr>
-          <w:p>
-            <w:r>
-              <w:rPr>
-                <w:sz w:val="15"/>
-              </w:rPr>
-              <w:t>Search Android E</w:t>
-            </w:r>
-          </w:p>
-        </w:tc>
-        <w:tc>
-          <w:tcPr>
-            <w:tcW w:type="dxa" w:w="1080"/>
-            <w:vAlign w:val="center"/>
-          </w:tcPr>
-          <w:p>
-            <w:r>
-              <w:rPr>
-                <w:sz w:val="15"/>
-              </w:rPr>
-              <w:t>Active</w:t>
-            </w:r>
-          </w:p>
-        </w:tc>
-        <w:tc>
-          <w:tcPr>
-            <w:tcW w:type="dxa" w:w="864"/>
-            <w:vAlign w:val="center"/>
-          </w:tcPr>
-          <w:p>
-            <w:r>
-              <w:rPr>
-                <w:sz w:val="15"/>
-              </w:rPr>
-              <w:t>63</w:t>
-            </w:r>
-          </w:p>
-        </w:tc>
-        <w:tc>
-          <w:tcPr>
-            <w:tcW w:type="dxa" w:w="936"/>
-            <w:vAlign w:val="center"/>
-          </w:tcPr>
-          <w:p>
-            <w:r>
-              <w:rPr>
-                <w:sz w:val="15"/>
-              </w:rPr>
-              <w:t>$1.11</w:t>
-            </w:r>
-          </w:p>
-        </w:tc>
-        <w:tc>
-          <w:tcPr>
-            <w:tcW w:type="dxa" w:w="1152"/>
-            <w:vAlign w:val="center"/>
-          </w:tcPr>
-          <w:p>
-            <w:r>
-              <w:rPr>
-                <w:sz w:val="15"/>
-              </w:rPr>
-              <w:t>nan%</w:t>
-            </w:r>
-          </w:p>
-        </w:tc>
-        <w:tc>
-          <w:tcPr>
-            <w:tcW w:type="dxa" w:w="1296"/>
-            <w:vAlign w:val="center"/>
-          </w:tcPr>
-          <w:p>
-            <w:r>
-              <w:rPr>
-                <w:sz w:val="15"/>
-              </w:rPr>
-              <w:t>$nan</w:t>
-            </w:r>
-          </w:p>
-        </w:tc>
-        <w:tc>
-          <w:tcPr>
-            <w:tcW w:type="dxa" w:w="864"/>
-            <w:vAlign w:val="center"/>
-          </w:tcPr>
-          <w:p>
-            <w:r>
-              <w:rPr>
-                <w:sz w:val="15"/>
-              </w:rPr>
-              <w:t>4.5%</w:t>
+              <w:t>14.6%</w:t>
             </w:r>
           </w:p>
         </w:tc>
@@ -1275,7 +1275,7 @@
               <w:rPr>
                 <w:sz w:val="15"/>
               </w:rPr>
-              <w:t>nan%</w:t>
+              <w:t>0.0%</w:t>
             </w:r>
           </w:p>
         </w:tc>
@@ -1289,7 +1289,7 @@
               <w:rPr>
                 <w:sz w:val="15"/>
               </w:rPr>
-              <w:t>$nan</w:t>
+              <w:t>$n/a</w:t>
             </w:r>
           </w:p>
         </w:tc>
@@ -1375,7 +1375,7 @@
               <w:rPr>
                 <w:sz w:val="15"/>
               </w:rPr>
-              <w:t>nan%</w:t>
+              <w:t>0.0%</w:t>
             </w:r>
           </w:p>
         </w:tc>
@@ -1389,7 +1389,7 @@
               <w:rPr>
                 <w:sz w:val="15"/>
               </w:rPr>
-              <w:t>$nan</w:t>
+              <w:t>$n/a</w:t>
             </w:r>
           </w:p>
         </w:tc>
@@ -1403,7 +1403,207 @@
               <w:rPr>
                 <w:sz w:val="15"/>
               </w:rPr>
-              <w:t>nan%</w:t>
+              <w:t>n/a</w:t>
+            </w:r>
+          </w:p>
+        </w:tc>
+      </w:tr>
+      <w:tr>
+        <w:tc>
+          <w:tcPr>
+            <w:tcW w:type="dxa" w:w="2880"/>
+            <w:vAlign w:val="center"/>
+          </w:tcPr>
+          <w:p>
+            <w:r>
+              <w:rPr>
+                <w:sz w:val="15"/>
+              </w:rPr>
+              <w:t>Game Android E</w:t>
+            </w:r>
+          </w:p>
+        </w:tc>
+        <w:tc>
+          <w:tcPr>
+            <w:tcW w:type="dxa" w:w="1080"/>
+            <w:vAlign w:val="center"/>
+          </w:tcPr>
+          <w:p>
+            <w:r>
+              <w:rPr>
+                <w:sz w:val="15"/>
+              </w:rPr>
+              <w:t>Active</w:t>
+            </w:r>
+          </w:p>
+        </w:tc>
+        <w:tc>
+          <w:tcPr>
+            <w:tcW w:type="dxa" w:w="864"/>
+            <w:vAlign w:val="center"/>
+          </w:tcPr>
+          <w:p>
+            <w:r>
+              <w:rPr>
+                <w:sz w:val="15"/>
+              </w:rPr>
+              <w:t>10</w:t>
+            </w:r>
+          </w:p>
+        </w:tc>
+        <w:tc>
+          <w:tcPr>
+            <w:tcW w:type="dxa" w:w="936"/>
+            <w:vAlign w:val="center"/>
+          </w:tcPr>
+          <w:p>
+            <w:r>
+              <w:rPr>
+                <w:sz w:val="15"/>
+              </w:rPr>
+              <w:t>$2.39</w:t>
+            </w:r>
+          </w:p>
+        </w:tc>
+        <w:tc>
+          <w:tcPr>
+            <w:tcW w:type="dxa" w:w="1152"/>
+            <w:vAlign w:val="center"/>
+          </w:tcPr>
+          <w:p>
+            <w:r>
+              <w:rPr>
+                <w:sz w:val="15"/>
+              </w:rPr>
+              <w:t>n/a</w:t>
+            </w:r>
+          </w:p>
+        </w:tc>
+        <w:tc>
+          <w:tcPr>
+            <w:tcW w:type="dxa" w:w="1296"/>
+            <w:vAlign w:val="center"/>
+          </w:tcPr>
+          <w:p>
+            <w:r>
+              <w:rPr>
+                <w:sz w:val="15"/>
+              </w:rPr>
+              <w:t>$n/a</w:t>
+            </w:r>
+          </w:p>
+        </w:tc>
+        <w:tc>
+          <w:tcPr>
+            <w:tcW w:type="dxa" w:w="864"/>
+            <w:vAlign w:val="center"/>
+          </w:tcPr>
+          <w:p>
+            <w:r>
+              <w:rPr>
+                <w:sz w:val="15"/>
+              </w:rPr>
+              <w:t>11.7%</w:t>
+            </w:r>
+          </w:p>
+        </w:tc>
+      </w:tr>
+      <w:tr>
+        <w:tc>
+          <w:tcPr>
+            <w:tcW w:type="dxa" w:w="2880"/>
+            <w:vAlign w:val="center"/>
+          </w:tcPr>
+          <w:p>
+            <w:r>
+              <w:rPr>
+                <w:sz w:val="15"/>
+              </w:rPr>
+              <w:t>Discovery iOS A</w:t>
+            </w:r>
+          </w:p>
+        </w:tc>
+        <w:tc>
+          <w:tcPr>
+            <w:tcW w:type="dxa" w:w="1080"/>
+            <w:vAlign w:val="center"/>
+          </w:tcPr>
+          <w:p>
+            <w:r>
+              <w:rPr>
+                <w:sz w:val="15"/>
+              </w:rPr>
+              <w:t>Stopped</w:t>
+            </w:r>
+          </w:p>
+        </w:tc>
+        <w:tc>
+          <w:tcPr>
+            <w:tcW w:type="dxa" w:w="864"/>
+            <w:vAlign w:val="center"/>
+          </w:tcPr>
+          <w:p>
+            <w:r>
+              <w:rPr>
+                <w:sz w:val="15"/>
+              </w:rPr>
+              <w:t>n/a</w:t>
+            </w:r>
+          </w:p>
+        </w:tc>
+        <w:tc>
+          <w:tcPr>
+            <w:tcW w:type="dxa" w:w="936"/>
+            <w:vAlign w:val="center"/>
+          </w:tcPr>
+          <w:p>
+            <w:r>
+              <w:rPr>
+                <w:sz w:val="15"/>
+              </w:rPr>
+              <w:t>$n/a</w:t>
+            </w:r>
+          </w:p>
+        </w:tc>
+        <w:tc>
+          <w:tcPr>
+            <w:tcW w:type="dxa" w:w="1152"/>
+            <w:vAlign w:val="center"/>
+          </w:tcPr>
+          <w:p>
+            <w:r>
+              <w:rPr>
+                <w:sz w:val="15"/>
+              </w:rPr>
+              <w:t>n/a</w:t>
+            </w:r>
+          </w:p>
+        </w:tc>
+        <w:tc>
+          <w:tcPr>
+            <w:tcW w:type="dxa" w:w="1296"/>
+            <w:vAlign w:val="center"/>
+          </w:tcPr>
+          <w:p>
+            <w:r>
+              <w:rPr>
+                <w:sz w:val="15"/>
+              </w:rPr>
+              <w:t>$n/a</w:t>
+            </w:r>
+          </w:p>
+        </w:tc>
+        <w:tc>
+          <w:tcPr>
+            <w:tcW w:type="dxa" w:w="864"/>
+            <w:vAlign w:val="center"/>
+          </w:tcPr>
+          <w:p>
+            <w:r>
+              <w:rPr>
+                <w:sz w:val="15"/>
+              </w:rPr>
+              <w:t>n/a</w:t>
             </w:r>
           </w:p>
         </w:tc>
@@ -1419,7 +1619,7 @@
     </w:p>
     <w:p>
       <w:r>
-        <w:t>Quality leaders were Game iOS A, Game iOS B. The strongest return signals came from Search Android B, Game iOS B. Campaign decisions should combine scale, retained-user cost and return rather than optimize installs alone.</w:t>
+        <w:t>Quality leaders were Search Android B, Search Android A. The strongest return signals came from Search Android A, Search Android B. Campaign decisions should combine scale, retained-user cost and return rather than optimize installs alone.</w:t>
       </w:r>
     </w:p>
     <w:p>
@@ -1471,7 +1671,7 @@
     </w:p>
     <w:p>
       <w:r>
-        <w:t>Concept 05 generated the strongest completed-level signal among the synthetic creatives. Creative results should be treated as directional when eligible cohort sizes are small.</w:t>
+        <w:t>Concept 20 generated the strongest completed-level signal among the synthetic creatives. Creative results should be treated as directional when eligible cohort sizes are small.</w:t>
       </w:r>
     </w:p>
     <w:p>
@@ -1487,7 +1687,7 @@
         <w:pStyle w:val="ListBullet"/>
       </w:pPr>
       <w:r>
-        <w:t>Use Game iOS A as the player-quality benchmark for the next controlled test.</w:t>
+        <w:t>Use Search Android B as the player-quality benchmark for the next controlled test.</w:t>
       </w:r>
     </w:p>
     <w:p>
@@ -1495,7 +1695,7 @@
         <w:pStyle w:val="ListBullet"/>
       </w:pPr>
       <w:r>
-        <w:t>Use Game iOS A as the efficiency comparison and monitor D7 retained-user cost.</w:t>
+        <w:t>Use Search Android B as the efficiency comparison and monitor D7 retained-user cost.</w:t>
       </w:r>
     </w:p>
     <w:p>
@@ -1630,7 +1830,7 @@
               <w:rPr>
                 <w:sz w:val="15"/>
               </w:rPr>
-              <w:t>496</w:t>
+              <w:t>657</w:t>
             </w:r>
           </w:p>
         </w:tc>

</xml_diff>

<commit_message>
Daily synthetic refresh: demo data through 2025-10-14
</commit_message>
<xml_diff>
--- a/outputs/reports/Marketing_Performance_Report_2025-10.docx
+++ b/outputs/reports/Marketing_Performance_Report_2025-10.docx
@@ -37,7 +37,7 @@
     </w:p>
     <w:p>
       <w:r>
-        <w:t>The synthetic portfolio acquired 657 players and generated 19.2% return on ad spend. D7 retention was 8.8%. Search Android B produced the strongest D7 retention, while Search Android B produced the lowest cost per D7 retained player.</w:t>
+        <w:t>The synthetic portfolio acquired 703 players and generated 19.3% return on ad spend. D7 retention was 8.7%. Search Android B produced the strongest D7 retention, while Search Android B produced the lowest cost per D7 retained player.</w:t>
       </w:r>
     </w:p>
     <w:tbl>
@@ -144,7 +144,7 @@
               <w:rPr>
                 <w:b/>
               </w:rPr>
-              <w:t>657</w:t>
+              <w:t>703</w:t>
             </w:r>
           </w:p>
         </w:tc>
@@ -161,7 +161,7 @@
               <w:rPr>
                 <w:b/>
               </w:rPr>
-              <w:t>76.4%</w:t>
+              <w:t>77.8%</w:t>
             </w:r>
           </w:p>
         </w:tc>
@@ -178,7 +178,7 @@
               <w:rPr>
                 <w:b/>
               </w:rPr>
-              <w:t>19.6%</w:t>
+              <w:t>20.4%</w:t>
             </w:r>
           </w:p>
         </w:tc>
@@ -195,7 +195,7 @@
               <w:rPr>
                 <w:b/>
               </w:rPr>
-              <w:t>8.8%</w:t>
+              <w:t>8.7%</w:t>
             </w:r>
           </w:p>
         </w:tc>
@@ -212,7 +212,7 @@
               <w:rPr>
                 <w:b/>
               </w:rPr>
-              <w:t>19.2%</w:t>
+              <w:t>19.3%</w:t>
             </w:r>
           </w:p>
         </w:tc>
@@ -547,7 +547,7 @@
               <w:rPr>
                 <w:sz w:val="15"/>
               </w:rPr>
-              <w:t>27</w:t>
+              <w:t>35</w:t>
             </w:r>
           </w:p>
         </w:tc>
@@ -561,7 +561,7 @@
               <w:rPr>
                 <w:sz w:val="15"/>
               </w:rPr>
-              <w:t>$2.55</w:t>
+              <w:t>$2.16</w:t>
             </w:r>
           </w:p>
         </w:tc>
@@ -575,7 +575,7 @@
               <w:rPr>
                 <w:sz w:val="15"/>
               </w:rPr>
-              <w:t>16.7%</w:t>
+              <w:t>15.4%</w:t>
             </w:r>
           </w:p>
         </w:tc>
@@ -589,7 +589,7 @@
               <w:rPr>
                 <w:sz w:val="15"/>
               </w:rPr>
-              <w:t>$34.49</w:t>
+              <w:t>$37.83</w:t>
             </w:r>
           </w:p>
         </w:tc>
@@ -603,7 +603,7 @@
               <w:rPr>
                 <w:sz w:val="15"/>
               </w:rPr>
-              <w:t>100.0%</w:t>
+              <w:t>107.4%</w:t>
             </w:r>
           </w:p>
         </w:tc>
@@ -647,7 +647,7 @@
               <w:rPr>
                 <w:sz w:val="15"/>
               </w:rPr>
-              <w:t>98</w:t>
+              <w:t>107</w:t>
             </w:r>
           </w:p>
         </w:tc>
@@ -661,7 +661,7 @@
               <w:rPr>
                 <w:sz w:val="15"/>
               </w:rPr>
-              <w:t>$1.13</w:t>
+              <w:t>$1.11</w:t>
             </w:r>
           </w:p>
         </w:tc>
@@ -675,7 +675,7 @@
               <w:rPr>
                 <w:sz w:val="15"/>
               </w:rPr>
-              <w:t>15.4%</w:t>
+              <w:t>13.5%</w:t>
             </w:r>
           </w:p>
         </w:tc>
@@ -689,7 +689,7 @@
               <w:rPr>
                 <w:sz w:val="15"/>
               </w:rPr>
-              <w:t>$18.42</w:t>
+              <w:t>$17.00</w:t>
             </w:r>
           </w:p>
         </w:tc>
@@ -703,7 +703,7 @@
               <w:rPr>
                 <w:sz w:val="15"/>
               </w:rPr>
-              <w:t>27.6%</w:t>
+              <w:t>25.4%</w:t>
             </w:r>
           </w:p>
         </w:tc>
@@ -747,7 +747,7 @@
               <w:rPr>
                 <w:sz w:val="15"/>
               </w:rPr>
-              <w:t>95</w:t>
+              <w:t>97</w:t>
             </w:r>
           </w:p>
         </w:tc>
@@ -761,7 +761,7 @@
               <w:rPr>
                 <w:sz w:val="15"/>
               </w:rPr>
-              <w:t>$1.44</w:t>
+              <w:t>$1.52</w:t>
             </w:r>
           </w:p>
         </w:tc>
@@ -775,7 +775,7 @@
               <w:rPr>
                 <w:sz w:val="15"/>
               </w:rPr>
-              <w:t>13.9%</w:t>
+              <w:t>11.6%</w:t>
             </w:r>
           </w:p>
         </w:tc>
@@ -789,7 +789,7 @@
               <w:rPr>
                 <w:sz w:val="15"/>
               </w:rPr>
-              <w:t>$27.40</w:t>
+              <w:t>$29.56</w:t>
             </w:r>
           </w:p>
         </w:tc>
@@ -803,7 +803,107 @@
               <w:rPr>
                 <w:sz w:val="15"/>
               </w:rPr>
-              <w:t>3.7%</w:t>
+              <w:t>4.2%</w:t>
+            </w:r>
+          </w:p>
+        </w:tc>
+      </w:tr>
+      <w:tr>
+        <w:tc>
+          <w:tcPr>
+            <w:tcW w:type="dxa" w:w="2880"/>
+            <w:vAlign w:val="center"/>
+          </w:tcPr>
+          <w:p>
+            <w:r>
+              <w:rPr>
+                <w:sz w:val="15"/>
+              </w:rPr>
+              <w:t>Game iOS A</w:t>
+            </w:r>
+          </w:p>
+        </w:tc>
+        <w:tc>
+          <w:tcPr>
+            <w:tcW w:type="dxa" w:w="1080"/>
+            <w:vAlign w:val="center"/>
+          </w:tcPr>
+          <w:p>
+            <w:r>
+              <w:rPr>
+                <w:sz w:val="15"/>
+              </w:rPr>
+              <w:t>Active</w:t>
+            </w:r>
+          </w:p>
+        </w:tc>
+        <w:tc>
+          <w:tcPr>
+            <w:tcW w:type="dxa" w:w="864"/>
+            <w:vAlign w:val="center"/>
+          </w:tcPr>
+          <w:p>
+            <w:r>
+              <w:rPr>
+                <w:sz w:val="15"/>
+              </w:rPr>
+              <w:t>136</w:t>
+            </w:r>
+          </w:p>
+        </w:tc>
+        <w:tc>
+          <w:tcPr>
+            <w:tcW w:type="dxa" w:w="936"/>
+            <w:vAlign w:val="center"/>
+          </w:tcPr>
+          <w:p>
+            <w:r>
+              <w:rPr>
+                <w:sz w:val="15"/>
+              </w:rPr>
+              <w:t>$2.69</w:t>
+            </w:r>
+          </w:p>
+        </w:tc>
+        <w:tc>
+          <w:tcPr>
+            <w:tcW w:type="dxa" w:w="1152"/>
+            <w:vAlign w:val="center"/>
+          </w:tcPr>
+          <w:p>
+            <w:r>
+              <w:rPr>
+                <w:sz w:val="15"/>
+              </w:rPr>
+              <w:t>11.3%</w:t>
+            </w:r>
+          </w:p>
+        </w:tc>
+        <w:tc>
+          <w:tcPr>
+            <w:tcW w:type="dxa" w:w="1296"/>
+            <w:vAlign w:val="center"/>
+          </w:tcPr>
+          <w:p>
+            <w:r>
+              <w:rPr>
+                <w:sz w:val="15"/>
+              </w:rPr>
+              <w:t>$45.71</w:t>
+            </w:r>
+          </w:p>
+        </w:tc>
+        <w:tc>
+          <w:tcPr>
+            <w:tcW w:type="dxa" w:w="864"/>
+            <w:vAlign w:val="center"/>
+          </w:tcPr>
+          <w:p>
+            <w:r>
+              <w:rPr>
+                <w:sz w:val="15"/>
+              </w:rPr>
+              <w:t>20.2%</w:t>
             </w:r>
           </w:p>
         </w:tc>
@@ -847,7 +947,7 @@
               <w:rPr>
                 <w:sz w:val="15"/>
               </w:rPr>
-              <w:t>71</w:t>
+              <w:t>83</w:t>
             </w:r>
           </w:p>
         </w:tc>
@@ -861,7 +961,7 @@
               <w:rPr>
                 <w:sz w:val="15"/>
               </w:rPr>
-              <w:t>$1.83</w:t>
+              <w:t>$1.72</w:t>
             </w:r>
           </w:p>
         </w:tc>
@@ -875,7 +975,7 @@
               <w:rPr>
                 <w:sz w:val="15"/>
               </w:rPr>
-              <w:t>7.7%</w:t>
+              <w:t>6.7%</w:t>
             </w:r>
           </w:p>
         </w:tc>
@@ -889,7 +989,7 @@
               <w:rPr>
                 <w:sz w:val="15"/>
               </w:rPr>
-              <w:t>$64.99</w:t>
+              <w:t>$71.36</w:t>
             </w:r>
           </w:p>
         </w:tc>
@@ -903,107 +1003,7 @@
               <w:rPr>
                 <w:sz w:val="15"/>
               </w:rPr>
-              <w:t>11.6%</w:t>
-            </w:r>
-          </w:p>
-        </w:tc>
-      </w:tr>
-      <w:tr>
-        <w:tc>
-          <w:tcPr>
-            <w:tcW w:type="dxa" w:w="2880"/>
-            <w:vAlign w:val="center"/>
-          </w:tcPr>
-          <w:p>
-            <w:r>
-              <w:rPr>
-                <w:sz w:val="15"/>
-              </w:rPr>
-              <w:t>Game iOS A</w:t>
-            </w:r>
-          </w:p>
-        </w:tc>
-        <w:tc>
-          <w:tcPr>
-            <w:tcW w:type="dxa" w:w="1080"/>
-            <w:vAlign w:val="center"/>
-          </w:tcPr>
-          <w:p>
-            <w:r>
-              <w:rPr>
-                <w:sz w:val="15"/>
-              </w:rPr>
-              <w:t>Active</w:t>
-            </w:r>
-          </w:p>
-        </w:tc>
-        <w:tc>
-          <w:tcPr>
-            <w:tcW w:type="dxa" w:w="864"/>
-            <w:vAlign w:val="center"/>
-          </w:tcPr>
-          <w:p>
-            <w:r>
-              <w:rPr>
-                <w:sz w:val="15"/>
-              </w:rPr>
-              <w:t>130</w:t>
-            </w:r>
-          </w:p>
-        </w:tc>
-        <w:tc>
-          <w:tcPr>
-            <w:tcW w:type="dxa" w:w="936"/>
-            <w:vAlign w:val="center"/>
-          </w:tcPr>
-          <w:p>
-            <w:r>
-              <w:rPr>
-                <w:sz w:val="15"/>
-              </w:rPr>
-              <w:t>$2.55</w:t>
-            </w:r>
-          </w:p>
-        </w:tc>
-        <w:tc>
-          <w:tcPr>
-            <w:tcW w:type="dxa" w:w="1152"/>
-            <w:vAlign w:val="center"/>
-          </w:tcPr>
-          <w:p>
-            <w:r>
-              <w:rPr>
-                <w:sz w:val="15"/>
-              </w:rPr>
-              <w:t>5.2%</w:t>
-            </w:r>
-          </w:p>
-        </w:tc>
-        <w:tc>
-          <w:tcPr>
-            <w:tcW w:type="dxa" w:w="1296"/>
-            <w:vAlign w:val="center"/>
-          </w:tcPr>
-          <w:p>
-            <w:r>
-              <w:rPr>
-                <w:sz w:val="15"/>
-              </w:rPr>
-              <w:t>$110.65</w:t>
-            </w:r>
-          </w:p>
-        </w:tc>
-        <w:tc>
-          <w:tcPr>
-            <w:tcW w:type="dxa" w:w="864"/>
-            <w:vAlign w:val="center"/>
-          </w:tcPr>
-          <w:p>
-            <w:r>
-              <w:rPr>
-                <w:sz w:val="15"/>
-              </w:rPr>
-              <w:t>21.6%</w:t>
+              <w:t>12.2%</w:t>
             </w:r>
           </w:p>
         </w:tc>
@@ -1075,7 +1075,7 @@
               <w:rPr>
                 <w:sz w:val="15"/>
               </w:rPr>
-              <w:t>1.6%</w:t>
+              <w:t>2.6%</w:t>
             </w:r>
           </w:p>
         </w:tc>
@@ -1089,7 +1089,7 @@
               <w:rPr>
                 <w:sz w:val="15"/>
               </w:rPr>
-              <w:t>$195.27</w:t>
+              <w:t>$65.10</w:t>
             </w:r>
           </w:p>
         </w:tc>
@@ -1161,7 +1161,7 @@
               <w:rPr>
                 <w:sz w:val="15"/>
               </w:rPr>
-              <w:t>$14.44</w:t>
+              <w:t>$15.33</w:t>
             </w:r>
           </w:p>
         </w:tc>
@@ -1203,7 +1203,7 @@
               <w:rPr>
                 <w:sz w:val="15"/>
               </w:rPr>
-              <w:t>14.6%</w:t>
+              <w:t>13.1%</w:t>
             </w:r>
           </w:p>
         </w:tc>
@@ -1447,7 +1447,7 @@
               <w:rPr>
                 <w:sz w:val="15"/>
               </w:rPr>
-              <w:t>10</w:t>
+              <w:t>19</w:t>
             </w:r>
           </w:p>
         </w:tc>
@@ -1461,7 +1461,7 @@
               <w:rPr>
                 <w:sz w:val="15"/>
               </w:rPr>
-              <w:t>$2.39</w:t>
+              <w:t>$1.67</w:t>
             </w:r>
           </w:p>
         </w:tc>
@@ -1503,7 +1503,7 @@
               <w:rPr>
                 <w:sz w:val="15"/>
               </w:rPr>
-              <w:t>11.7%</w:t>
+              <w:t>16.5%</w:t>
             </w:r>
           </w:p>
         </w:tc>
@@ -1830,7 +1830,7 @@
               <w:rPr>
                 <w:sz w:val="15"/>
               </w:rPr>
-              <w:t>657</w:t>
+              <w:t>703</w:t>
             </w:r>
           </w:p>
         </w:tc>

</xml_diff>

<commit_message>
Daily synthetic refresh: demo data through 2025-10-15
</commit_message>
<xml_diff>
--- a/outputs/reports/Marketing_Performance_Report_2025-10.docx
+++ b/outputs/reports/Marketing_Performance_Report_2025-10.docx
@@ -37,7 +37,7 @@
     </w:p>
     <w:p>
       <w:r>
-        <w:t>The synthetic portfolio acquired 703 players and generated 19.1% return on ad spend. D7 retention was 8.7%. Search Android B produced the strongest D7 retention, while Search Android B produced the lowest cost per D7 retained player.</w:t>
+        <w:t>The synthetic portfolio acquired 730 players and generated 16.9% return on ad spend. D7 retention was 8.1%. Search Android B produced the strongest D7 retention, while Search Android B produced the lowest cost per D7 retained player.</w:t>
       </w:r>
     </w:p>
     <w:tbl>
@@ -144,7 +144,7 @@
               <w:rPr>
                 <w:b/>
               </w:rPr>
-              <w:t>703</w:t>
+              <w:t>730</w:t>
             </w:r>
           </w:p>
         </w:tc>
@@ -161,7 +161,7 @@
               <w:rPr>
                 <w:b/>
               </w:rPr>
-              <w:t>77.8%</w:t>
+              <w:t>78.5%</w:t>
             </w:r>
           </w:p>
         </w:tc>
@@ -178,7 +178,7 @@
               <w:rPr>
                 <w:b/>
               </w:rPr>
-              <w:t>20.4%</w:t>
+              <w:t>20.7%</w:t>
             </w:r>
           </w:p>
         </w:tc>
@@ -195,7 +195,7 @@
               <w:rPr>
                 <w:b/>
               </w:rPr>
-              <w:t>8.7%</w:t>
+              <w:t>8.1%</w:t>
             </w:r>
           </w:p>
         </w:tc>
@@ -212,7 +212,7 @@
               <w:rPr>
                 <w:b/>
               </w:rPr>
-              <w:t>19.1%</w:t>
+              <w:t>16.9%</w:t>
             </w:r>
           </w:p>
         </w:tc>
@@ -503,7 +503,7 @@
               <w:rPr>
                 <w:sz w:val="15"/>
               </w:rPr>
-              <w:t>49.8%</w:t>
+              <w:t>45.8%</w:t>
             </w:r>
           </w:p>
         </w:tc>
@@ -547,7 +547,7 @@
               <w:rPr>
                 <w:sz w:val="15"/>
               </w:rPr>
-              <w:t>35</w:t>
+              <w:t>44</w:t>
             </w:r>
           </w:p>
         </w:tc>
@@ -561,7 +561,7 @@
               <w:rPr>
                 <w:sz w:val="15"/>
               </w:rPr>
-              <w:t>$2.17</w:t>
+              <w:t>$2.13</w:t>
             </w:r>
           </w:p>
         </w:tc>
@@ -575,7 +575,7 @@
               <w:rPr>
                 <w:sz w:val="15"/>
               </w:rPr>
-              <w:t>15.4%</w:t>
+              <w:t>21.4%</w:t>
             </w:r>
           </w:p>
         </w:tc>
@@ -589,7 +589,7 @@
               <w:rPr>
                 <w:sz w:val="15"/>
               </w:rPr>
-              <w:t>$38.01</w:t>
+              <w:t>$31.25</w:t>
             </w:r>
           </w:p>
         </w:tc>
@@ -603,7 +603,107 @@
               <w:rPr>
                 <w:sz w:val="15"/>
               </w:rPr>
-              <w:t>107.1%</w:t>
+              <w:t>87.8%</w:t>
+            </w:r>
+          </w:p>
+        </w:tc>
+      </w:tr>
+      <w:tr>
+        <w:tc>
+          <w:tcPr>
+            <w:tcW w:type="dxa" w:w="2880"/>
+            <w:vAlign w:val="center"/>
+          </w:tcPr>
+          <w:p>
+            <w:r>
+              <w:rPr>
+                <w:sz w:val="15"/>
+              </w:rPr>
+              <w:t>Search Android E</w:t>
+            </w:r>
+          </w:p>
+        </w:tc>
+        <w:tc>
+          <w:tcPr>
+            <w:tcW w:type="dxa" w:w="1080"/>
+            <w:vAlign w:val="center"/>
+          </w:tcPr>
+          <w:p>
+            <w:r>
+              <w:rPr>
+                <w:sz w:val="15"/>
+              </w:rPr>
+              <w:t>Active</w:t>
+            </w:r>
+          </w:p>
+        </w:tc>
+        <w:tc>
+          <w:tcPr>
+            <w:tcW w:type="dxa" w:w="864"/>
+            <w:vAlign w:val="center"/>
+          </w:tcPr>
+          <w:p>
+            <w:r>
+              <w:rPr>
+                <w:sz w:val="15"/>
+              </w:rPr>
+              <w:t>100</w:t>
+            </w:r>
+          </w:p>
+        </w:tc>
+        <w:tc>
+          <w:tcPr>
+            <w:tcW w:type="dxa" w:w="936"/>
+            <w:vAlign w:val="center"/>
+          </w:tcPr>
+          <w:p>
+            <w:r>
+              <w:rPr>
+                <w:sz w:val="15"/>
+              </w:rPr>
+              <w:t>$1.48</w:t>
+            </w:r>
+          </w:p>
+        </w:tc>
+        <w:tc>
+          <w:tcPr>
+            <w:tcW w:type="dxa" w:w="1152"/>
+            <w:vAlign w:val="center"/>
+          </w:tcPr>
+          <w:p>
+            <w:r>
+              <w:rPr>
+                <w:sz w:val="15"/>
+              </w:rPr>
+              <w:t>13.0%</w:t>
+            </w:r>
+          </w:p>
+        </w:tc>
+        <w:tc>
+          <w:tcPr>
+            <w:tcW w:type="dxa" w:w="1296"/>
+            <w:vAlign w:val="center"/>
+          </w:tcPr>
+          <w:p>
+            <w:r>
+              <w:rPr>
+                <w:sz w:val="15"/>
+              </w:rPr>
+              <w:t>$24.66</w:t>
+            </w:r>
+          </w:p>
+        </w:tc>
+        <w:tc>
+          <w:tcPr>
+            <w:tcW w:type="dxa" w:w="864"/>
+            <w:vAlign w:val="center"/>
+          </w:tcPr>
+          <w:p>
+            <w:r>
+              <w:rPr>
+                <w:sz w:val="15"/>
+              </w:rPr>
+              <w:t>4.6%</w:t>
             </w:r>
           </w:p>
         </w:tc>
@@ -647,7 +747,7 @@
               <w:rPr>
                 <w:sz w:val="15"/>
               </w:rPr>
-              <w:t>107</w:t>
+              <w:t>110</w:t>
             </w:r>
           </w:p>
         </w:tc>
@@ -675,7 +775,7 @@
               <w:rPr>
                 <w:sz w:val="15"/>
               </w:rPr>
-              <w:t>13.5%</w:t>
+              <w:t>12.5%</w:t>
             </w:r>
           </w:p>
         </w:tc>
@@ -689,7 +789,7 @@
               <w:rPr>
                 <w:sz w:val="15"/>
               </w:rPr>
-              <w:t>$17.61</w:t>
+              <w:t>$18.03</w:t>
             </w:r>
           </w:p>
         </w:tc>
@@ -703,107 +803,7 @@
               <w:rPr>
                 <w:sz w:val="15"/>
               </w:rPr>
-              <w:t>24.8%</w:t>
-            </w:r>
-          </w:p>
-        </w:tc>
-      </w:tr>
-      <w:tr>
-        <w:tc>
-          <w:tcPr>
-            <w:tcW w:type="dxa" w:w="2880"/>
-            <w:vAlign w:val="center"/>
-          </w:tcPr>
-          <w:p>
-            <w:r>
-              <w:rPr>
-                <w:sz w:val="15"/>
-              </w:rPr>
-              <w:t>Search Android E</w:t>
-            </w:r>
-          </w:p>
-        </w:tc>
-        <w:tc>
-          <w:tcPr>
-            <w:tcW w:type="dxa" w:w="1080"/>
-            <w:vAlign w:val="center"/>
-          </w:tcPr>
-          <w:p>
-            <w:r>
-              <w:rPr>
-                <w:sz w:val="15"/>
-              </w:rPr>
-              <w:t>Active</w:t>
-            </w:r>
-          </w:p>
-        </w:tc>
-        <w:tc>
-          <w:tcPr>
-            <w:tcW w:type="dxa" w:w="864"/>
-            <w:vAlign w:val="center"/>
-          </w:tcPr>
-          <w:p>
-            <w:r>
-              <w:rPr>
-                <w:sz w:val="15"/>
-              </w:rPr>
-              <w:t>97</w:t>
-            </w:r>
-          </w:p>
-        </w:tc>
-        <w:tc>
-          <w:tcPr>
-            <w:tcW w:type="dxa" w:w="936"/>
-            <w:vAlign w:val="center"/>
-          </w:tcPr>
-          <w:p>
-            <w:r>
-              <w:rPr>
-                <w:sz w:val="15"/>
-              </w:rPr>
-              <w:t>$1.53</w:t>
-            </w:r>
-          </w:p>
-        </w:tc>
-        <w:tc>
-          <w:tcPr>
-            <w:tcW w:type="dxa" w:w="1152"/>
-            <w:vAlign w:val="center"/>
-          </w:tcPr>
-          <w:p>
-            <w:r>
-              <w:rPr>
-                <w:sz w:val="15"/>
-              </w:rPr>
-              <w:t>11.6%</w:t>
-            </w:r>
-          </w:p>
-        </w:tc>
-        <w:tc>
-          <w:tcPr>
-            <w:tcW w:type="dxa" w:w="1296"/>
-            <w:vAlign w:val="center"/>
-          </w:tcPr>
-          <w:p>
-            <w:r>
-              <w:rPr>
-                <w:sz w:val="15"/>
-              </w:rPr>
-              <w:t>$29.61</w:t>
-            </w:r>
-          </w:p>
-        </w:tc>
-        <w:tc>
-          <w:tcPr>
-            <w:tcW w:type="dxa" w:w="864"/>
-            <w:vAlign w:val="center"/>
-          </w:tcPr>
-          <w:p>
-            <w:r>
-              <w:rPr>
-                <w:sz w:val="15"/>
-              </w:rPr>
-              <w:t>4.3%</w:t>
+              <w:t>24.9%</w:t>
             </w:r>
           </w:p>
         </w:tc>
@@ -847,7 +847,7 @@
               <w:rPr>
                 <w:sz w:val="15"/>
               </w:rPr>
-              <w:t>136</w:t>
+              <w:t>142</w:t>
             </w:r>
           </w:p>
         </w:tc>
@@ -861,7 +861,7 @@
               <w:rPr>
                 <w:sz w:val="15"/>
               </w:rPr>
-              <w:t>$2.71</w:t>
+              <w:t>$2.67</w:t>
             </w:r>
           </w:p>
         </w:tc>
@@ -875,7 +875,7 @@
               <w:rPr>
                 <w:sz w:val="15"/>
               </w:rPr>
-              <w:t>11.3%</w:t>
+              <w:t>10.5%</w:t>
             </w:r>
           </w:p>
         </w:tc>
@@ -889,7 +889,7 @@
               <w:rPr>
                 <w:sz w:val="15"/>
               </w:rPr>
-              <w:t>$46.01</w:t>
+              <w:t>$47.34</w:t>
             </w:r>
           </w:p>
         </w:tc>
@@ -903,7 +903,7 @@
               <w:rPr>
                 <w:sz w:val="15"/>
               </w:rPr>
-              <w:t>20.1%</w:t>
+              <w:t>15.3%</w:t>
             </w:r>
           </w:p>
         </w:tc>
@@ -947,7 +947,7 @@
               <w:rPr>
                 <w:sz w:val="15"/>
               </w:rPr>
-              <w:t>83</w:t>
+              <w:t>86</w:t>
             </w:r>
           </w:p>
         </w:tc>
@@ -961,7 +961,7 @@
               <w:rPr>
                 <w:sz w:val="15"/>
               </w:rPr>
-              <w:t>$1.72</w:t>
+              <w:t>$1.82</w:t>
             </w:r>
           </w:p>
         </w:tc>
@@ -975,7 +975,7 @@
               <w:rPr>
                 <w:sz w:val="15"/>
               </w:rPr>
-              <w:t>6.7%</w:t>
+              <w:t>9.1%</w:t>
             </w:r>
           </w:p>
         </w:tc>
@@ -989,7 +989,7 @@
               <w:rPr>
                 <w:sz w:val="15"/>
               </w:rPr>
-              <w:t>$71.41</w:t>
+              <w:t>$52.18</w:t>
             </w:r>
           </w:p>
         </w:tc>
@@ -1003,7 +1003,7 @@
               <w:rPr>
                 <w:sz w:val="15"/>
               </w:rPr>
-              <w:t>12.2%</w:t>
+              <w:t>11.7%</w:t>
             </w:r>
           </w:p>
         </w:tc>
@@ -1075,7 +1075,7 @@
               <w:rPr>
                 <w:sz w:val="15"/>
               </w:rPr>
-              <w:t>2.6%</w:t>
+              <w:t>1.9%</w:t>
             </w:r>
           </w:p>
         </w:tc>
@@ -1089,7 +1089,7 @@
               <w:rPr>
                 <w:sz w:val="15"/>
               </w:rPr>
-              <w:t>$65.10</w:t>
+              <w:t>$65.12</w:t>
             </w:r>
           </w:p>
         </w:tc>
@@ -1147,7 +1147,7 @@
               <w:rPr>
                 <w:sz w:val="15"/>
               </w:rPr>
-              <w:t>10</w:t>
+              <w:t>11</w:t>
             </w:r>
           </w:p>
         </w:tc>
@@ -1161,7 +1161,7 @@
               <w:rPr>
                 <w:sz w:val="15"/>
               </w:rPr>
-              <w:t>$15.33</w:t>
+              <w:t>$14.53</w:t>
             </w:r>
           </w:p>
         </w:tc>
@@ -1203,7 +1203,7 @@
               <w:rPr>
                 <w:sz w:val="15"/>
               </w:rPr>
-              <w:t>13.4%</w:t>
+              <w:t>9.8%</w:t>
             </w:r>
           </w:p>
         </w:tc>
@@ -1447,7 +1447,7 @@
               <w:rPr>
                 <w:sz w:val="15"/>
               </w:rPr>
-              <w:t>19</w:t>
+              <w:t>21</w:t>
             </w:r>
           </w:p>
         </w:tc>
@@ -1461,7 +1461,7 @@
               <w:rPr>
                 <w:sz w:val="15"/>
               </w:rPr>
-              <w:t>$2.13</w:t>
+              <w:t>$2.33</w:t>
             </w:r>
           </w:p>
         </w:tc>
@@ -1503,7 +1503,7 @@
               <w:rPr>
                 <w:sz w:val="15"/>
               </w:rPr>
-              <w:t>11.9%</w:t>
+              <w:t>11.5%</w:t>
             </w:r>
           </w:p>
         </w:tc>
@@ -1830,7 +1830,7 @@
               <w:rPr>
                 <w:sz w:val="15"/>
               </w:rPr>
-              <w:t>703</w:t>
+              <w:t>730</w:t>
             </w:r>
           </w:p>
         </w:tc>

</xml_diff>

<commit_message>
Daily synthetic refresh: demo data through 2025-10-16
</commit_message>
<xml_diff>
--- a/outputs/reports/Marketing_Performance_Report_2025-10.docx
+++ b/outputs/reports/Marketing_Performance_Report_2025-10.docx
@@ -37,7 +37,7 @@
     </w:p>
     <w:p>
       <w:r>
-        <w:t>The synthetic portfolio acquired 730 players and generated 16.9% return on ad spend. D7 retention was 8.1%. Search Android B produced the strongest D7 retention, while Search Android B produced the lowest cost per D7 retained player.</w:t>
+        <w:t>The synthetic portfolio acquired 764 players and generated 17.4% return on ad spend. D7 retention was 7.4%. Search Android B produced the strongest D7 retention, while Search Android B produced the lowest cost per D7 retained player.</w:t>
       </w:r>
     </w:p>
     <w:tbl>
@@ -144,7 +144,7 @@
               <w:rPr>
                 <w:b/>
               </w:rPr>
-              <w:t>730</w:t>
+              <w:t>764</w:t>
             </w:r>
           </w:p>
         </w:tc>
@@ -161,7 +161,7 @@
               <w:rPr>
                 <w:b/>
               </w:rPr>
-              <w:t>78.5%</w:t>
+              <w:t>79.5%</w:t>
             </w:r>
           </w:p>
         </w:tc>
@@ -178,7 +178,7 @@
               <w:rPr>
                 <w:b/>
               </w:rPr>
-              <w:t>20.7%</w:t>
+              <w:t>20.8%</w:t>
             </w:r>
           </w:p>
         </w:tc>
@@ -195,7 +195,7 @@
               <w:rPr>
                 <w:b/>
               </w:rPr>
-              <w:t>8.1%</w:t>
+              <w:t>7.4%</w:t>
             </w:r>
           </w:p>
         </w:tc>
@@ -212,7 +212,7 @@
               <w:rPr>
                 <w:b/>
               </w:rPr>
-              <w:t>16.9%</w:t>
+              <w:t>17.4%</w:t>
             </w:r>
           </w:p>
         </w:tc>
@@ -447,7 +447,7 @@
               <w:rPr>
                 <w:sz w:val="15"/>
               </w:rPr>
-              <w:t>13</w:t>
+              <w:t>14</w:t>
             </w:r>
           </w:p>
         </w:tc>
@@ -461,7 +461,7 @@
               <w:rPr>
                 <w:sz w:val="15"/>
               </w:rPr>
-              <w:t>$0.23</w:t>
+              <w:t>$0.21</w:t>
             </w:r>
           </w:p>
         </w:tc>
@@ -503,7 +503,7 @@
               <w:rPr>
                 <w:sz w:val="15"/>
               </w:rPr>
-              <w:t>45.8%</w:t>
+              <w:t>46.0%</w:t>
             </w:r>
           </w:p>
         </w:tc>
@@ -547,7 +547,7 @@
               <w:rPr>
                 <w:sz w:val="15"/>
               </w:rPr>
-              <w:t>44</w:t>
+              <w:t>52</w:t>
             </w:r>
           </w:p>
         </w:tc>
@@ -561,7 +561,7 @@
               <w:rPr>
                 <w:sz w:val="15"/>
               </w:rPr>
-              <w:t>$2.13</w:t>
+              <w:t>$2.28</w:t>
             </w:r>
           </w:p>
         </w:tc>
@@ -589,7 +589,7 @@
               <w:rPr>
                 <w:sz w:val="15"/>
               </w:rPr>
-              <w:t>$31.25</w:t>
+              <w:t>$39.56</w:t>
             </w:r>
           </w:p>
         </w:tc>
@@ -603,7 +603,7 @@
               <w:rPr>
                 <w:sz w:val="15"/>
               </w:rPr>
-              <w:t>87.8%</w:t>
+              <w:t>69.7%</w:t>
             </w:r>
           </w:p>
         </w:tc>
@@ -633,7 +633,7 @@
               <w:rPr>
                 <w:sz w:val="15"/>
               </w:rPr>
-              <w:t>Active</w:t>
+              <w:t>Stopped</w:t>
             </w:r>
           </w:p>
         </w:tc>
@@ -647,7 +647,7 @@
               <w:rPr>
                 <w:sz w:val="15"/>
               </w:rPr>
-              <w:t>100</w:t>
+              <w:t>102</w:t>
             </w:r>
           </w:p>
         </w:tc>
@@ -661,7 +661,7 @@
               <w:rPr>
                 <w:sz w:val="15"/>
               </w:rPr>
-              <w:t>$1.48</w:t>
+              <w:t>$1.45</w:t>
             </w:r>
           </w:p>
         </w:tc>
@@ -675,7 +675,7 @@
               <w:rPr>
                 <w:sz w:val="15"/>
               </w:rPr>
-              <w:t>13.0%</w:t>
+              <w:t>13.2%</w:t>
             </w:r>
           </w:p>
         </w:tc>
@@ -689,7 +689,7 @@
               <w:rPr>
                 <w:sz w:val="15"/>
               </w:rPr>
-              <w:t>$24.66</w:t>
+              <w:t>$21.14</w:t>
             </w:r>
           </w:p>
         </w:tc>
@@ -703,7 +703,7 @@
               <w:rPr>
                 <w:sz w:val="15"/>
               </w:rPr>
-              <w:t>4.6%</w:t>
+              <w:t>4.7%</w:t>
             </w:r>
           </w:p>
         </w:tc>
@@ -747,7 +747,7 @@
               <w:rPr>
                 <w:sz w:val="15"/>
               </w:rPr>
-              <w:t>110</w:t>
+              <w:t>118</w:t>
             </w:r>
           </w:p>
         </w:tc>
@@ -761,7 +761,7 @@
               <w:rPr>
                 <w:sz w:val="15"/>
               </w:rPr>
-              <w:t>$1.15</w:t>
+              <w:t>$1.11</w:t>
             </w:r>
           </w:p>
         </w:tc>
@@ -775,7 +775,7 @@
               <w:rPr>
                 <w:sz w:val="15"/>
               </w:rPr>
-              <w:t>12.5%</w:t>
+              <w:t>11.9%</w:t>
             </w:r>
           </w:p>
         </w:tc>
@@ -789,7 +789,7 @@
               <w:rPr>
                 <w:sz w:val="15"/>
               </w:rPr>
-              <w:t>$18.03</w:t>
+              <w:t>$18.75</w:t>
             </w:r>
           </w:p>
         </w:tc>
@@ -803,7 +803,7 @@
               <w:rPr>
                 <w:sz w:val="15"/>
               </w:rPr>
-              <w:t>24.9%</w:t>
+              <w:t>26.5%</w:t>
             </w:r>
           </w:p>
         </w:tc>
@@ -847,7 +847,7 @@
               <w:rPr>
                 <w:sz w:val="15"/>
               </w:rPr>
-              <w:t>142</w:t>
+              <w:t>146</w:t>
             </w:r>
           </w:p>
         </w:tc>
@@ -861,7 +861,7 @@
               <w:rPr>
                 <w:sz w:val="15"/>
               </w:rPr>
-              <w:t>$2.67</w:t>
+              <w:t>$2.65</w:t>
             </w:r>
           </w:p>
         </w:tc>
@@ -875,7 +875,7 @@
               <w:rPr>
                 <w:sz w:val="15"/>
               </w:rPr>
-              <w:t>10.5%</w:t>
+              <w:t>9.6%</w:t>
             </w:r>
           </w:p>
         </w:tc>
@@ -889,7 +889,7 @@
               <w:rPr>
                 <w:sz w:val="15"/>
               </w:rPr>
-              <w:t>$47.34</w:t>
+              <w:t>$48.34</w:t>
             </w:r>
           </w:p>
         </w:tc>
@@ -903,7 +903,7 @@
               <w:rPr>
                 <w:sz w:val="15"/>
               </w:rPr>
-              <w:t>15.3%</w:t>
+              <w:t>15.9%</w:t>
             </w:r>
           </w:p>
         </w:tc>
@@ -947,7 +947,7 @@
               <w:rPr>
                 <w:sz w:val="15"/>
               </w:rPr>
-              <w:t>86</w:t>
+              <w:t>91</w:t>
             </w:r>
           </w:p>
         </w:tc>
@@ -961,7 +961,7 @@
               <w:rPr>
                 <w:sz w:val="15"/>
               </w:rPr>
-              <w:t>$1.82</w:t>
+              <w:t>$1.87</w:t>
             </w:r>
           </w:p>
         </w:tc>
@@ -975,7 +975,7 @@
               <w:rPr>
                 <w:sz w:val="15"/>
               </w:rPr>
-              <w:t>9.1%</w:t>
+              <w:t>7.7%</w:t>
             </w:r>
           </w:p>
         </w:tc>
@@ -989,7 +989,7 @@
               <w:rPr>
                 <w:sz w:val="15"/>
               </w:rPr>
-              <w:t>$52.18</w:t>
+              <w:t>$56.69</w:t>
             </w:r>
           </w:p>
         </w:tc>
@@ -1003,7 +1003,7 @@
               <w:rPr>
                 <w:sz w:val="15"/>
               </w:rPr>
-              <w:t>11.7%</w:t>
+              <w:t>9.9%</w:t>
             </w:r>
           </w:p>
         </w:tc>
@@ -1075,7 +1075,7 @@
               <w:rPr>
                 <w:sz w:val="15"/>
               </w:rPr>
-              <w:t>1.9%</w:t>
+              <w:t>1.6%</w:t>
             </w:r>
           </w:p>
         </w:tc>
@@ -1147,7 +1147,7 @@
               <w:rPr>
                 <w:sz w:val="15"/>
               </w:rPr>
-              <w:t>11</w:t>
+              <w:t>13</w:t>
             </w:r>
           </w:p>
         </w:tc>
@@ -1161,7 +1161,7 @@
               <w:rPr>
                 <w:sz w:val="15"/>
               </w:rPr>
-              <w:t>$14.53</w:t>
+              <w:t>$14.09</w:t>
             </w:r>
           </w:p>
         </w:tc>
@@ -1203,7 +1203,7 @@
               <w:rPr>
                 <w:sz w:val="15"/>
               </w:rPr>
-              <w:t>9.8%</w:t>
+              <w:t>16.7%</w:t>
             </w:r>
           </w:p>
         </w:tc>
@@ -1447,7 +1447,7 @@
               <w:rPr>
                 <w:sz w:val="15"/>
               </w:rPr>
-              <w:t>21</w:t>
+              <w:t>25</w:t>
             </w:r>
           </w:p>
         </w:tc>
@@ -1461,7 +1461,7 @@
               <w:rPr>
                 <w:sz w:val="15"/>
               </w:rPr>
-              <w:t>$2.33</w:t>
+              <w:t>$2.21</w:t>
             </w:r>
           </w:p>
         </w:tc>
@@ -1503,7 +1503,7 @@
               <w:rPr>
                 <w:sz w:val="15"/>
               </w:rPr>
-              <w:t>11.5%</w:t>
+              <w:t>11.1%</w:t>
             </w:r>
           </w:p>
         </w:tc>
@@ -1830,7 +1830,7 @@
               <w:rPr>
                 <w:sz w:val="15"/>
               </w:rPr>
-              <w:t>730</w:t>
+              <w:t>764</w:t>
             </w:r>
           </w:p>
         </w:tc>

</xml_diff>

<commit_message>
Daily synthetic refresh: demo data through 2025-10-19
</commit_message>
<xml_diff>
--- a/outputs/reports/Marketing_Performance_Report_2025-10.docx
+++ b/outputs/reports/Marketing_Performance_Report_2025-10.docx
@@ -37,7 +37,7 @@
     </w:p>
     <w:p>
       <w:r>
-        <w:t>The synthetic portfolio acquired 764 players and generated 17.4% return on ad spend. D7 retention was 7.4%. Search Android B produced the strongest D7 retention, while Search Android B produced the lowest cost per D7 retained player.</w:t>
+        <w:t>The synthetic portfolio acquired 852 players and generated 15.6% return on ad spend. D7 retention was 7.6%. Search Android B produced the strongest D7 retention, while Search Android B produced the lowest cost per D7 retained player.</w:t>
       </w:r>
     </w:p>
     <w:tbl>
@@ -144,7 +144,7 @@
               <w:rPr>
                 <w:b/>
               </w:rPr>
-              <w:t>764</w:t>
+              <w:t>852</w:t>
             </w:r>
           </w:p>
         </w:tc>
@@ -161,7 +161,7 @@
               <w:rPr>
                 <w:b/>
               </w:rPr>
-              <w:t>79.5%</w:t>
+              <w:t>81.0%</w:t>
             </w:r>
           </w:p>
         </w:tc>
@@ -178,7 +178,7 @@
               <w:rPr>
                 <w:b/>
               </w:rPr>
-              <w:t>20.8%</w:t>
+              <w:t>22.5%</w:t>
             </w:r>
           </w:p>
         </w:tc>
@@ -195,7 +195,7 @@
               <w:rPr>
                 <w:b/>
               </w:rPr>
-              <w:t>7.4%</w:t>
+              <w:t>7.6%</w:t>
             </w:r>
           </w:p>
         </w:tc>
@@ -212,7 +212,7 @@
               <w:rPr>
                 <w:b/>
               </w:rPr>
-              <w:t>17.4%</w:t>
+              <w:t>15.6%</w:t>
             </w:r>
           </w:p>
         </w:tc>
@@ -503,7 +503,7 @@
               <w:rPr>
                 <w:sz w:val="15"/>
               </w:rPr>
-              <w:t>46.0%</w:t>
+              <w:t>42.7%</w:t>
             </w:r>
           </w:p>
         </w:tc>
@@ -547,7 +547,7 @@
               <w:rPr>
                 <w:sz w:val="15"/>
               </w:rPr>
-              <w:t>52</w:t>
+              <w:t>62</w:t>
             </w:r>
           </w:p>
         </w:tc>
@@ -561,7 +561,7 @@
               <w:rPr>
                 <w:sz w:val="15"/>
               </w:rPr>
-              <w:t>$2.28</w:t>
+              <w:t>$2.65</w:t>
             </w:r>
           </w:p>
         </w:tc>
@@ -575,7 +575,7 @@
               <w:rPr>
                 <w:sz w:val="15"/>
               </w:rPr>
-              <w:t>21.4%</w:t>
+              <w:t>21.1%</w:t>
             </w:r>
           </w:p>
         </w:tc>
@@ -589,7 +589,7 @@
               <w:rPr>
                 <w:sz w:val="15"/>
               </w:rPr>
-              <w:t>$39.56</w:t>
+              <w:t>$41.06</w:t>
             </w:r>
           </w:p>
         </w:tc>
@@ -603,7 +603,107 @@
               <w:rPr>
                 <w:sz w:val="15"/>
               </w:rPr>
-              <w:t>69.7%</w:t>
+              <w:t>54.5%</w:t>
+            </w:r>
+          </w:p>
+        </w:tc>
+      </w:tr>
+      <w:tr>
+        <w:tc>
+          <w:tcPr>
+            <w:tcW w:type="dxa" w:w="2880"/>
+            <w:vAlign w:val="center"/>
+          </w:tcPr>
+          <w:p>
+            <w:r>
+              <w:rPr>
+                <w:sz w:val="15"/>
+              </w:rPr>
+              <w:t>Store iOS A</w:t>
+            </w:r>
+          </w:p>
+        </w:tc>
+        <w:tc>
+          <w:tcPr>
+            <w:tcW w:type="dxa" w:w="1080"/>
+            <w:vAlign w:val="center"/>
+          </w:tcPr>
+          <w:p>
+            <w:r>
+              <w:rPr>
+                <w:sz w:val="15"/>
+              </w:rPr>
+              <w:t>Active</w:t>
+            </w:r>
+          </w:p>
+        </w:tc>
+        <w:tc>
+          <w:tcPr>
+            <w:tcW w:type="dxa" w:w="864"/>
+            <w:vAlign w:val="center"/>
+          </w:tcPr>
+          <w:p>
+            <w:r>
+              <w:rPr>
+                <w:sz w:val="15"/>
+              </w:rPr>
+              <w:t>17</w:t>
+            </w:r>
+          </w:p>
+        </w:tc>
+        <w:tc>
+          <w:tcPr>
+            <w:tcW w:type="dxa" w:w="936"/>
+            <w:vAlign w:val="center"/>
+          </w:tcPr>
+          <w:p>
+            <w:r>
+              <w:rPr>
+                <w:sz w:val="15"/>
+              </w:rPr>
+              <w:t>$13.50</w:t>
+            </w:r>
+          </w:p>
+        </w:tc>
+        <w:tc>
+          <w:tcPr>
+            <w:tcW w:type="dxa" w:w="1152"/>
+            <w:vAlign w:val="center"/>
+          </w:tcPr>
+          <w:p>
+            <w:r>
+              <w:rPr>
+                <w:sz w:val="15"/>
+              </w:rPr>
+              <w:t>12.5%</w:t>
+            </w:r>
+          </w:p>
+        </w:tc>
+        <w:tc>
+          <w:tcPr>
+            <w:tcW w:type="dxa" w:w="1296"/>
+            <w:vAlign w:val="center"/>
+          </w:tcPr>
+          <w:p>
+            <w:r>
+              <w:rPr>
+                <w:sz w:val="15"/>
+              </w:rPr>
+              <w:t>$229.48</w:t>
+            </w:r>
+          </w:p>
+        </w:tc>
+        <w:tc>
+          <w:tcPr>
+            <w:tcW w:type="dxa" w:w="864"/>
+            <w:vAlign w:val="center"/>
+          </w:tcPr>
+          <w:p>
+            <w:r>
+              <w:rPr>
+                <w:sz w:val="15"/>
+              </w:rPr>
+              <w:t>7.2%</w:t>
             </w:r>
           </w:p>
         </w:tc>
@@ -675,7 +775,7 @@
               <w:rPr>
                 <w:sz w:val="15"/>
               </w:rPr>
-              <w:t>13.2%</w:t>
+              <w:t>11.4%</w:t>
             </w:r>
           </w:p>
         </w:tc>
@@ -689,7 +789,7 @@
               <w:rPr>
                 <w:sz w:val="15"/>
               </w:rPr>
-              <w:t>$21.14</w:t>
+              <w:t>$16.40</w:t>
             </w:r>
           </w:p>
         </w:tc>
@@ -703,7 +803,107 @@
               <w:rPr>
                 <w:sz w:val="15"/>
               </w:rPr>
-              <w:t>4.7%</w:t>
+              <w:t>5.9%</w:t>
+            </w:r>
+          </w:p>
+        </w:tc>
+      </w:tr>
+      <w:tr>
+        <w:tc>
+          <w:tcPr>
+            <w:tcW w:type="dxa" w:w="2880"/>
+            <w:vAlign w:val="center"/>
+          </w:tcPr>
+          <w:p>
+            <w:r>
+              <w:rPr>
+                <w:sz w:val="15"/>
+              </w:rPr>
+              <w:t>Game iOS A</w:t>
+            </w:r>
+          </w:p>
+        </w:tc>
+        <w:tc>
+          <w:tcPr>
+            <w:tcW w:type="dxa" w:w="1080"/>
+            <w:vAlign w:val="center"/>
+          </w:tcPr>
+          <w:p>
+            <w:r>
+              <w:rPr>
+                <w:sz w:val="15"/>
+              </w:rPr>
+              <w:t>Active</w:t>
+            </w:r>
+          </w:p>
+        </w:tc>
+        <w:tc>
+          <w:tcPr>
+            <w:tcW w:type="dxa" w:w="864"/>
+            <w:vAlign w:val="center"/>
+          </w:tcPr>
+          <w:p>
+            <w:r>
+              <w:rPr>
+                <w:sz w:val="15"/>
+              </w:rPr>
+              <w:t>172</w:t>
+            </w:r>
+          </w:p>
+        </w:tc>
+        <w:tc>
+          <w:tcPr>
+            <w:tcW w:type="dxa" w:w="936"/>
+            <w:vAlign w:val="center"/>
+          </w:tcPr>
+          <w:p>
+            <w:r>
+              <w:rPr>
+                <w:sz w:val="15"/>
+              </w:rPr>
+              <w:t>$2.69</w:t>
+            </w:r>
+          </w:p>
+        </w:tc>
+        <w:tc>
+          <w:tcPr>
+            <w:tcW w:type="dxa" w:w="1152"/>
+            <w:vAlign w:val="center"/>
+          </w:tcPr>
+          <w:p>
+            <w:r>
+              <w:rPr>
+                <w:sz w:val="15"/>
+              </w:rPr>
+              <w:t>10.9%</w:t>
+            </w:r>
+          </w:p>
+        </w:tc>
+        <w:tc>
+          <w:tcPr>
+            <w:tcW w:type="dxa" w:w="1296"/>
+            <w:vAlign w:val="center"/>
+          </w:tcPr>
+          <w:p>
+            <w:r>
+              <w:rPr>
+                <w:sz w:val="15"/>
+              </w:rPr>
+              <w:t>$38.62</w:t>
+            </w:r>
+          </w:p>
+        </w:tc>
+        <w:tc>
+          <w:tcPr>
+            <w:tcW w:type="dxa" w:w="864"/>
+            <w:vAlign w:val="center"/>
+          </w:tcPr>
+          <w:p>
+            <w:r>
+              <w:rPr>
+                <w:sz w:val="15"/>
+              </w:rPr>
+              <w:t>13.7%</w:t>
             </w:r>
           </w:p>
         </w:tc>
@@ -747,7 +947,7 @@
               <w:rPr>
                 <w:sz w:val="15"/>
               </w:rPr>
-              <w:t>118</w:t>
+              <w:t>130</w:t>
             </w:r>
           </w:p>
         </w:tc>
@@ -761,7 +961,7 @@
               <w:rPr>
                 <w:sz w:val="15"/>
               </w:rPr>
-              <w:t>$1.11</w:t>
+              <w:t>$1.17</w:t>
             </w:r>
           </w:p>
         </w:tc>
@@ -775,7 +975,7 @@
               <w:rPr>
                 <w:sz w:val="15"/>
               </w:rPr>
-              <w:t>11.9%</w:t>
+              <w:t>9.5%</w:t>
             </w:r>
           </w:p>
         </w:tc>
@@ -789,7 +989,7 @@
               <w:rPr>
                 <w:sz w:val="15"/>
               </w:rPr>
-              <w:t>$18.75</w:t>
+              <w:t>$19.06</w:t>
             </w:r>
           </w:p>
         </w:tc>
@@ -803,107 +1003,7 @@
               <w:rPr>
                 <w:sz w:val="15"/>
               </w:rPr>
-              <w:t>26.5%</w:t>
-            </w:r>
-          </w:p>
-        </w:tc>
-      </w:tr>
-      <w:tr>
-        <w:tc>
-          <w:tcPr>
-            <w:tcW w:type="dxa" w:w="2880"/>
-            <w:vAlign w:val="center"/>
-          </w:tcPr>
-          <w:p>
-            <w:r>
-              <w:rPr>
-                <w:sz w:val="15"/>
-              </w:rPr>
-              <w:t>Game iOS A</w:t>
-            </w:r>
-          </w:p>
-        </w:tc>
-        <w:tc>
-          <w:tcPr>
-            <w:tcW w:type="dxa" w:w="1080"/>
-            <w:vAlign w:val="center"/>
-          </w:tcPr>
-          <w:p>
-            <w:r>
-              <w:rPr>
-                <w:sz w:val="15"/>
-              </w:rPr>
-              <w:t>Active</w:t>
-            </w:r>
-          </w:p>
-        </w:tc>
-        <w:tc>
-          <w:tcPr>
-            <w:tcW w:type="dxa" w:w="864"/>
-            <w:vAlign w:val="center"/>
-          </w:tcPr>
-          <w:p>
-            <w:r>
-              <w:rPr>
-                <w:sz w:val="15"/>
-              </w:rPr>
-              <w:t>146</w:t>
-            </w:r>
-          </w:p>
-        </w:tc>
-        <w:tc>
-          <w:tcPr>
-            <w:tcW w:type="dxa" w:w="936"/>
-            <w:vAlign w:val="center"/>
-          </w:tcPr>
-          <w:p>
-            <w:r>
-              <w:rPr>
-                <w:sz w:val="15"/>
-              </w:rPr>
-              <w:t>$2.65</w:t>
-            </w:r>
-          </w:p>
-        </w:tc>
-        <w:tc>
-          <w:tcPr>
-            <w:tcW w:type="dxa" w:w="1152"/>
-            <w:vAlign w:val="center"/>
-          </w:tcPr>
-          <w:p>
-            <w:r>
-              <w:rPr>
-                <w:sz w:val="15"/>
-              </w:rPr>
-              <w:t>9.6%</w:t>
-            </w:r>
-          </w:p>
-        </w:tc>
-        <w:tc>
-          <w:tcPr>
-            <w:tcW w:type="dxa" w:w="1296"/>
-            <w:vAlign w:val="center"/>
-          </w:tcPr>
-          <w:p>
-            <w:r>
-              <w:rPr>
-                <w:sz w:val="15"/>
-              </w:rPr>
-              <w:t>$48.34</w:t>
-            </w:r>
-          </w:p>
-        </w:tc>
-        <w:tc>
-          <w:tcPr>
-            <w:tcW w:type="dxa" w:w="864"/>
-            <w:vAlign w:val="center"/>
-          </w:tcPr>
-          <w:p>
-            <w:r>
-              <w:rPr>
-                <w:sz w:val="15"/>
-              </w:rPr>
-              <w:t>15.9%</w:t>
+              <w:t>26.2%</w:t>
             </w:r>
           </w:p>
         </w:tc>
@@ -947,7 +1047,7 @@
               <w:rPr>
                 <w:sz w:val="15"/>
               </w:rPr>
-              <w:t>91</w:t>
+              <w:t>115</w:t>
             </w:r>
           </w:p>
         </w:tc>
@@ -961,7 +1061,7 @@
               <w:rPr>
                 <w:sz w:val="15"/>
               </w:rPr>
-              <w:t>$1.87</w:t>
+              <w:t>$1.92</w:t>
             </w:r>
           </w:p>
         </w:tc>
@@ -975,7 +1075,7 @@
               <w:rPr>
                 <w:sz w:val="15"/>
               </w:rPr>
-              <w:t>7.7%</w:t>
+              <w:t>5.9%</w:t>
             </w:r>
           </w:p>
         </w:tc>
@@ -989,7 +1089,7 @@
               <w:rPr>
                 <w:sz w:val="15"/>
               </w:rPr>
-              <w:t>$56.69</w:t>
+              <w:t>$73.60</w:t>
             </w:r>
           </w:p>
         </w:tc>
@@ -1003,7 +1103,7 @@
               <w:rPr>
                 <w:sz w:val="15"/>
               </w:rPr>
-              <w:t>9.9%</w:t>
+              <w:t>11.1%</w:t>
             </w:r>
           </w:p>
         </w:tc>
@@ -1075,7 +1175,7 @@
               <w:rPr>
                 <w:sz w:val="15"/>
               </w:rPr>
-              <w:t>1.6%</w:t>
+              <w:t>1.5%</w:t>
             </w:r>
           </w:p>
         </w:tc>
@@ -1089,7 +1189,7 @@
               <w:rPr>
                 <w:sz w:val="15"/>
               </w:rPr>
-              <w:t>$65.12</w:t>
+              <w:t>$65.14</w:t>
             </w:r>
           </w:p>
         </w:tc>
@@ -1119,7 +1219,7 @@
               <w:rPr>
                 <w:sz w:val="15"/>
               </w:rPr>
-              <w:t>Store iOS A</w:t>
+              <w:t>Game Android E</w:t>
             </w:r>
           </w:p>
         </w:tc>
@@ -1147,7 +1247,7 @@
               <w:rPr>
                 <w:sz w:val="15"/>
               </w:rPr>
-              <w:t>13</w:t>
+              <w:t>36</w:t>
             </w:r>
           </w:p>
         </w:tc>
@@ -1161,7 +1261,7 @@
               <w:rPr>
                 <w:sz w:val="15"/>
               </w:rPr>
-              <w:t>$14.09</w:t>
+              <w:t>$2.24</w:t>
             </w:r>
           </w:p>
         </w:tc>
@@ -1203,7 +1303,7 @@
               <w:rPr>
                 <w:sz w:val="15"/>
               </w:rPr>
-              <w:t>16.7%</w:t>
+              <w:t>15.1%</w:t>
             </w:r>
           </w:p>
         </w:tc>
@@ -1347,7 +1447,7 @@
               <w:rPr>
                 <w:sz w:val="15"/>
               </w:rPr>
-              <w:t>3</w:t>
+              <w:t>4</w:t>
             </w:r>
           </w:p>
         </w:tc>
@@ -1404,106 +1504,6 @@
                 <w:sz w:val="15"/>
               </w:rPr>
               <w:t>n/a</w:t>
-            </w:r>
-          </w:p>
-        </w:tc>
-      </w:tr>
-      <w:tr>
-        <w:tc>
-          <w:tcPr>
-            <w:tcW w:type="dxa" w:w="2880"/>
-            <w:vAlign w:val="center"/>
-          </w:tcPr>
-          <w:p>
-            <w:r>
-              <w:rPr>
-                <w:sz w:val="15"/>
-              </w:rPr>
-              <w:t>Game Android E</w:t>
-            </w:r>
-          </w:p>
-        </w:tc>
-        <w:tc>
-          <w:tcPr>
-            <w:tcW w:type="dxa" w:w="1080"/>
-            <w:vAlign w:val="center"/>
-          </w:tcPr>
-          <w:p>
-            <w:r>
-              <w:rPr>
-                <w:sz w:val="15"/>
-              </w:rPr>
-              <w:t>Active</w:t>
-            </w:r>
-          </w:p>
-        </w:tc>
-        <w:tc>
-          <w:tcPr>
-            <w:tcW w:type="dxa" w:w="864"/>
-            <w:vAlign w:val="center"/>
-          </w:tcPr>
-          <w:p>
-            <w:r>
-              <w:rPr>
-                <w:sz w:val="15"/>
-              </w:rPr>
-              <w:t>25</w:t>
-            </w:r>
-          </w:p>
-        </w:tc>
-        <w:tc>
-          <w:tcPr>
-            <w:tcW w:type="dxa" w:w="936"/>
-            <w:vAlign w:val="center"/>
-          </w:tcPr>
-          <w:p>
-            <w:r>
-              <w:rPr>
-                <w:sz w:val="15"/>
-              </w:rPr>
-              <w:t>$2.21</w:t>
-            </w:r>
-          </w:p>
-        </w:tc>
-        <w:tc>
-          <w:tcPr>
-            <w:tcW w:type="dxa" w:w="1152"/>
-            <w:vAlign w:val="center"/>
-          </w:tcPr>
-          <w:p>
-            <w:r>
-              <w:rPr>
-                <w:sz w:val="15"/>
-              </w:rPr>
-              <w:t>n/a</w:t>
-            </w:r>
-          </w:p>
-        </w:tc>
-        <w:tc>
-          <w:tcPr>
-            <w:tcW w:type="dxa" w:w="1296"/>
-            <w:vAlign w:val="center"/>
-          </w:tcPr>
-          <w:p>
-            <w:r>
-              <w:rPr>
-                <w:sz w:val="15"/>
-              </w:rPr>
-              <w:t>$n/a</w:t>
-            </w:r>
-          </w:p>
-        </w:tc>
-        <w:tc>
-          <w:tcPr>
-            <w:tcW w:type="dxa" w:w="864"/>
-            <w:vAlign w:val="center"/>
-          </w:tcPr>
-          <w:p>
-            <w:r>
-              <w:rPr>
-                <w:sz w:val="15"/>
-              </w:rPr>
-              <w:t>11.1%</w:t>
             </w:r>
           </w:p>
         </w:tc>
@@ -1830,7 +1830,7 @@
               <w:rPr>
                 <w:sz w:val="15"/>
               </w:rPr>
-              <w:t>764</w:t>
+              <w:t>852</w:t>
             </w:r>
           </w:p>
         </w:tc>

</xml_diff>

<commit_message>
Daily synthetic refresh: demo data through 2025-10-21
</commit_message>
<xml_diff>
--- a/outputs/reports/Marketing_Performance_Report_2025-10.docx
+++ b/outputs/reports/Marketing_Performance_Report_2025-10.docx
@@ -37,7 +37,7 @@
     </w:p>
     <w:p>
       <w:r>
-        <w:t>The synthetic portfolio acquired 852 players and generated 15.6% return on ad spend. D7 retention was 7.6%. Search Android B produced the strongest D7 retention, while Search Android B produced the lowest cost per D7 retained player.</w:t>
+        <w:t>The synthetic portfolio acquired 891 players and generated 14.9% return on ad spend. D7 retention was 7.9%. Search Android B produced the strongest D7 retention, while Search Android B produced the lowest cost per D7 retained player.</w:t>
       </w:r>
     </w:p>
     <w:tbl>
@@ -144,7 +144,7 @@
               <w:rPr>
                 <w:b/>
               </w:rPr>
-              <w:t>852</w:t>
+              <w:t>891</w:t>
             </w:r>
           </w:p>
         </w:tc>
@@ -161,7 +161,7 @@
               <w:rPr>
                 <w:b/>
               </w:rPr>
-              <w:t>81.0%</w:t>
+              <w:t>81.8%</w:t>
             </w:r>
           </w:p>
         </w:tc>
@@ -178,7 +178,7 @@
               <w:rPr>
                 <w:b/>
               </w:rPr>
-              <w:t>22.5%</w:t>
+              <w:t>23.1%</w:t>
             </w:r>
           </w:p>
         </w:tc>
@@ -195,7 +195,7 @@
               <w:rPr>
                 <w:b/>
               </w:rPr>
-              <w:t>7.6%</w:t>
+              <w:t>7.9%</w:t>
             </w:r>
           </w:p>
         </w:tc>
@@ -212,7 +212,7 @@
               <w:rPr>
                 <w:b/>
               </w:rPr>
-              <w:t>15.6%</w:t>
+              <w:t>14.9%</w:t>
             </w:r>
           </w:p>
         </w:tc>
@@ -475,7 +475,7 @@
               <w:rPr>
                 <w:sz w:val="15"/>
               </w:rPr>
-              <w:t>27.3%</w:t>
+              <w:t>23.1%</w:t>
             </w:r>
           </w:p>
         </w:tc>
@@ -503,7 +503,7 @@
               <w:rPr>
                 <w:sz w:val="15"/>
               </w:rPr>
-              <w:t>42.7%</w:t>
+              <w:t>43.4%</w:t>
             </w:r>
           </w:p>
         </w:tc>
@@ -547,7 +547,7 @@
               <w:rPr>
                 <w:sz w:val="15"/>
               </w:rPr>
-              <w:t>62</w:t>
+              <w:t>67</w:t>
             </w:r>
           </w:p>
         </w:tc>
@@ -561,7 +561,7 @@
               <w:rPr>
                 <w:sz w:val="15"/>
               </w:rPr>
-              <w:t>$2.65</w:t>
+              <w:t>$2.78</w:t>
             </w:r>
           </w:p>
         </w:tc>
@@ -575,7 +575,7 @@
               <w:rPr>
                 <w:sz w:val="15"/>
               </w:rPr>
-              <w:t>21.1%</w:t>
+              <w:t>18.5%</w:t>
             </w:r>
           </w:p>
         </w:tc>
@@ -589,7 +589,7 @@
               <w:rPr>
                 <w:sz w:val="15"/>
               </w:rPr>
-              <w:t>$41.06</w:t>
+              <w:t>$37.28</w:t>
             </w:r>
           </w:p>
         </w:tc>
@@ -603,7 +603,407 @@
               <w:rPr>
                 <w:sz w:val="15"/>
               </w:rPr>
-              <w:t>54.5%</w:t>
+              <w:t>47.5%</w:t>
+            </w:r>
+          </w:p>
+        </w:tc>
+      </w:tr>
+      <w:tr>
+        <w:tc>
+          <w:tcPr>
+            <w:tcW w:type="dxa" w:w="2880"/>
+            <w:vAlign w:val="center"/>
+          </w:tcPr>
+          <w:p>
+            <w:r>
+              <w:rPr>
+                <w:sz w:val="15"/>
+              </w:rPr>
+              <w:t>Search Android E</w:t>
+            </w:r>
+          </w:p>
+        </w:tc>
+        <w:tc>
+          <w:tcPr>
+            <w:tcW w:type="dxa" w:w="1080"/>
+            <w:vAlign w:val="center"/>
+          </w:tcPr>
+          <w:p>
+            <w:r>
+              <w:rPr>
+                <w:sz w:val="15"/>
+              </w:rPr>
+              <w:t>Stopped</w:t>
+            </w:r>
+          </w:p>
+        </w:tc>
+        <w:tc>
+          <w:tcPr>
+            <w:tcW w:type="dxa" w:w="864"/>
+            <w:vAlign w:val="center"/>
+          </w:tcPr>
+          <w:p>
+            <w:r>
+              <w:rPr>
+                <w:sz w:val="15"/>
+              </w:rPr>
+              <w:t>103</w:t>
+            </w:r>
+          </w:p>
+        </w:tc>
+        <w:tc>
+          <w:tcPr>
+            <w:tcW w:type="dxa" w:w="936"/>
+            <w:vAlign w:val="center"/>
+          </w:tcPr>
+          <w:p>
+            <w:r>
+              <w:rPr>
+                <w:sz w:val="15"/>
+              </w:rPr>
+              <w:t>$1.43</w:t>
+            </w:r>
+          </w:p>
+        </w:tc>
+        <w:tc>
+          <w:tcPr>
+            <w:tcW w:type="dxa" w:w="1152"/>
+            <w:vAlign w:val="center"/>
+          </w:tcPr>
+          <w:p>
+            <w:r>
+              <w:rPr>
+                <w:sz w:val="15"/>
+              </w:rPr>
+              <w:t>11.6%</w:t>
+            </w:r>
+          </w:p>
+        </w:tc>
+        <w:tc>
+          <w:tcPr>
+            <w:tcW w:type="dxa" w:w="1296"/>
+            <w:vAlign w:val="center"/>
+          </w:tcPr>
+          <w:p>
+            <w:r>
+              <w:rPr>
+                <w:sz w:val="15"/>
+              </w:rPr>
+              <w:t>$13.42</w:t>
+            </w:r>
+          </w:p>
+        </w:tc>
+        <w:tc>
+          <w:tcPr>
+            <w:tcW w:type="dxa" w:w="864"/>
+            <w:vAlign w:val="center"/>
+          </w:tcPr>
+          <w:p>
+            <w:r>
+              <w:rPr>
+                <w:sz w:val="15"/>
+              </w:rPr>
+              <w:t>4.8%</w:t>
+            </w:r>
+          </w:p>
+        </w:tc>
+      </w:tr>
+      <w:tr>
+        <w:tc>
+          <w:tcPr>
+            <w:tcW w:type="dxa" w:w="2880"/>
+            <w:vAlign w:val="center"/>
+          </w:tcPr>
+          <w:p>
+            <w:r>
+              <w:rPr>
+                <w:sz w:val="15"/>
+              </w:rPr>
+              <w:t>Game iOS A</w:t>
+            </w:r>
+          </w:p>
+        </w:tc>
+        <w:tc>
+          <w:tcPr>
+            <w:tcW w:type="dxa" w:w="1080"/>
+            <w:vAlign w:val="center"/>
+          </w:tcPr>
+          <w:p>
+            <w:r>
+              <w:rPr>
+                <w:sz w:val="15"/>
+              </w:rPr>
+              <w:t>Active</w:t>
+            </w:r>
+          </w:p>
+        </w:tc>
+        <w:tc>
+          <w:tcPr>
+            <w:tcW w:type="dxa" w:w="864"/>
+            <w:vAlign w:val="center"/>
+          </w:tcPr>
+          <w:p>
+            <w:r>
+              <w:rPr>
+                <w:sz w:val="15"/>
+              </w:rPr>
+              <w:t>182</w:t>
+            </w:r>
+          </w:p>
+        </w:tc>
+        <w:tc>
+          <w:tcPr>
+            <w:tcW w:type="dxa" w:w="936"/>
+            <w:vAlign w:val="center"/>
+          </w:tcPr>
+          <w:p>
+            <w:r>
+              <w:rPr>
+                <w:sz w:val="15"/>
+              </w:rPr>
+              <w:t>$2.75</w:t>
+            </w:r>
+          </w:p>
+        </w:tc>
+        <w:tc>
+          <w:tcPr>
+            <w:tcW w:type="dxa" w:w="1152"/>
+            <w:vAlign w:val="center"/>
+          </w:tcPr>
+          <w:p>
+            <w:r>
+              <w:rPr>
+                <w:sz w:val="15"/>
+              </w:rPr>
+              <w:t>10.6%</w:t>
+            </w:r>
+          </w:p>
+        </w:tc>
+        <w:tc>
+          <w:tcPr>
+            <w:tcW w:type="dxa" w:w="1296"/>
+            <w:vAlign w:val="center"/>
+          </w:tcPr>
+          <w:p>
+            <w:r>
+              <w:rPr>
+                <w:sz w:val="15"/>
+              </w:rPr>
+              <w:t>$35.75</w:t>
+            </w:r>
+          </w:p>
+        </w:tc>
+        <w:tc>
+          <w:tcPr>
+            <w:tcW w:type="dxa" w:w="864"/>
+            <w:vAlign w:val="center"/>
+          </w:tcPr>
+          <w:p>
+            <w:r>
+              <w:rPr>
+                <w:sz w:val="15"/>
+              </w:rPr>
+              <w:t>11.7%</w:t>
+            </w:r>
+          </w:p>
+        </w:tc>
+      </w:tr>
+      <w:tr>
+        <w:tc>
+          <w:tcPr>
+            <w:tcW w:type="dxa" w:w="2880"/>
+            <w:vAlign w:val="center"/>
+          </w:tcPr>
+          <w:p>
+            <w:r>
+              <w:rPr>
+                <w:sz w:val="15"/>
+              </w:rPr>
+              <w:t>Game iOS B</w:t>
+            </w:r>
+          </w:p>
+        </w:tc>
+        <w:tc>
+          <w:tcPr>
+            <w:tcW w:type="dxa" w:w="1080"/>
+            <w:vAlign w:val="center"/>
+          </w:tcPr>
+          <w:p>
+            <w:r>
+              <w:rPr>
+                <w:sz w:val="15"/>
+              </w:rPr>
+              <w:t>Active</w:t>
+            </w:r>
+          </w:p>
+        </w:tc>
+        <w:tc>
+          <w:tcPr>
+            <w:tcW w:type="dxa" w:w="864"/>
+            <w:vAlign w:val="center"/>
+          </w:tcPr>
+          <w:p>
+            <w:r>
+              <w:rPr>
+                <w:sz w:val="15"/>
+              </w:rPr>
+              <w:t>137</w:t>
+            </w:r>
+          </w:p>
+        </w:tc>
+        <w:tc>
+          <w:tcPr>
+            <w:tcW w:type="dxa" w:w="936"/>
+            <w:vAlign w:val="center"/>
+          </w:tcPr>
+          <w:p>
+            <w:r>
+              <w:rPr>
+                <w:sz w:val="15"/>
+              </w:rPr>
+              <w:t>$1.18</w:t>
+            </w:r>
+          </w:p>
+        </w:tc>
+        <w:tc>
+          <w:tcPr>
+            <w:tcW w:type="dxa" w:w="1152"/>
+            <w:vAlign w:val="center"/>
+          </w:tcPr>
+          <w:p>
+            <w:r>
+              <w:rPr>
+                <w:sz w:val="15"/>
+              </w:rPr>
+              <w:t>10.2%</w:t>
+            </w:r>
+          </w:p>
+        </w:tc>
+        <w:tc>
+          <w:tcPr>
+            <w:tcW w:type="dxa" w:w="1296"/>
+            <w:vAlign w:val="center"/>
+          </w:tcPr>
+          <w:p>
+            <w:r>
+              <w:rPr>
+                <w:sz w:val="15"/>
+              </w:rPr>
+              <w:t>$16.15</w:t>
+            </w:r>
+          </w:p>
+        </w:tc>
+        <w:tc>
+          <w:tcPr>
+            <w:tcW w:type="dxa" w:w="864"/>
+            <w:vAlign w:val="center"/>
+          </w:tcPr>
+          <w:p>
+            <w:r>
+              <w:rPr>
+                <w:sz w:val="15"/>
+              </w:rPr>
+              <w:t>32.0%</w:t>
+            </w:r>
+          </w:p>
+        </w:tc>
+      </w:tr>
+      <w:tr>
+        <w:tc>
+          <w:tcPr>
+            <w:tcW w:type="dxa" w:w="2880"/>
+            <w:vAlign w:val="center"/>
+          </w:tcPr>
+          <w:p>
+            <w:r>
+              <w:rPr>
+                <w:sz w:val="15"/>
+              </w:rPr>
+              <w:t>Game Android E</w:t>
+            </w:r>
+          </w:p>
+        </w:tc>
+        <w:tc>
+          <w:tcPr>
+            <w:tcW w:type="dxa" w:w="1080"/>
+            <w:vAlign w:val="center"/>
+          </w:tcPr>
+          <w:p>
+            <w:r>
+              <w:rPr>
+                <w:sz w:val="15"/>
+              </w:rPr>
+              <w:t>Active</w:t>
+            </w:r>
+          </w:p>
+        </w:tc>
+        <w:tc>
+          <w:tcPr>
+            <w:tcW w:type="dxa" w:w="864"/>
+            <w:vAlign w:val="center"/>
+          </w:tcPr>
+          <w:p>
+            <w:r>
+              <w:rPr>
+                <w:sz w:val="15"/>
+              </w:rPr>
+              <w:t>44</w:t>
+            </w:r>
+          </w:p>
+        </w:tc>
+        <w:tc>
+          <w:tcPr>
+            <w:tcW w:type="dxa" w:w="936"/>
+            <w:vAlign w:val="center"/>
+          </w:tcPr>
+          <w:p>
+            <w:r>
+              <w:rPr>
+                <w:sz w:val="15"/>
+              </w:rPr>
+              <w:t>$2.12</w:t>
+            </w:r>
+          </w:p>
+        </w:tc>
+        <w:tc>
+          <w:tcPr>
+            <w:tcW w:type="dxa" w:w="1152"/>
+            <w:vAlign w:val="center"/>
+          </w:tcPr>
+          <w:p>
+            <w:r>
+              <w:rPr>
+                <w:sz w:val="15"/>
+              </w:rPr>
+              <w:t>10.0%</w:t>
+            </w:r>
+          </w:p>
+        </w:tc>
+        <w:tc>
+          <w:tcPr>
+            <w:tcW w:type="dxa" w:w="1296"/>
+            <w:vAlign w:val="center"/>
+          </w:tcPr>
+          <w:p>
+            <w:r>
+              <w:rPr>
+                <w:sz w:val="15"/>
+              </w:rPr>
+              <w:t>$93.46</w:t>
+            </w:r>
+          </w:p>
+        </w:tc>
+        <w:tc>
+          <w:tcPr>
+            <w:tcW w:type="dxa" w:w="864"/>
+            <w:vAlign w:val="center"/>
+          </w:tcPr>
+          <w:p>
+            <w:r>
+              <w:rPr>
+                <w:sz w:val="15"/>
+              </w:rPr>
+              <w:t>13.6%</w:t>
             </w:r>
           </w:p>
         </w:tc>
@@ -661,7 +1061,7 @@
               <w:rPr>
                 <w:sz w:val="15"/>
               </w:rPr>
-              <w:t>$13.50</w:t>
+              <w:t>$13.74</w:t>
             </w:r>
           </w:p>
         </w:tc>
@@ -675,7 +1075,7 @@
               <w:rPr>
                 <w:sz w:val="15"/>
               </w:rPr>
-              <w:t>12.5%</w:t>
+              <w:t>10.0%</w:t>
             </w:r>
           </w:p>
         </w:tc>
@@ -689,7 +1089,7 @@
               <w:rPr>
                 <w:sz w:val="15"/>
               </w:rPr>
-              <w:t>$229.48</w:t>
+              <w:t>$233.65</w:t>
             </w:r>
           </w:p>
         </w:tc>
@@ -703,307 +1103,7 @@
               <w:rPr>
                 <w:sz w:val="15"/>
               </w:rPr>
-              <w:t>7.2%</w:t>
-            </w:r>
-          </w:p>
-        </w:tc>
-      </w:tr>
-      <w:tr>
-        <w:tc>
-          <w:tcPr>
-            <w:tcW w:type="dxa" w:w="2880"/>
-            <w:vAlign w:val="center"/>
-          </w:tcPr>
-          <w:p>
-            <w:r>
-              <w:rPr>
-                <w:sz w:val="15"/>
-              </w:rPr>
-              <w:t>Search Android E</w:t>
-            </w:r>
-          </w:p>
-        </w:tc>
-        <w:tc>
-          <w:tcPr>
-            <w:tcW w:type="dxa" w:w="1080"/>
-            <w:vAlign w:val="center"/>
-          </w:tcPr>
-          <w:p>
-            <w:r>
-              <w:rPr>
-                <w:sz w:val="15"/>
-              </w:rPr>
-              <w:t>Stopped</w:t>
-            </w:r>
-          </w:p>
-        </w:tc>
-        <w:tc>
-          <w:tcPr>
-            <w:tcW w:type="dxa" w:w="864"/>
-            <w:vAlign w:val="center"/>
-          </w:tcPr>
-          <w:p>
-            <w:r>
-              <w:rPr>
-                <w:sz w:val="15"/>
-              </w:rPr>
-              <w:t>102</w:t>
-            </w:r>
-          </w:p>
-        </w:tc>
-        <w:tc>
-          <w:tcPr>
-            <w:tcW w:type="dxa" w:w="936"/>
-            <w:vAlign w:val="center"/>
-          </w:tcPr>
-          <w:p>
-            <w:r>
-              <w:rPr>
-                <w:sz w:val="15"/>
-              </w:rPr>
-              <w:t>$1.45</w:t>
-            </w:r>
-          </w:p>
-        </w:tc>
-        <w:tc>
-          <w:tcPr>
-            <w:tcW w:type="dxa" w:w="1152"/>
-            <w:vAlign w:val="center"/>
-          </w:tcPr>
-          <w:p>
-            <w:r>
-              <w:rPr>
-                <w:sz w:val="15"/>
-              </w:rPr>
-              <w:t>11.4%</w:t>
-            </w:r>
-          </w:p>
-        </w:tc>
-        <w:tc>
-          <w:tcPr>
-            <w:tcW w:type="dxa" w:w="1296"/>
-            <w:vAlign w:val="center"/>
-          </w:tcPr>
-          <w:p>
-            <w:r>
-              <w:rPr>
-                <w:sz w:val="15"/>
-              </w:rPr>
-              <w:t>$16.40</w:t>
-            </w:r>
-          </w:p>
-        </w:tc>
-        <w:tc>
-          <w:tcPr>
-            <w:tcW w:type="dxa" w:w="864"/>
-            <w:vAlign w:val="center"/>
-          </w:tcPr>
-          <w:p>
-            <w:r>
-              <w:rPr>
-                <w:sz w:val="15"/>
-              </w:rPr>
-              <w:t>5.9%</w:t>
-            </w:r>
-          </w:p>
-        </w:tc>
-      </w:tr>
-      <w:tr>
-        <w:tc>
-          <w:tcPr>
-            <w:tcW w:type="dxa" w:w="2880"/>
-            <w:vAlign w:val="center"/>
-          </w:tcPr>
-          <w:p>
-            <w:r>
-              <w:rPr>
-                <w:sz w:val="15"/>
-              </w:rPr>
-              <w:t>Game iOS A</w:t>
-            </w:r>
-          </w:p>
-        </w:tc>
-        <w:tc>
-          <w:tcPr>
-            <w:tcW w:type="dxa" w:w="1080"/>
-            <w:vAlign w:val="center"/>
-          </w:tcPr>
-          <w:p>
-            <w:r>
-              <w:rPr>
-                <w:sz w:val="15"/>
-              </w:rPr>
-              <w:t>Active</w:t>
-            </w:r>
-          </w:p>
-        </w:tc>
-        <w:tc>
-          <w:tcPr>
-            <w:tcW w:type="dxa" w:w="864"/>
-            <w:vAlign w:val="center"/>
-          </w:tcPr>
-          <w:p>
-            <w:r>
-              <w:rPr>
-                <w:sz w:val="15"/>
-              </w:rPr>
-              <w:t>172</w:t>
-            </w:r>
-          </w:p>
-        </w:tc>
-        <w:tc>
-          <w:tcPr>
-            <w:tcW w:type="dxa" w:w="936"/>
-            <w:vAlign w:val="center"/>
-          </w:tcPr>
-          <w:p>
-            <w:r>
-              <w:rPr>
-                <w:sz w:val="15"/>
-              </w:rPr>
-              <w:t>$2.69</w:t>
-            </w:r>
-          </w:p>
-        </w:tc>
-        <w:tc>
-          <w:tcPr>
-            <w:tcW w:type="dxa" w:w="1152"/>
-            <w:vAlign w:val="center"/>
-          </w:tcPr>
-          <w:p>
-            <w:r>
-              <w:rPr>
-                <w:sz w:val="15"/>
-              </w:rPr>
-              <w:t>10.9%</w:t>
-            </w:r>
-          </w:p>
-        </w:tc>
-        <w:tc>
-          <w:tcPr>
-            <w:tcW w:type="dxa" w:w="1296"/>
-            <w:vAlign w:val="center"/>
-          </w:tcPr>
-          <w:p>
-            <w:r>
-              <w:rPr>
-                <w:sz w:val="15"/>
-              </w:rPr>
-              <w:t>$38.62</w:t>
-            </w:r>
-          </w:p>
-        </w:tc>
-        <w:tc>
-          <w:tcPr>
-            <w:tcW w:type="dxa" w:w="864"/>
-            <w:vAlign w:val="center"/>
-          </w:tcPr>
-          <w:p>
-            <w:r>
-              <w:rPr>
-                <w:sz w:val="15"/>
-              </w:rPr>
-              <w:t>13.7%</w:t>
-            </w:r>
-          </w:p>
-        </w:tc>
-      </w:tr>
-      <w:tr>
-        <w:tc>
-          <w:tcPr>
-            <w:tcW w:type="dxa" w:w="2880"/>
-            <w:vAlign w:val="center"/>
-          </w:tcPr>
-          <w:p>
-            <w:r>
-              <w:rPr>
-                <w:sz w:val="15"/>
-              </w:rPr>
-              <w:t>Game iOS B</w:t>
-            </w:r>
-          </w:p>
-        </w:tc>
-        <w:tc>
-          <w:tcPr>
-            <w:tcW w:type="dxa" w:w="1080"/>
-            <w:vAlign w:val="center"/>
-          </w:tcPr>
-          <w:p>
-            <w:r>
-              <w:rPr>
-                <w:sz w:val="15"/>
-              </w:rPr>
-              <w:t>Active</w:t>
-            </w:r>
-          </w:p>
-        </w:tc>
-        <w:tc>
-          <w:tcPr>
-            <w:tcW w:type="dxa" w:w="864"/>
-            <w:vAlign w:val="center"/>
-          </w:tcPr>
-          <w:p>
-            <w:r>
-              <w:rPr>
-                <w:sz w:val="15"/>
-              </w:rPr>
-              <w:t>130</w:t>
-            </w:r>
-          </w:p>
-        </w:tc>
-        <w:tc>
-          <w:tcPr>
-            <w:tcW w:type="dxa" w:w="936"/>
-            <w:vAlign w:val="center"/>
-          </w:tcPr>
-          <w:p>
-            <w:r>
-              <w:rPr>
-                <w:sz w:val="15"/>
-              </w:rPr>
-              <w:t>$1.17</w:t>
-            </w:r>
-          </w:p>
-        </w:tc>
-        <w:tc>
-          <w:tcPr>
-            <w:tcW w:type="dxa" w:w="1152"/>
-            <w:vAlign w:val="center"/>
-          </w:tcPr>
-          <w:p>
-            <w:r>
-              <w:rPr>
-                <w:sz w:val="15"/>
-              </w:rPr>
-              <w:t>9.5%</w:t>
-            </w:r>
-          </w:p>
-        </w:tc>
-        <w:tc>
-          <w:tcPr>
-            <w:tcW w:type="dxa" w:w="1296"/>
-            <w:vAlign w:val="center"/>
-          </w:tcPr>
-          <w:p>
-            <w:r>
-              <w:rPr>
-                <w:sz w:val="15"/>
-              </w:rPr>
-              <w:t>$19.06</w:t>
-            </w:r>
-          </w:p>
-        </w:tc>
-        <w:tc>
-          <w:tcPr>
-            <w:tcW w:type="dxa" w:w="864"/>
-            <w:vAlign w:val="center"/>
-          </w:tcPr>
-          <w:p>
-            <w:r>
-              <w:rPr>
-                <w:sz w:val="15"/>
-              </w:rPr>
-              <w:t>26.2%</w:t>
+              <w:t>5.5%</w:t>
             </w:r>
           </w:p>
         </w:tc>
@@ -1047,7 +1147,7 @@
               <w:rPr>
                 <w:sz w:val="15"/>
               </w:rPr>
-              <w:t>115</w:t>
+              <w:t>123</w:t>
             </w:r>
           </w:p>
         </w:tc>
@@ -1061,7 +1161,7 @@
               <w:rPr>
                 <w:sz w:val="15"/>
               </w:rPr>
-              <w:t>$1.92</w:t>
+              <w:t>$2.04</w:t>
             </w:r>
           </w:p>
         </w:tc>
@@ -1075,7 +1175,7 @@
               <w:rPr>
                 <w:sz w:val="15"/>
               </w:rPr>
-              <w:t>5.9%</w:t>
+              <w:t>5.6%</w:t>
             </w:r>
           </w:p>
         </w:tc>
@@ -1089,7 +1189,7 @@
               <w:rPr>
                 <w:sz w:val="15"/>
               </w:rPr>
-              <w:t>$73.60</w:t>
+              <w:t>$62.68</w:t>
             </w:r>
           </w:p>
         </w:tc>
@@ -1103,7 +1203,7 @@
               <w:rPr>
                 <w:sz w:val="15"/>
               </w:rPr>
-              <w:t>11.1%</w:t>
+              <w:t>11.7%</w:t>
             </w:r>
           </w:p>
         </w:tc>
@@ -1204,106 +1304,6 @@
                 <w:sz w:val="15"/>
               </w:rPr>
               <w:t>0.3%</w:t>
-            </w:r>
-          </w:p>
-        </w:tc>
-      </w:tr>
-      <w:tr>
-        <w:tc>
-          <w:tcPr>
-            <w:tcW w:type="dxa" w:w="2880"/>
-            <w:vAlign w:val="center"/>
-          </w:tcPr>
-          <w:p>
-            <w:r>
-              <w:rPr>
-                <w:sz w:val="15"/>
-              </w:rPr>
-              <w:t>Game Android E</w:t>
-            </w:r>
-          </w:p>
-        </w:tc>
-        <w:tc>
-          <w:tcPr>
-            <w:tcW w:type="dxa" w:w="1080"/>
-            <w:vAlign w:val="center"/>
-          </w:tcPr>
-          <w:p>
-            <w:r>
-              <w:rPr>
-                <w:sz w:val="15"/>
-              </w:rPr>
-              <w:t>Active</w:t>
-            </w:r>
-          </w:p>
-        </w:tc>
-        <w:tc>
-          <w:tcPr>
-            <w:tcW w:type="dxa" w:w="864"/>
-            <w:vAlign w:val="center"/>
-          </w:tcPr>
-          <w:p>
-            <w:r>
-              <w:rPr>
-                <w:sz w:val="15"/>
-              </w:rPr>
-              <w:t>36</w:t>
-            </w:r>
-          </w:p>
-        </w:tc>
-        <w:tc>
-          <w:tcPr>
-            <w:tcW w:type="dxa" w:w="936"/>
-            <w:vAlign w:val="center"/>
-          </w:tcPr>
-          <w:p>
-            <w:r>
-              <w:rPr>
-                <w:sz w:val="15"/>
-              </w:rPr>
-              <w:t>$2.24</w:t>
-            </w:r>
-          </w:p>
-        </w:tc>
-        <w:tc>
-          <w:tcPr>
-            <w:tcW w:type="dxa" w:w="1152"/>
-            <w:vAlign w:val="center"/>
-          </w:tcPr>
-          <w:p>
-            <w:r>
-              <w:rPr>
-                <w:sz w:val="15"/>
-              </w:rPr>
-              <w:t>0.0%</w:t>
-            </w:r>
-          </w:p>
-        </w:tc>
-        <w:tc>
-          <w:tcPr>
-            <w:tcW w:type="dxa" w:w="1296"/>
-            <w:vAlign w:val="center"/>
-          </w:tcPr>
-          <w:p>
-            <w:r>
-              <w:rPr>
-                <w:sz w:val="15"/>
-              </w:rPr>
-              <w:t>$n/a</w:t>
-            </w:r>
-          </w:p>
-        </w:tc>
-        <w:tc>
-          <w:tcPr>
-            <w:tcW w:type="dxa" w:w="864"/>
-            <w:vAlign w:val="center"/>
-          </w:tcPr>
-          <w:p>
-            <w:r>
-              <w:rPr>
-                <w:sz w:val="15"/>
-              </w:rPr>
-              <w:t>15.1%</w:t>
             </w:r>
           </w:p>
         </w:tc>
@@ -1830,7 +1830,7 @@
               <w:rPr>
                 <w:sz w:val="15"/>
               </w:rPr>
-              <w:t>852</w:t>
+              <w:t>891</w:t>
             </w:r>
           </w:p>
         </w:tc>

</xml_diff>

<commit_message>
Daily synthetic refresh: demo data through 2025-10-22
</commit_message>
<xml_diff>
--- a/outputs/reports/Marketing_Performance_Report_2025-10.docx
+++ b/outputs/reports/Marketing_Performance_Report_2025-10.docx
@@ -37,7 +37,7 @@
     </w:p>
     <w:p>
       <w:r>
-        <w:t>The synthetic portfolio acquired 891 players and generated 14.9% return on ad spend. D7 retention was 7.9%. Search Android B produced the strongest D7 retention, while Search Android B produced the lowest cost per D7 retained player.</w:t>
+        <w:t>The synthetic portfolio acquired 891 players and generated 14.0% return on ad spend. D7 retention was 8.3%. Search Android B produced the strongest D7 retention, while Search Android B produced the lowest cost per D7 retained player.</w:t>
       </w:r>
     </w:p>
     <w:tbl>
@@ -178,7 +178,7 @@
               <w:rPr>
                 <w:b/>
               </w:rPr>
-              <w:t>23.1%</w:t>
+              <w:t>23.0%</w:t>
             </w:r>
           </w:p>
         </w:tc>
@@ -195,7 +195,7 @@
               <w:rPr>
                 <w:b/>
               </w:rPr>
-              <w:t>7.9%</w:t>
+              <w:t>8.3%</w:t>
             </w:r>
           </w:p>
         </w:tc>
@@ -212,7 +212,7 @@
               <w:rPr>
                 <w:b/>
               </w:rPr>
-              <w:t>14.9%</w:t>
+              <w:t>14.0%</w:t>
             </w:r>
           </w:p>
         </w:tc>
@@ -561,7 +561,7 @@
               <w:rPr>
                 <w:sz w:val="15"/>
               </w:rPr>
-              <w:t>$2.78</w:t>
+              <w:t>$3.07</w:t>
             </w:r>
           </w:p>
         </w:tc>
@@ -575,7 +575,7 @@
               <w:rPr>
                 <w:sz w:val="15"/>
               </w:rPr>
-              <w:t>18.5%</w:t>
+              <w:t>20.0%</w:t>
             </w:r>
           </w:p>
         </w:tc>
@@ -589,7 +589,7 @@
               <w:rPr>
                 <w:sz w:val="15"/>
               </w:rPr>
-              <w:t>$37.28</w:t>
+              <w:t>$29.36</w:t>
             </w:r>
           </w:p>
         </w:tc>
@@ -603,7 +603,7 @@
               <w:rPr>
                 <w:sz w:val="15"/>
               </w:rPr>
-              <w:t>46.9%</w:t>
+              <w:t>39.8%</w:t>
             </w:r>
           </w:p>
         </w:tc>
@@ -661,7 +661,7 @@
               <w:rPr>
                 <w:sz w:val="15"/>
               </w:rPr>
-              <w:t>$1.43</w:t>
+              <w:t>$1.44</w:t>
             </w:r>
           </w:p>
         </w:tc>
@@ -675,7 +675,7 @@
               <w:rPr>
                 <w:sz w:val="15"/>
               </w:rPr>
-              <w:t>11.6%</w:t>
+              <w:t>12.4%</w:t>
             </w:r>
           </w:p>
         </w:tc>
@@ -689,7 +689,7 @@
               <w:rPr>
                 <w:sz w:val="15"/>
               </w:rPr>
-              <w:t>$13.42</w:t>
+              <w:t>$12.32</w:t>
             </w:r>
           </w:p>
         </w:tc>
@@ -703,7 +703,7 @@
               <w:rPr>
                 <w:sz w:val="15"/>
               </w:rPr>
-              <w:t>4.8%</w:t>
+              <w:t>4.7%</w:t>
             </w:r>
           </w:p>
         </w:tc>
@@ -761,7 +761,7 @@
               <w:rPr>
                 <w:sz w:val="15"/>
               </w:rPr>
-              <w:t>$2.75</w:t>
+              <w:t>$2.82</w:t>
             </w:r>
           </w:p>
         </w:tc>
@@ -775,7 +775,7 @@
               <w:rPr>
                 <w:sz w:val="15"/>
               </w:rPr>
-              <w:t>10.6%</w:t>
+              <w:t>10.3%</w:t>
             </w:r>
           </w:p>
         </w:tc>
@@ -789,7 +789,7 @@
               <w:rPr>
                 <w:sz w:val="15"/>
               </w:rPr>
-              <w:t>$35.75</w:t>
+              <w:t>$36.65</w:t>
             </w:r>
           </w:p>
         </w:tc>
@@ -803,7 +803,7 @@
               <w:rPr>
                 <w:sz w:val="15"/>
               </w:rPr>
-              <w:t>11.7%</w:t>
+              <w:t>11.6%</w:t>
             </w:r>
           </w:p>
         </w:tc>
@@ -861,7 +861,7 @@
               <w:rPr>
                 <w:sz w:val="15"/>
               </w:rPr>
-              <w:t>$1.18</w:t>
+              <w:t>$1.20</w:t>
             </w:r>
           </w:p>
         </w:tc>
@@ -875,7 +875,7 @@
               <w:rPr>
                 <w:sz w:val="15"/>
               </w:rPr>
-              <w:t>10.2%</w:t>
+              <w:t>10.3%</w:t>
             </w:r>
           </w:p>
         </w:tc>
@@ -889,7 +889,7 @@
               <w:rPr>
                 <w:sz w:val="15"/>
               </w:rPr>
-              <w:t>$16.15</w:t>
+              <w:t>$15.00</w:t>
             </w:r>
           </w:p>
         </w:tc>
@@ -903,7 +903,207 @@
               <w:rPr>
                 <w:sz w:val="15"/>
               </w:rPr>
-              <w:t>32.0%</w:t>
+              <w:t>31.0%</w:t>
+            </w:r>
+          </w:p>
+        </w:tc>
+      </w:tr>
+      <w:tr>
+        <w:tc>
+          <w:tcPr>
+            <w:tcW w:type="dxa" w:w="2880"/>
+            <w:vAlign w:val="center"/>
+          </w:tcPr>
+          <w:p>
+            <w:r>
+              <w:rPr>
+                <w:sz w:val="15"/>
+              </w:rPr>
+              <w:t>Store iOS A</w:t>
+            </w:r>
+          </w:p>
+        </w:tc>
+        <w:tc>
+          <w:tcPr>
+            <w:tcW w:type="dxa" w:w="1080"/>
+            <w:vAlign w:val="center"/>
+          </w:tcPr>
+          <w:p>
+            <w:r>
+              <w:rPr>
+                <w:sz w:val="15"/>
+              </w:rPr>
+              <w:t>Active</w:t>
+            </w:r>
+          </w:p>
+        </w:tc>
+        <w:tc>
+          <w:tcPr>
+            <w:tcW w:type="dxa" w:w="864"/>
+            <w:vAlign w:val="center"/>
+          </w:tcPr>
+          <w:p>
+            <w:r>
+              <w:rPr>
+                <w:sz w:val="15"/>
+              </w:rPr>
+              <w:t>17</w:t>
+            </w:r>
+          </w:p>
+        </w:tc>
+        <w:tc>
+          <w:tcPr>
+            <w:tcW w:type="dxa" w:w="936"/>
+            <w:vAlign w:val="center"/>
+          </w:tcPr>
+          <w:p>
+            <w:r>
+              <w:rPr>
+                <w:sz w:val="15"/>
+              </w:rPr>
+              <w:t>$13.76</w:t>
+            </w:r>
+          </w:p>
+        </w:tc>
+        <w:tc>
+          <w:tcPr>
+            <w:tcW w:type="dxa" w:w="1152"/>
+            <w:vAlign w:val="center"/>
+          </w:tcPr>
+          <w:p>
+            <w:r>
+              <w:rPr>
+                <w:sz w:val="15"/>
+              </w:rPr>
+              <w:t>10.0%</w:t>
+            </w:r>
+          </w:p>
+        </w:tc>
+        <w:tc>
+          <w:tcPr>
+            <w:tcW w:type="dxa" w:w="1296"/>
+            <w:vAlign w:val="center"/>
+          </w:tcPr>
+          <w:p>
+            <w:r>
+              <w:rPr>
+                <w:sz w:val="15"/>
+              </w:rPr>
+              <w:t>$233.96</w:t>
+            </w:r>
+          </w:p>
+        </w:tc>
+        <w:tc>
+          <w:tcPr>
+            <w:tcW w:type="dxa" w:w="864"/>
+            <w:vAlign w:val="center"/>
+          </w:tcPr>
+          <w:p>
+            <w:r>
+              <w:rPr>
+                <w:sz w:val="15"/>
+              </w:rPr>
+              <w:t>4.9%</w:t>
+            </w:r>
+          </w:p>
+        </w:tc>
+      </w:tr>
+      <w:tr>
+        <w:tc>
+          <w:tcPr>
+            <w:tcW w:type="dxa" w:w="2880"/>
+            <w:vAlign w:val="center"/>
+          </w:tcPr>
+          <w:p>
+            <w:r>
+              <w:rPr>
+                <w:sz w:val="15"/>
+              </w:rPr>
+              <w:t>Social iOS C</w:t>
+            </w:r>
+          </w:p>
+        </w:tc>
+        <w:tc>
+          <w:tcPr>
+            <w:tcW w:type="dxa" w:w="1080"/>
+            <w:vAlign w:val="center"/>
+          </w:tcPr>
+          <w:p>
+            <w:r>
+              <w:rPr>
+                <w:sz w:val="15"/>
+              </w:rPr>
+              <w:t>Active</w:t>
+            </w:r>
+          </w:p>
+        </w:tc>
+        <w:tc>
+          <w:tcPr>
+            <w:tcW w:type="dxa" w:w="864"/>
+            <w:vAlign w:val="center"/>
+          </w:tcPr>
+          <w:p>
+            <w:r>
+              <w:rPr>
+                <w:sz w:val="15"/>
+              </w:rPr>
+              <w:t>123</w:t>
+            </w:r>
+          </w:p>
+        </w:tc>
+        <w:tc>
+          <w:tcPr>
+            <w:tcW w:type="dxa" w:w="936"/>
+            <w:vAlign w:val="center"/>
+          </w:tcPr>
+          <w:p>
+            <w:r>
+              <w:rPr>
+                <w:sz w:val="15"/>
+              </w:rPr>
+              <w:t>$2.18</w:t>
+            </w:r>
+          </w:p>
+        </w:tc>
+        <w:tc>
+          <w:tcPr>
+            <w:tcW w:type="dxa" w:w="1152"/>
+            <w:vAlign w:val="center"/>
+          </w:tcPr>
+          <w:p>
+            <w:r>
+              <w:rPr>
+                <w:sz w:val="15"/>
+              </w:rPr>
+              <w:t>7.2%</w:t>
+            </w:r>
+          </w:p>
+        </w:tc>
+        <w:tc>
+          <w:tcPr>
+            <w:tcW w:type="dxa" w:w="1296"/>
+            <w:vAlign w:val="center"/>
+          </w:tcPr>
+          <w:p>
+            <w:r>
+              <w:rPr>
+                <w:sz w:val="15"/>
+              </w:rPr>
+              <w:t>$44.69</w:t>
+            </w:r>
+          </w:p>
+        </w:tc>
+        <w:tc>
+          <w:tcPr>
+            <w:tcW w:type="dxa" w:w="864"/>
+            <w:vAlign w:val="center"/>
+          </w:tcPr>
+          <w:p>
+            <w:r>
+              <w:rPr>
+                <w:sz w:val="15"/>
+              </w:rPr>
+              <w:t>11.8%</w:t>
             </w:r>
           </w:p>
         </w:tc>
@@ -961,7 +1161,7 @@
               <w:rPr>
                 <w:sz w:val="15"/>
               </w:rPr>
-              <w:t>$2.12</w:t>
+              <w:t>$2.43</w:t>
             </w:r>
           </w:p>
         </w:tc>
@@ -975,7 +1175,7 @@
               <w:rPr>
                 <w:sz w:val="15"/>
               </w:rPr>
-              <w:t>10.0%</w:t>
+              <w:t>5.3%</w:t>
             </w:r>
           </w:p>
         </w:tc>
@@ -989,7 +1189,7 @@
               <w:rPr>
                 <w:sz w:val="15"/>
               </w:rPr>
-              <w:t>$93.46</w:t>
+              <w:t>$106.80</w:t>
             </w:r>
           </w:p>
         </w:tc>
@@ -1003,207 +1203,7 @@
               <w:rPr>
                 <w:sz w:val="15"/>
               </w:rPr>
-              <w:t>13.6%</w:t>
-            </w:r>
-          </w:p>
-        </w:tc>
-      </w:tr>
-      <w:tr>
-        <w:tc>
-          <w:tcPr>
-            <w:tcW w:type="dxa" w:w="2880"/>
-            <w:vAlign w:val="center"/>
-          </w:tcPr>
-          <w:p>
-            <w:r>
-              <w:rPr>
-                <w:sz w:val="15"/>
-              </w:rPr>
-              <w:t>Store iOS A</w:t>
-            </w:r>
-          </w:p>
-        </w:tc>
-        <w:tc>
-          <w:tcPr>
-            <w:tcW w:type="dxa" w:w="1080"/>
-            <w:vAlign w:val="center"/>
-          </w:tcPr>
-          <w:p>
-            <w:r>
-              <w:rPr>
-                <w:sz w:val="15"/>
-              </w:rPr>
-              <w:t>Active</w:t>
-            </w:r>
-          </w:p>
-        </w:tc>
-        <w:tc>
-          <w:tcPr>
-            <w:tcW w:type="dxa" w:w="864"/>
-            <w:vAlign w:val="center"/>
-          </w:tcPr>
-          <w:p>
-            <w:r>
-              <w:rPr>
-                <w:sz w:val="15"/>
-              </w:rPr>
-              <w:t>17</w:t>
-            </w:r>
-          </w:p>
-        </w:tc>
-        <w:tc>
-          <w:tcPr>
-            <w:tcW w:type="dxa" w:w="936"/>
-            <w:vAlign w:val="center"/>
-          </w:tcPr>
-          <w:p>
-            <w:r>
-              <w:rPr>
-                <w:sz w:val="15"/>
-              </w:rPr>
-              <w:t>$13.74</w:t>
-            </w:r>
-          </w:p>
-        </w:tc>
-        <w:tc>
-          <w:tcPr>
-            <w:tcW w:type="dxa" w:w="1152"/>
-            <w:vAlign w:val="center"/>
-          </w:tcPr>
-          <w:p>
-            <w:r>
-              <w:rPr>
-                <w:sz w:val="15"/>
-              </w:rPr>
-              <w:t>10.0%</w:t>
-            </w:r>
-          </w:p>
-        </w:tc>
-        <w:tc>
-          <w:tcPr>
-            <w:tcW w:type="dxa" w:w="1296"/>
-            <w:vAlign w:val="center"/>
-          </w:tcPr>
-          <w:p>
-            <w:r>
-              <w:rPr>
-                <w:sz w:val="15"/>
-              </w:rPr>
-              <w:t>$233.65</w:t>
-            </w:r>
-          </w:p>
-        </w:tc>
-        <w:tc>
-          <w:tcPr>
-            <w:tcW w:type="dxa" w:w="864"/>
-            <w:vAlign w:val="center"/>
-          </w:tcPr>
-          <w:p>
-            <w:r>
-              <w:rPr>
-                <w:sz w:val="15"/>
-              </w:rPr>
-              <w:t>5.5%</w:t>
-            </w:r>
-          </w:p>
-        </w:tc>
-      </w:tr>
-      <w:tr>
-        <w:tc>
-          <w:tcPr>
-            <w:tcW w:type="dxa" w:w="2880"/>
-            <w:vAlign w:val="center"/>
-          </w:tcPr>
-          <w:p>
-            <w:r>
-              <w:rPr>
-                <w:sz w:val="15"/>
-              </w:rPr>
-              <w:t>Social iOS C</w:t>
-            </w:r>
-          </w:p>
-        </w:tc>
-        <w:tc>
-          <w:tcPr>
-            <w:tcW w:type="dxa" w:w="1080"/>
-            <w:vAlign w:val="center"/>
-          </w:tcPr>
-          <w:p>
-            <w:r>
-              <w:rPr>
-                <w:sz w:val="15"/>
-              </w:rPr>
-              <w:t>Active</w:t>
-            </w:r>
-          </w:p>
-        </w:tc>
-        <w:tc>
-          <w:tcPr>
-            <w:tcW w:type="dxa" w:w="864"/>
-            <w:vAlign w:val="center"/>
-          </w:tcPr>
-          <w:p>
-            <w:r>
-              <w:rPr>
-                <w:sz w:val="15"/>
-              </w:rPr>
-              <w:t>123</w:t>
-            </w:r>
-          </w:p>
-        </w:tc>
-        <w:tc>
-          <w:tcPr>
-            <w:tcW w:type="dxa" w:w="936"/>
-            <w:vAlign w:val="center"/>
-          </w:tcPr>
-          <w:p>
-            <w:r>
-              <w:rPr>
-                <w:sz w:val="15"/>
-              </w:rPr>
-              <w:t>$2.04</w:t>
-            </w:r>
-          </w:p>
-        </w:tc>
-        <w:tc>
-          <w:tcPr>
-            <w:tcW w:type="dxa" w:w="1152"/>
-            <w:vAlign w:val="center"/>
-          </w:tcPr>
-          <w:p>
-            <w:r>
-              <w:rPr>
-                <w:sz w:val="15"/>
-              </w:rPr>
-              <w:t>5.6%</w:t>
-            </w:r>
-          </w:p>
-        </w:tc>
-        <w:tc>
-          <w:tcPr>
-            <w:tcW w:type="dxa" w:w="1296"/>
-            <w:vAlign w:val="center"/>
-          </w:tcPr>
-          <w:p>
-            <w:r>
-              <w:rPr>
-                <w:sz w:val="15"/>
-              </w:rPr>
-              <w:t>$62.68</w:t>
-            </w:r>
-          </w:p>
-        </w:tc>
-        <w:tc>
-          <w:tcPr>
-            <w:tcW w:type="dxa" w:w="864"/>
-            <w:vAlign w:val="center"/>
-          </w:tcPr>
-          <w:p>
-            <w:r>
-              <w:rPr>
-                <w:sz w:val="15"/>
-              </w:rPr>
-              <w:t>11.9%</w:t>
+              <w:t>10.7%</w:t>
             </w:r>
           </w:p>
         </w:tc>
@@ -1289,7 +1289,7 @@
               <w:rPr>
                 <w:sz w:val="15"/>
               </w:rPr>
-              <w:t>$65.14</w:t>
+              <w:t>$65.22</w:t>
             </w:r>
           </w:p>
         </w:tc>
@@ -1619,7 +1619,7 @@
     </w:p>
     <w:p>
       <w:r>
-        <w:t>Quality leaders were Search Android B, Search Android A. The strongest return signals came from Search Android A, Search Android B. Campaign decisions should combine scale, retained-user cost and return rather than optimize installs alone.</w:t>
+        <w:t>Quality leaders were Search Android B, Search Android A. The strongest return signals came from Search Android B, Search Android A. Campaign decisions should combine scale, retained-user cost and return rather than optimize installs alone.</w:t>
       </w:r>
     </w:p>
     <w:p>

</xml_diff>

<commit_message>
Daily synthetic refresh: demo data through 2025-10-23
</commit_message>
<xml_diff>
--- a/outputs/reports/Marketing_Performance_Report_2025-10.docx
+++ b/outputs/reports/Marketing_Performance_Report_2025-10.docx
@@ -37,7 +37,7 @@
     </w:p>
     <w:p>
       <w:r>
-        <w:t>The synthetic portfolio acquired 946 players and generated 15.2% return on ad spend. D7 retention was 8.2%. Search Android B produced the strongest D7 retention, while Search Android B produced the lowest cost per D7 retained player.</w:t>
+        <w:t>The synthetic portfolio acquired 946 players and generated 14.5% return on ad spend. D7 retention was 8.2%. Search Android B produced the strongest D7 retention, while Search Android B produced the lowest cost per D7 retained player.</w:t>
       </w:r>
     </w:p>
     <w:tbl>
@@ -212,7 +212,7 @@
               <w:rPr>
                 <w:b/>
               </w:rPr>
-              <w:t>15.2%</w:t>
+              <w:t>14.5%</w:t>
             </w:r>
           </w:p>
         </w:tc>
@@ -561,7 +561,7 @@
               <w:rPr>
                 <w:sz w:val="15"/>
               </w:rPr>
-              <w:t>$2.60</w:t>
+              <w:t>$2.73</w:t>
             </w:r>
           </w:p>
         </w:tc>
@@ -589,7 +589,7 @@
               <w:rPr>
                 <w:sz w:val="15"/>
               </w:rPr>
-              <w:t>$25.69</w:t>
+              <w:t>$27.00</w:t>
             </w:r>
           </w:p>
         </w:tc>
@@ -603,7 +603,7 @@
               <w:rPr>
                 <w:sz w:val="15"/>
               </w:rPr>
-              <w:t>48.8%</w:t>
+              <w:t>43.9%</w:t>
             </w:r>
           </w:p>
         </w:tc>
@@ -761,7 +761,7 @@
               <w:rPr>
                 <w:sz w:val="15"/>
               </w:rPr>
-              <w:t>$2.67</w:t>
+              <w:t>$2.78</w:t>
             </w:r>
           </w:p>
         </w:tc>
@@ -789,7 +789,7 @@
               <w:rPr>
                 <w:sz w:val="15"/>
               </w:rPr>
-              <w:t>$34.20</w:t>
+              <w:t>$35.56</w:t>
             </w:r>
           </w:p>
         </w:tc>
@@ -803,7 +803,7 @@
               <w:rPr>
                 <w:sz w:val="15"/>
               </w:rPr>
-              <w:t>12.8%</w:t>
+              <w:t>12.5%</w:t>
             </w:r>
           </w:p>
         </w:tc>
@@ -861,7 +861,7 @@
               <w:rPr>
                 <w:sz w:val="15"/>
               </w:rPr>
-              <w:t>$1.13</w:t>
+              <w:t>$1.15</w:t>
             </w:r>
           </w:p>
         </w:tc>
@@ -889,7 +889,7 @@
               <w:rPr>
                 <w:sz w:val="15"/>
               </w:rPr>
-              <w:t>$15.00</w:t>
+              <w:t>$15.25</w:t>
             </w:r>
           </w:p>
         </w:tc>
@@ -903,7 +903,7 @@
               <w:rPr>
                 <w:sz w:val="15"/>
               </w:rPr>
-              <w:t>26.7%</w:t>
+              <w:t>26.2%</w:t>
             </w:r>
           </w:p>
         </w:tc>
@@ -933,7 +933,7 @@
               <w:rPr>
                 <w:sz w:val="15"/>
               </w:rPr>
-              <w:t>Active</w:t>
+              <w:t>Stopped</w:t>
             </w:r>
           </w:p>
         </w:tc>
@@ -1061,7 +1061,7 @@
               <w:rPr>
                 <w:sz w:val="15"/>
               </w:rPr>
-              <w:t>$1.99</w:t>
+              <w:t>$2.11</w:t>
             </w:r>
           </w:p>
         </w:tc>
@@ -1089,7 +1089,7 @@
               <w:rPr>
                 <w:sz w:val="15"/>
               </w:rPr>
-              <w:t>$44.69</w:t>
+              <w:t>$47.37</w:t>
             </w:r>
           </w:p>
         </w:tc>
@@ -1103,7 +1103,7 @@
               <w:rPr>
                 <w:sz w:val="15"/>
               </w:rPr>
-              <w:t>12.4%</w:t>
+              <w:t>11.8%</w:t>
             </w:r>
           </w:p>
         </w:tc>
@@ -1161,7 +1161,7 @@
               <w:rPr>
                 <w:sz w:val="15"/>
               </w:rPr>
-              <w:t>$1.94</w:t>
+              <w:t>$2.21</w:t>
             </w:r>
           </w:p>
         </w:tc>
@@ -1189,7 +1189,7 @@
               <w:rPr>
                 <w:sz w:val="15"/>
               </w:rPr>
-              <w:t>$106.80</w:t>
+              <w:t>$121.42</w:t>
             </w:r>
           </w:p>
         </w:tc>
@@ -1203,7 +1203,7 @@
               <w:rPr>
                 <w:sz w:val="15"/>
               </w:rPr>
-              <w:t>13.9%</w:t>
+              <w:t>12.2%</w:t>
             </w:r>
           </w:p>
         </w:tc>

</xml_diff>

<commit_message>
Daily synthetic refresh: demo data through 2025-10-26
</commit_message>
<xml_diff>
--- a/outputs/reports/Marketing_Performance_Report_2025-10.docx
+++ b/outputs/reports/Marketing_Performance_Report_2025-10.docx
@@ -37,7 +37,7 @@
     </w:p>
     <w:p>
       <w:r>
-        <w:t>The synthetic portfolio acquired 948 players and generated 14.7% return on ad spend. D7 retention was 8.2%. Search Android B produced the strongest D7 retention, while Search Android B produced the lowest cost per D7 retained player.</w:t>
+        <w:t>The synthetic portfolio acquired 1,014 players and generated 15.8% return on ad spend. D7 retention was 9.0%. Social iOS B produced the strongest D7 retention, while Social iOS B produced the lowest cost per D7 retained player.</w:t>
       </w:r>
     </w:p>
     <w:tbl>
@@ -144,7 +144,7 @@
               <w:rPr>
                 <w:b/>
               </w:rPr>
-              <w:t>948</w:t>
+              <w:t>1,014</w:t>
             </w:r>
           </w:p>
         </w:tc>
@@ -161,7 +161,7 @@
               <w:rPr>
                 <w:b/>
               </w:rPr>
-              <w:t>82.5%</w:t>
+              <w:t>83.5%</w:t>
             </w:r>
           </w:p>
         </w:tc>
@@ -178,7 +178,7 @@
               <w:rPr>
                 <w:b/>
               </w:rPr>
-              <w:t>23.1%</w:t>
+              <w:t>23.2%</w:t>
             </w:r>
           </w:p>
         </w:tc>
@@ -195,7 +195,7 @@
               <w:rPr>
                 <w:b/>
               </w:rPr>
-              <w:t>8.2%</w:t>
+              <w:t>9.0%</w:t>
             </w:r>
           </w:p>
         </w:tc>
@@ -212,7 +212,7 @@
               <w:rPr>
                 <w:b/>
               </w:rPr>
-              <w:t>14.7%</w:t>
+              <w:t>15.8%</w:t>
             </w:r>
           </w:p>
         </w:tc>
@@ -419,6 +419,106 @@
               <w:rPr>
                 <w:sz w:val="15"/>
               </w:rPr>
+              <w:t>Social iOS B</w:t>
+            </w:r>
+          </w:p>
+        </w:tc>
+        <w:tc>
+          <w:tcPr>
+            <w:tcW w:type="dxa" w:w="1080"/>
+            <w:vAlign w:val="center"/>
+          </w:tcPr>
+          <w:p>
+            <w:r>
+              <w:rPr>
+                <w:sz w:val="15"/>
+              </w:rPr>
+              <w:t>Stopped</w:t>
+            </w:r>
+          </w:p>
+        </w:tc>
+        <w:tc>
+          <w:tcPr>
+            <w:tcW w:type="dxa" w:w="864"/>
+            <w:vAlign w:val="center"/>
+          </w:tcPr>
+          <w:p>
+            <w:r>
+              <w:rPr>
+                <w:sz w:val="15"/>
+              </w:rPr>
+              <w:t>4</w:t>
+            </w:r>
+          </w:p>
+        </w:tc>
+        <w:tc>
+          <w:tcPr>
+            <w:tcW w:type="dxa" w:w="936"/>
+            <w:vAlign w:val="center"/>
+          </w:tcPr>
+          <w:p>
+            <w:r>
+              <w:rPr>
+                <w:sz w:val="15"/>
+              </w:rPr>
+              <w:t>$0.00</w:t>
+            </w:r>
+          </w:p>
+        </w:tc>
+        <w:tc>
+          <w:tcPr>
+            <w:tcW w:type="dxa" w:w="1152"/>
+            <w:vAlign w:val="center"/>
+          </w:tcPr>
+          <w:p>
+            <w:r>
+              <w:rPr>
+                <w:sz w:val="15"/>
+              </w:rPr>
+              <w:t>25.0%</w:t>
+            </w:r>
+          </w:p>
+        </w:tc>
+        <w:tc>
+          <w:tcPr>
+            <w:tcW w:type="dxa" w:w="1296"/>
+            <w:vAlign w:val="center"/>
+          </w:tcPr>
+          <w:p>
+            <w:r>
+              <w:rPr>
+                <w:sz w:val="15"/>
+              </w:rPr>
+              <w:t>$0.00</w:t>
+            </w:r>
+          </w:p>
+        </w:tc>
+        <w:tc>
+          <w:tcPr>
+            <w:tcW w:type="dxa" w:w="864"/>
+            <w:vAlign w:val="center"/>
+          </w:tcPr>
+          <w:p>
+            <w:r>
+              <w:rPr>
+                <w:sz w:val="15"/>
+              </w:rPr>
+              <w:t>n/a</w:t>
+            </w:r>
+          </w:p>
+        </w:tc>
+      </w:tr>
+      <w:tr>
+        <w:tc>
+          <w:tcPr>
+            <w:tcW w:type="dxa" w:w="2880"/>
+            <w:vAlign w:val="center"/>
+          </w:tcPr>
+          <w:p>
+            <w:r>
+              <w:rPr>
+                <w:sz w:val="15"/>
+              </w:rPr>
               <w:t>Search Android B</w:t>
             </w:r>
           </w:p>
@@ -475,7 +575,7 @@
               <w:rPr>
                 <w:sz w:val="15"/>
               </w:rPr>
-              <w:t>23.1%</w:t>
+              <w:t>21.4%</w:t>
             </w:r>
           </w:p>
         </w:tc>
@@ -503,7 +603,7 @@
               <w:rPr>
                 <w:sz w:val="15"/>
               </w:rPr>
-              <w:t>43.4%</w:t>
+              <w:t>47.1%</w:t>
             </w:r>
           </w:p>
         </w:tc>
@@ -547,7 +647,7 @@
               <w:rPr>
                 <w:sz w:val="15"/>
               </w:rPr>
-              <w:t>81</w:t>
+              <w:t>97</w:t>
             </w:r>
           </w:p>
         </w:tc>
@@ -561,7 +661,7 @@
               <w:rPr>
                 <w:sz w:val="15"/>
               </w:rPr>
-              <w:t>$2.67</w:t>
+              <w:t>$2.58</w:t>
             </w:r>
           </w:p>
         </w:tc>
@@ -575,7 +675,7 @@
               <w:rPr>
                 <w:sz w:val="15"/>
               </w:rPr>
-              <w:t>18.2%</w:t>
+              <w:t>20.3%</w:t>
             </w:r>
           </w:p>
         </w:tc>
@@ -589,7 +689,7 @@
               <w:rPr>
                 <w:sz w:val="15"/>
               </w:rPr>
-              <w:t>$27.00</w:t>
+              <w:t>$20.88</w:t>
             </w:r>
           </w:p>
         </w:tc>
@@ -603,7 +703,107 @@
               <w:rPr>
                 <w:sz w:val="15"/>
               </w:rPr>
-              <w:t>45.4%</w:t>
+              <w:t>42.7%</w:t>
+            </w:r>
+          </w:p>
+        </w:tc>
+      </w:tr>
+      <w:tr>
+        <w:tc>
+          <w:tcPr>
+            <w:tcW w:type="dxa" w:w="2880"/>
+            <w:vAlign w:val="center"/>
+          </w:tcPr>
+          <w:p>
+            <w:r>
+              <w:rPr>
+                <w:sz w:val="15"/>
+              </w:rPr>
+              <w:t>Game iOS A</w:t>
+            </w:r>
+          </w:p>
+        </w:tc>
+        <w:tc>
+          <w:tcPr>
+            <w:tcW w:type="dxa" w:w="1080"/>
+            <w:vAlign w:val="center"/>
+          </w:tcPr>
+          <w:p>
+            <w:r>
+              <w:rPr>
+                <w:sz w:val="15"/>
+              </w:rPr>
+              <w:t>Active</w:t>
+            </w:r>
+          </w:p>
+        </w:tc>
+        <w:tc>
+          <w:tcPr>
+            <w:tcW w:type="dxa" w:w="864"/>
+            <w:vAlign w:val="center"/>
+          </w:tcPr>
+          <w:p>
+            <w:r>
+              <w:rPr>
+                <w:sz w:val="15"/>
+              </w:rPr>
+              <w:t>206</w:t>
+            </w:r>
+          </w:p>
+        </w:tc>
+        <w:tc>
+          <w:tcPr>
+            <w:tcW w:type="dxa" w:w="936"/>
+            <w:vAlign w:val="center"/>
+          </w:tcPr>
+          <w:p>
+            <w:r>
+              <w:rPr>
+                <w:sz w:val="15"/>
+              </w:rPr>
+              <w:t>$2.77</w:t>
+            </w:r>
+          </w:p>
+        </w:tc>
+        <w:tc>
+          <w:tcPr>
+            <w:tcW w:type="dxa" w:w="1152"/>
+            <w:vAlign w:val="center"/>
+          </w:tcPr>
+          <w:p>
+            <w:r>
+              <w:rPr>
+                <w:sz w:val="15"/>
+              </w:rPr>
+              <w:t>11.9%</w:t>
+            </w:r>
+          </w:p>
+        </w:tc>
+        <w:tc>
+          <w:tcPr>
+            <w:tcW w:type="dxa" w:w="1296"/>
+            <w:vAlign w:val="center"/>
+          </w:tcPr>
+          <w:p>
+            <w:r>
+              <w:rPr>
+                <w:sz w:val="15"/>
+              </w:rPr>
+              <w:t>$28.52</w:t>
+            </w:r>
+          </w:p>
+        </w:tc>
+        <w:tc>
+          <w:tcPr>
+            <w:tcW w:type="dxa" w:w="864"/>
+            <w:vAlign w:val="center"/>
+          </w:tcPr>
+          <w:p>
+            <w:r>
+              <w:rPr>
+                <w:sz w:val="15"/>
+              </w:rPr>
+              <w:t>15.9%</w:t>
             </w:r>
           </w:p>
         </w:tc>
@@ -675,7 +875,7 @@
               <w:rPr>
                 <w:sz w:val="15"/>
               </w:rPr>
-              <w:t>12.0%</w:t>
+              <w:t>11.8%</w:t>
             </w:r>
           </w:p>
         </w:tc>
@@ -703,107 +903,7 @@
               <w:rPr>
                 <w:sz w:val="15"/>
               </w:rPr>
-              <w:t>4.6%</w:t>
-            </w:r>
-          </w:p>
-        </w:tc>
-      </w:tr>
-      <w:tr>
-        <w:tc>
-          <w:tcPr>
-            <w:tcW w:type="dxa" w:w="2880"/>
-            <w:vAlign w:val="center"/>
-          </w:tcPr>
-          <w:p>
-            <w:r>
-              <w:rPr>
-                <w:sz w:val="15"/>
-              </w:rPr>
-              <w:t>Game iOS A</w:t>
-            </w:r>
-          </w:p>
-        </w:tc>
-        <w:tc>
-          <w:tcPr>
-            <w:tcW w:type="dxa" w:w="1080"/>
-            <w:vAlign w:val="center"/>
-          </w:tcPr>
-          <w:p>
-            <w:r>
-              <w:rPr>
-                <w:sz w:val="15"/>
-              </w:rPr>
-              <w:t>Active</w:t>
-            </w:r>
-          </w:p>
-        </w:tc>
-        <w:tc>
-          <w:tcPr>
-            <w:tcW w:type="dxa" w:w="864"/>
-            <w:vAlign w:val="center"/>
-          </w:tcPr>
-          <w:p>
-            <w:r>
-              <w:rPr>
-                <w:sz w:val="15"/>
-              </w:rPr>
-              <w:t>192</w:t>
-            </w:r>
-          </w:p>
-        </w:tc>
-        <w:tc>
-          <w:tcPr>
-            <w:tcW w:type="dxa" w:w="936"/>
-            <w:vAlign w:val="center"/>
-          </w:tcPr>
-          <w:p>
-            <w:r>
-              <w:rPr>
-                <w:sz w:val="15"/>
-              </w:rPr>
-              <w:t>$2.78</w:t>
-            </w:r>
-          </w:p>
-        </w:tc>
-        <w:tc>
-          <w:tcPr>
-            <w:tcW w:type="dxa" w:w="1152"/>
-            <w:vAlign w:val="center"/>
-          </w:tcPr>
-          <w:p>
-            <w:r>
-              <w:rPr>
-                <w:sz w:val="15"/>
-              </w:rPr>
-              <w:t>10.6%</w:t>
-            </w:r>
-          </w:p>
-        </w:tc>
-        <w:tc>
-          <w:tcPr>
-            <w:tcW w:type="dxa" w:w="1296"/>
-            <w:vAlign w:val="center"/>
-          </w:tcPr>
-          <w:p>
-            <w:r>
-              <w:rPr>
-                <w:sz w:val="15"/>
-              </w:rPr>
-              <w:t>$35.56</w:t>
-            </w:r>
-          </w:p>
-        </w:tc>
-        <w:tc>
-          <w:tcPr>
-            <w:tcW w:type="dxa" w:w="864"/>
-            <w:vAlign w:val="center"/>
-          </w:tcPr>
-          <w:p>
-            <w:r>
-              <w:rPr>
-                <w:sz w:val="15"/>
-              </w:rPr>
-              <w:t>12.5%</w:t>
+              <w:t>4.4%</w:t>
             </w:r>
           </w:p>
         </w:tc>
@@ -847,7 +947,7 @@
               <w:rPr>
                 <w:sz w:val="15"/>
               </w:rPr>
-              <w:t>146</w:t>
+              <w:t>164</w:t>
             </w:r>
           </w:p>
         </w:tc>
@@ -861,7 +961,7 @@
               <w:rPr>
                 <w:sz w:val="15"/>
               </w:rPr>
-              <w:t>$1.15</w:t>
+              <w:t>$1.13</w:t>
             </w:r>
           </w:p>
         </w:tc>
@@ -875,7 +975,7 @@
               <w:rPr>
                 <w:sz w:val="15"/>
               </w:rPr>
-              <w:t>10.0%</w:t>
+              <w:t>11.3%</w:t>
             </w:r>
           </w:p>
         </w:tc>
@@ -889,7 +989,7 @@
               <w:rPr>
                 <w:sz w:val="15"/>
               </w:rPr>
-              <w:t>$15.25</w:t>
+              <w:t>$13.18</w:t>
             </w:r>
           </w:p>
         </w:tc>
@@ -903,7 +1003,107 @@
               <w:rPr>
                 <w:sz w:val="15"/>
               </w:rPr>
-              <w:t>26.2%</w:t>
+              <w:t>31.3%</w:t>
+            </w:r>
+          </w:p>
+        </w:tc>
+      </w:tr>
+      <w:tr>
+        <w:tc>
+          <w:tcPr>
+            <w:tcW w:type="dxa" w:w="2880"/>
+            <w:vAlign w:val="center"/>
+          </w:tcPr>
+          <w:p>
+            <w:r>
+              <w:rPr>
+                <w:sz w:val="15"/>
+              </w:rPr>
+              <w:t>Social iOS C</w:t>
+            </w:r>
+          </w:p>
+        </w:tc>
+        <w:tc>
+          <w:tcPr>
+            <w:tcW w:type="dxa" w:w="1080"/>
+            <w:vAlign w:val="center"/>
+          </w:tcPr>
+          <w:p>
+            <w:r>
+              <w:rPr>
+                <w:sz w:val="15"/>
+              </w:rPr>
+              <w:t>Active</w:t>
+            </w:r>
+          </w:p>
+        </w:tc>
+        <w:tc>
+          <w:tcPr>
+            <w:tcW w:type="dxa" w:w="864"/>
+            <w:vAlign w:val="center"/>
+          </w:tcPr>
+          <w:p>
+            <w:r>
+              <w:rPr>
+                <w:sz w:val="15"/>
+              </w:rPr>
+              <w:t>150</w:t>
+            </w:r>
+          </w:p>
+        </w:tc>
+        <w:tc>
+          <w:tcPr>
+            <w:tcW w:type="dxa" w:w="936"/>
+            <w:vAlign w:val="center"/>
+          </w:tcPr>
+          <w:p>
+            <w:r>
+              <w:rPr>
+                <w:sz w:val="15"/>
+              </w:rPr>
+              <w:t>$2.23</w:t>
+            </w:r>
+          </w:p>
+        </w:tc>
+        <w:tc>
+          <w:tcPr>
+            <w:tcW w:type="dxa" w:w="1152"/>
+            <w:vAlign w:val="center"/>
+          </w:tcPr>
+          <w:p>
+            <w:r>
+              <w:rPr>
+                <w:sz w:val="15"/>
+              </w:rPr>
+              <w:t>7.3%</w:t>
+            </w:r>
+          </w:p>
+        </w:tc>
+        <w:tc>
+          <w:tcPr>
+            <w:tcW w:type="dxa" w:w="1296"/>
+            <w:vAlign w:val="center"/>
+          </w:tcPr>
+          <w:p>
+            <w:r>
+              <w:rPr>
+                <w:sz w:val="15"/>
+              </w:rPr>
+              <w:t>$41.72</w:t>
+            </w:r>
+          </w:p>
+        </w:tc>
+        <w:tc>
+          <w:tcPr>
+            <w:tcW w:type="dxa" w:w="864"/>
+            <w:vAlign w:val="center"/>
+          </w:tcPr>
+          <w:p>
+            <w:r>
+              <w:rPr>
+                <w:sz w:val="15"/>
+              </w:rPr>
+              <w:t>11.0%</w:t>
             </w:r>
           </w:p>
         </w:tc>
@@ -975,7 +1175,7 @@
               <w:rPr>
                 <w:sz w:val="15"/>
               </w:rPr>
-              <w:t>9.1%</w:t>
+              <w:t>6.7%</w:t>
             </w:r>
           </w:p>
         </w:tc>
@@ -1003,107 +1203,7 @@
               <w:rPr>
                 <w:sz w:val="15"/>
               </w:rPr>
-              <w:t>4.9%</w:t>
-            </w:r>
-          </w:p>
-        </w:tc>
-      </w:tr>
-      <w:tr>
-        <w:tc>
-          <w:tcPr>
-            <w:tcW w:type="dxa" w:w="2880"/>
-            <w:vAlign w:val="center"/>
-          </w:tcPr>
-          <w:p>
-            <w:r>
-              <w:rPr>
-                <w:sz w:val="15"/>
-              </w:rPr>
-              <w:t>Social iOS C</w:t>
-            </w:r>
-          </w:p>
-        </w:tc>
-        <w:tc>
-          <w:tcPr>
-            <w:tcW w:type="dxa" w:w="1080"/>
-            <w:vAlign w:val="center"/>
-          </w:tcPr>
-          <w:p>
-            <w:r>
-              <w:rPr>
-                <w:sz w:val="15"/>
-              </w:rPr>
-              <w:t>Active</w:t>
-            </w:r>
-          </w:p>
-        </w:tc>
-        <w:tc>
-          <w:tcPr>
-            <w:tcW w:type="dxa" w:w="864"/>
-            <w:vAlign w:val="center"/>
-          </w:tcPr>
-          <w:p>
-            <w:r>
-              <w:rPr>
-                <w:sz w:val="15"/>
-              </w:rPr>
-              <w:t>135</w:t>
-            </w:r>
-          </w:p>
-        </w:tc>
-        <w:tc>
-          <w:tcPr>
-            <w:tcW w:type="dxa" w:w="936"/>
-            <w:vAlign w:val="center"/>
-          </w:tcPr>
-          <w:p>
-            <w:r>
-              <w:rPr>
-                <w:sz w:val="15"/>
-              </w:rPr>
-              <w:t>$2.11</w:t>
-            </w:r>
-          </w:p>
-        </w:tc>
-        <w:tc>
-          <w:tcPr>
-            <w:tcW w:type="dxa" w:w="1152"/>
-            <w:vAlign w:val="center"/>
-          </w:tcPr>
-          <w:p>
-            <w:r>
-              <w:rPr>
-                <w:sz w:val="15"/>
-              </w:rPr>
-              <w:t>7.0%</w:t>
-            </w:r>
-          </w:p>
-        </w:tc>
-        <w:tc>
-          <w:tcPr>
-            <w:tcW w:type="dxa" w:w="1296"/>
-            <w:vAlign w:val="center"/>
-          </w:tcPr>
-          <w:p>
-            <w:r>
-              <w:rPr>
-                <w:sz w:val="15"/>
-              </w:rPr>
-              <w:t>$47.37</w:t>
-            </w:r>
-          </w:p>
-        </w:tc>
-        <w:tc>
-          <w:tcPr>
-            <w:tcW w:type="dxa" w:w="864"/>
-            <w:vAlign w:val="center"/>
-          </w:tcPr>
-          <w:p>
-            <w:r>
-              <w:rPr>
-                <w:sz w:val="15"/>
-              </w:rPr>
-              <w:t>11.8%</w:t>
+              <w:t>3.0%</w:t>
             </w:r>
           </w:p>
         </w:tc>
@@ -1147,7 +1247,7 @@
               <w:rPr>
                 <w:sz w:val="15"/>
               </w:rPr>
-              <w:t>55</w:t>
+              <w:t>58</w:t>
             </w:r>
           </w:p>
         </w:tc>
@@ -1161,7 +1261,7 @@
               <w:rPr>
                 <w:sz w:val="15"/>
               </w:rPr>
-              <w:t>$2.21</w:t>
+              <w:t>$2.25</w:t>
             </w:r>
           </w:p>
         </w:tc>
@@ -1175,7 +1275,7 @@
               <w:rPr>
                 <w:sz w:val="15"/>
               </w:rPr>
-              <w:t>4.8%</w:t>
+              <w:t>2.9%</w:t>
             </w:r>
           </w:p>
         </w:tc>
@@ -1189,7 +1289,7 @@
               <w:rPr>
                 <w:sz w:val="15"/>
               </w:rPr>
-              <w:t>$121.42</w:t>
+              <w:t>$130.40</w:t>
             </w:r>
           </w:p>
         </w:tc>
@@ -1203,7 +1303,7 @@
               <w:rPr>
                 <w:sz w:val="15"/>
               </w:rPr>
-              <w:t>12.3%</w:t>
+              <w:t>11.2%</w:t>
             </w:r>
           </w:p>
         </w:tc>
@@ -1419,106 +1519,6 @@
               <w:rPr>
                 <w:sz w:val="15"/>
               </w:rPr>
-              <w:t>Social iOS B</w:t>
-            </w:r>
-          </w:p>
-        </w:tc>
-        <w:tc>
-          <w:tcPr>
-            <w:tcW w:type="dxa" w:w="1080"/>
-            <w:vAlign w:val="center"/>
-          </w:tcPr>
-          <w:p>
-            <w:r>
-              <w:rPr>
-                <w:sz w:val="15"/>
-              </w:rPr>
-              <w:t>Stopped</w:t>
-            </w:r>
-          </w:p>
-        </w:tc>
-        <w:tc>
-          <w:tcPr>
-            <w:tcW w:type="dxa" w:w="864"/>
-            <w:vAlign w:val="center"/>
-          </w:tcPr>
-          <w:p>
-            <w:r>
-              <w:rPr>
-                <w:sz w:val="15"/>
-              </w:rPr>
-              <w:t>4</w:t>
-            </w:r>
-          </w:p>
-        </w:tc>
-        <w:tc>
-          <w:tcPr>
-            <w:tcW w:type="dxa" w:w="936"/>
-            <w:vAlign w:val="center"/>
-          </w:tcPr>
-          <w:p>
-            <w:r>
-              <w:rPr>
-                <w:sz w:val="15"/>
-              </w:rPr>
-              <w:t>$0.00</w:t>
-            </w:r>
-          </w:p>
-        </w:tc>
-        <w:tc>
-          <w:tcPr>
-            <w:tcW w:type="dxa" w:w="1152"/>
-            <w:vAlign w:val="center"/>
-          </w:tcPr>
-          <w:p>
-            <w:r>
-              <w:rPr>
-                <w:sz w:val="15"/>
-              </w:rPr>
-              <w:t>0.0%</w:t>
-            </w:r>
-          </w:p>
-        </w:tc>
-        <w:tc>
-          <w:tcPr>
-            <w:tcW w:type="dxa" w:w="1296"/>
-            <w:vAlign w:val="center"/>
-          </w:tcPr>
-          <w:p>
-            <w:r>
-              <w:rPr>
-                <w:sz w:val="15"/>
-              </w:rPr>
-              <w:t>$n/a</w:t>
-            </w:r>
-          </w:p>
-        </w:tc>
-        <w:tc>
-          <w:tcPr>
-            <w:tcW w:type="dxa" w:w="864"/>
-            <w:vAlign w:val="center"/>
-          </w:tcPr>
-          <w:p>
-            <w:r>
-              <w:rPr>
-                <w:sz w:val="15"/>
-              </w:rPr>
-              <w:t>n/a</w:t>
-            </w:r>
-          </w:p>
-        </w:tc>
-      </w:tr>
-      <w:tr>
-        <w:tc>
-          <w:tcPr>
-            <w:tcW w:type="dxa" w:w="2880"/>
-            <w:vAlign w:val="center"/>
-          </w:tcPr>
-          <w:p>
-            <w:r>
-              <w:rPr>
-                <w:sz w:val="15"/>
-              </w:rPr>
               <w:t>Discovery iOS A</w:t>
             </w:r>
           </w:p>
@@ -1619,7 +1619,7 @@
     </w:p>
     <w:p>
       <w:r>
-        <w:t>Quality leaders were Search Android B, Search Android A. The strongest return signals came from Search Android A, Search Android B. Campaign decisions should combine scale, retained-user cost and return rather than optimize installs alone.</w:t>
+        <w:t>Quality leaders were Social iOS B, Search Android B. The strongest return signals came from Search Android B, Search Android A. Campaign decisions should combine scale, retained-user cost and return rather than optimize installs alone.</w:t>
       </w:r>
     </w:p>
     <w:p>
@@ -1687,7 +1687,7 @@
         <w:pStyle w:val="ListBullet"/>
       </w:pPr>
       <w:r>
-        <w:t>Use Search Android B as the player-quality benchmark for the next controlled test.</w:t>
+        <w:t>Use Social iOS B as the player-quality benchmark for the next controlled test.</w:t>
       </w:r>
     </w:p>
     <w:p>
@@ -1695,7 +1695,7 @@
         <w:pStyle w:val="ListBullet"/>
       </w:pPr>
       <w:r>
-        <w:t>Use Search Android B as the efficiency comparison and monitor D7 retained-user cost.</w:t>
+        <w:t>Use Social iOS B as the efficiency comparison and monitor D7 retained-user cost.</w:t>
       </w:r>
     </w:p>
     <w:p>
@@ -1830,7 +1830,7 @@
               <w:rPr>
                 <w:sz w:val="15"/>
               </w:rPr>
-              <w:t>948</w:t>
+              <w:t>1,014</w:t>
             </w:r>
           </w:p>
         </w:tc>

</xml_diff>

<commit_message>
Daily synthetic refresh: demo data through 2025-10-27
</commit_message>
<xml_diff>
--- a/outputs/reports/Marketing_Performance_Report_2025-10.docx
+++ b/outputs/reports/Marketing_Performance_Report_2025-10.docx
@@ -37,7 +37,7 @@
     </w:p>
     <w:p>
       <w:r>
-        <w:t>The synthetic portfolio acquired 1,014 players and generated 15.8% return on ad spend. D7 retention was 9.0%. Social iOS B produced the strongest D7 retention, while Social iOS B produced the lowest cost per D7 retained player.</w:t>
+        <w:t>The synthetic portfolio acquired 1,045 players and generated 15.2% return on ad spend. D7 retention was 9.0%. Social iOS B produced the strongest D7 retention, while Social iOS B produced the lowest cost per D7 retained player.</w:t>
       </w:r>
     </w:p>
     <w:tbl>
@@ -144,7 +144,7 @@
               <w:rPr>
                 <w:b/>
               </w:rPr>
-              <w:t>1,014</w:t>
+              <w:t>1,045</w:t>
             </w:r>
           </w:p>
         </w:tc>
@@ -161,7 +161,7 @@
               <w:rPr>
                 <w:b/>
               </w:rPr>
-              <w:t>83.5%</w:t>
+              <w:t>84.0%</w:t>
             </w:r>
           </w:p>
         </w:tc>
@@ -178,7 +178,7 @@
               <w:rPr>
                 <w:b/>
               </w:rPr>
-              <w:t>23.2%</w:t>
+              <w:t>23.3%</w:t>
             </w:r>
           </w:p>
         </w:tc>
@@ -212,7 +212,7 @@
               <w:rPr>
                 <w:b/>
               </w:rPr>
-              <w:t>15.8%</w:t>
+              <w:t>15.2%</w:t>
             </w:r>
           </w:p>
         </w:tc>
@@ -647,7 +647,7 @@
               <w:rPr>
                 <w:sz w:val="15"/>
               </w:rPr>
-              <w:t>97</w:t>
+              <w:t>103</w:t>
             </w:r>
           </w:p>
         </w:tc>
@@ -661,7 +661,7 @@
               <w:rPr>
                 <w:sz w:val="15"/>
               </w:rPr>
-              <w:t>$2.58</w:t>
+              <w:t>$2.67</w:t>
             </w:r>
           </w:p>
         </w:tc>
@@ -675,7 +675,7 @@
               <w:rPr>
                 <w:sz w:val="15"/>
               </w:rPr>
-              <w:t>20.3%</w:t>
+              <w:t>19.4%</w:t>
             </w:r>
           </w:p>
         </w:tc>
@@ -689,7 +689,7 @@
               <w:rPr>
                 <w:sz w:val="15"/>
               </w:rPr>
-              <w:t>$20.88</w:t>
+              <w:t>$22.94</w:t>
             </w:r>
           </w:p>
         </w:tc>
@@ -703,7 +703,7 @@
               <w:rPr>
                 <w:sz w:val="15"/>
               </w:rPr>
-              <w:t>42.7%</w:t>
+              <w:t>38.9%</w:t>
             </w:r>
           </w:p>
         </w:tc>
@@ -747,7 +747,7 @@
               <w:rPr>
                 <w:sz w:val="15"/>
               </w:rPr>
-              <w:t>206</w:t>
+              <w:t>213</w:t>
             </w:r>
           </w:p>
         </w:tc>
@@ -761,7 +761,7 @@
               <w:rPr>
                 <w:sz w:val="15"/>
               </w:rPr>
-              <w:t>$2.77</w:t>
+              <w:t>$2.76</w:t>
             </w:r>
           </w:p>
         </w:tc>
@@ -775,7 +775,7 @@
               <w:rPr>
                 <w:sz w:val="15"/>
               </w:rPr>
-              <w:t>11.9%</w:t>
+              <w:t>12.1%</w:t>
             </w:r>
           </w:p>
         </w:tc>
@@ -789,7 +789,7 @@
               <w:rPr>
                 <w:sz w:val="15"/>
               </w:rPr>
-              <w:t>$28.52</w:t>
+              <w:t>$27.97</w:t>
             </w:r>
           </w:p>
         </w:tc>
@@ -803,7 +803,7 @@
               <w:rPr>
                 <w:sz w:val="15"/>
               </w:rPr>
-              <w:t>15.9%</w:t>
+              <w:t>14.6%</w:t>
             </w:r>
           </w:p>
         </w:tc>
@@ -903,7 +903,7 @@
               <w:rPr>
                 <w:sz w:val="15"/>
               </w:rPr>
-              <w:t>4.4%</w:t>
+              <w:t>4.5%</w:t>
             </w:r>
           </w:p>
         </w:tc>
@@ -947,7 +947,7 @@
               <w:rPr>
                 <w:sz w:val="15"/>
               </w:rPr>
-              <w:t>164</w:t>
+              <w:t>169</w:t>
             </w:r>
           </w:p>
         </w:tc>
@@ -961,7 +961,7 @@
               <w:rPr>
                 <w:sz w:val="15"/>
               </w:rPr>
-              <w:t>$1.13</w:t>
+              <w:t>$1.12</w:t>
             </w:r>
           </w:p>
         </w:tc>
@@ -975,7 +975,7 @@
               <w:rPr>
                 <w:sz w:val="15"/>
               </w:rPr>
-              <w:t>11.3%</w:t>
+              <w:t>10.7%</w:t>
             </w:r>
           </w:p>
         </w:tc>
@@ -989,7 +989,7 @@
               <w:rPr>
                 <w:sz w:val="15"/>
               </w:rPr>
-              <w:t>$13.18</w:t>
+              <w:t>$13.55</w:t>
             </w:r>
           </w:p>
         </w:tc>
@@ -1003,7 +1003,7 @@
               <w:rPr>
                 <w:sz w:val="15"/>
               </w:rPr>
-              <w:t>31.3%</w:t>
+              <w:t>30.1%</w:t>
             </w:r>
           </w:p>
         </w:tc>
@@ -1047,7 +1047,7 @@
               <w:rPr>
                 <w:sz w:val="15"/>
               </w:rPr>
-              <w:t>150</w:t>
+              <w:t>159</w:t>
             </w:r>
           </w:p>
         </w:tc>
@@ -1061,7 +1061,7 @@
               <w:rPr>
                 <w:sz w:val="15"/>
               </w:rPr>
-              <w:t>$2.23</w:t>
+              <w:t>$2.17</w:t>
             </w:r>
           </w:p>
         </w:tc>
@@ -1075,7 +1075,7 @@
               <w:rPr>
                 <w:sz w:val="15"/>
               </w:rPr>
-              <w:t>7.3%</w:t>
+              <w:t>7.8%</w:t>
             </w:r>
           </w:p>
         </w:tc>
@@ -1089,7 +1089,7 @@
               <w:rPr>
                 <w:sz w:val="15"/>
               </w:rPr>
-              <w:t>$41.72</w:t>
+              <w:t>$38.30</w:t>
             </w:r>
           </w:p>
         </w:tc>
@@ -1103,7 +1103,7 @@
               <w:rPr>
                 <w:sz w:val="15"/>
               </w:rPr>
-              <w:t>11.0%</w:t>
+              <w:t>10.9%</w:t>
             </w:r>
           </w:p>
         </w:tc>
@@ -1175,7 +1175,7 @@
               <w:rPr>
                 <w:sz w:val="15"/>
               </w:rPr>
-              <w:t>6.7%</w:t>
+              <w:t>5.9%</w:t>
             </w:r>
           </w:p>
         </w:tc>
@@ -1189,7 +1189,7 @@
               <w:rPr>
                 <w:sz w:val="15"/>
               </w:rPr>
-              <w:t>$233.96</w:t>
+              <w:t>$234.08</w:t>
             </w:r>
           </w:p>
         </w:tc>
@@ -1203,7 +1203,7 @@
               <w:rPr>
                 <w:sz w:val="15"/>
               </w:rPr>
-              <w:t>3.0%</w:t>
+              <w:t>2.7%</w:t>
             </w:r>
           </w:p>
         </w:tc>
@@ -1247,7 +1247,7 @@
               <w:rPr>
                 <w:sz w:val="15"/>
               </w:rPr>
-              <w:t>58</w:t>
+              <w:t>62</w:t>
             </w:r>
           </w:p>
         </w:tc>
@@ -1261,7 +1261,7 @@
               <w:rPr>
                 <w:sz w:val="15"/>
               </w:rPr>
-              <w:t>$2.25</w:t>
+              <w:t>$2.20</w:t>
             </w:r>
           </w:p>
         </w:tc>
@@ -1275,7 +1275,7 @@
               <w:rPr>
                 <w:sz w:val="15"/>
               </w:rPr>
-              <w:t>2.9%</w:t>
+              <w:t>2.8%</w:t>
             </w:r>
           </w:p>
         </w:tc>
@@ -1289,7 +1289,7 @@
               <w:rPr>
                 <w:sz w:val="15"/>
               </w:rPr>
-              <w:t>$130.40</w:t>
+              <w:t>$136.63</w:t>
             </w:r>
           </w:p>
         </w:tc>
@@ -1303,7 +1303,7 @@
               <w:rPr>
                 <w:sz w:val="15"/>
               </w:rPr>
-              <w:t>11.2%</w:t>
+              <w:t>12.4%</w:t>
             </w:r>
           </w:p>
         </w:tc>
@@ -1389,7 +1389,7 @@
               <w:rPr>
                 <w:sz w:val="15"/>
               </w:rPr>
-              <w:t>$65.22</w:t>
+              <w:t>$65.26</w:t>
             </w:r>
           </w:p>
         </w:tc>
@@ -1830,7 +1830,7 @@
               <w:rPr>
                 <w:sz w:val="15"/>
               </w:rPr>
-              <w:t>1,014</w:t>
+              <w:t>1,045</w:t>
             </w:r>
           </w:p>
         </w:tc>

</xml_diff>

<commit_message>
Daily synthetic refresh: demo data through 2025-10-28
</commit_message>
<xml_diff>
--- a/outputs/reports/Marketing_Performance_Report_2025-10.docx
+++ b/outputs/reports/Marketing_Performance_Report_2025-10.docx
@@ -37,7 +37,7 @@
     </w:p>
     <w:p>
       <w:r>
-        <w:t>The synthetic portfolio acquired 1,045 players and generated 15.2% return on ad spend. D7 retention was 9.0%. Social iOS B produced the strongest D7 retention, while Social iOS B produced the lowest cost per D7 retained player.</w:t>
+        <w:t>The synthetic portfolio acquired 1,073 players and generated 16.0% return on ad spend. D7 retention was 9.1%. Social iOS B produced the strongest D7 retention, while Social iOS B produced the lowest cost per D7 retained player.</w:t>
       </w:r>
     </w:p>
     <w:tbl>
@@ -144,7 +144,7 @@
               <w:rPr>
                 <w:b/>
               </w:rPr>
-              <w:t>1,045</w:t>
+              <w:t>1,073</w:t>
             </w:r>
           </w:p>
         </w:tc>
@@ -161,7 +161,7 @@
               <w:rPr>
                 <w:b/>
               </w:rPr>
-              <w:t>84.0%</w:t>
+              <w:t>84.2%</w:t>
             </w:r>
           </w:p>
         </w:tc>
@@ -178,7 +178,7 @@
               <w:rPr>
                 <w:b/>
               </w:rPr>
-              <w:t>23.3%</w:t>
+              <w:t>24.0%</w:t>
             </w:r>
           </w:p>
         </w:tc>
@@ -195,7 +195,7 @@
               <w:rPr>
                 <w:b/>
               </w:rPr>
-              <w:t>9.0%</w:t>
+              <w:t>9.1%</w:t>
             </w:r>
           </w:p>
         </w:tc>
@@ -212,7 +212,7 @@
               <w:rPr>
                 <w:b/>
               </w:rPr>
-              <w:t>15.2%</w:t>
+              <w:t>16.0%</w:t>
             </w:r>
           </w:p>
         </w:tc>
@@ -647,7 +647,7 @@
               <w:rPr>
                 <w:sz w:val="15"/>
               </w:rPr>
-              <w:t>103</w:t>
+              <w:t>108</w:t>
             </w:r>
           </w:p>
         </w:tc>
@@ -675,7 +675,7 @@
               <w:rPr>
                 <w:sz w:val="15"/>
               </w:rPr>
-              <w:t>19.4%</w:t>
+              <w:t>18.5%</w:t>
             </w:r>
           </w:p>
         </w:tc>
@@ -689,7 +689,7 @@
               <w:rPr>
                 <w:sz w:val="15"/>
               </w:rPr>
-              <w:t>$22.94</w:t>
+              <w:t>$24.06</w:t>
             </w:r>
           </w:p>
         </w:tc>
@@ -703,7 +703,7 @@
               <w:rPr>
                 <w:sz w:val="15"/>
               </w:rPr>
-              <w:t>38.9%</w:t>
+              <w:t>39.5%</w:t>
             </w:r>
           </w:p>
         </w:tc>
@@ -747,7 +747,7 @@
               <w:rPr>
                 <w:sz w:val="15"/>
               </w:rPr>
-              <w:t>213</w:t>
+              <w:t>222</w:t>
             </w:r>
           </w:p>
         </w:tc>
@@ -761,7 +761,7 @@
               <w:rPr>
                 <w:sz w:val="15"/>
               </w:rPr>
-              <w:t>$2.76</w:t>
+              <w:t>$2.73</w:t>
             </w:r>
           </w:p>
         </w:tc>
@@ -775,7 +775,7 @@
               <w:rPr>
                 <w:sz w:val="15"/>
               </w:rPr>
-              <w:t>12.1%</w:t>
+              <w:t>13.0%</w:t>
             </w:r>
           </w:p>
         </w:tc>
@@ -789,7 +789,7 @@
               <w:rPr>
                 <w:sz w:val="15"/>
               </w:rPr>
-              <w:t>$27.97</w:t>
+              <w:t>$26.32</w:t>
             </w:r>
           </w:p>
         </w:tc>
@@ -803,7 +803,7 @@
               <w:rPr>
                 <w:sz w:val="15"/>
               </w:rPr>
-              <w:t>14.6%</w:t>
+              <w:t>15.3%</w:t>
             </w:r>
           </w:p>
         </w:tc>
@@ -947,7 +947,7 @@
               <w:rPr>
                 <w:sz w:val="15"/>
               </w:rPr>
-              <w:t>169</w:t>
+              <w:t>175</w:t>
             </w:r>
           </w:p>
         </w:tc>
@@ -961,7 +961,7 @@
               <w:rPr>
                 <w:sz w:val="15"/>
               </w:rPr>
-              <w:t>$1.12</w:t>
+              <w:t>$1.11</w:t>
             </w:r>
           </w:p>
         </w:tc>
@@ -975,7 +975,7 @@
               <w:rPr>
                 <w:sz w:val="15"/>
               </w:rPr>
-              <w:t>10.7%</w:t>
+              <w:t>10.5%</w:t>
             </w:r>
           </w:p>
         </w:tc>
@@ -989,7 +989,7 @@
               <w:rPr>
                 <w:sz w:val="15"/>
               </w:rPr>
-              <w:t>$13.55</w:t>
+              <w:t>$13.89</w:t>
             </w:r>
           </w:p>
         </w:tc>
@@ -1003,7 +1003,7 @@
               <w:rPr>
                 <w:sz w:val="15"/>
               </w:rPr>
-              <w:t>30.1%</w:t>
+              <w:t>29.0%</w:t>
             </w:r>
           </w:p>
         </w:tc>
@@ -1047,7 +1047,7 @@
               <w:rPr>
                 <w:sz w:val="15"/>
               </w:rPr>
-              <w:t>159</w:t>
+              <w:t>165</w:t>
             </w:r>
           </w:p>
         </w:tc>
@@ -1061,7 +1061,7 @@
               <w:rPr>
                 <w:sz w:val="15"/>
               </w:rPr>
-              <w:t>$2.17</w:t>
+              <w:t>$2.18</w:t>
             </w:r>
           </w:p>
         </w:tc>
@@ -1075,7 +1075,7 @@
               <w:rPr>
                 <w:sz w:val="15"/>
               </w:rPr>
-              <w:t>7.8%</w:t>
+              <w:t>7.6%</w:t>
             </w:r>
           </w:p>
         </w:tc>
@@ -1089,7 +1089,7 @@
               <w:rPr>
                 <w:sz w:val="15"/>
               </w:rPr>
-              <w:t>$38.30</w:t>
+              <w:t>$39.99</w:t>
             </w:r>
           </w:p>
         </w:tc>
@@ -1103,7 +1103,7 @@
               <w:rPr>
                 <w:sz w:val="15"/>
               </w:rPr>
-              <w:t>10.9%</w:t>
+              <w:t>14.0%</w:t>
             </w:r>
           </w:p>
         </w:tc>
@@ -1247,7 +1247,7 @@
               <w:rPr>
                 <w:sz w:val="15"/>
               </w:rPr>
-              <w:t>62</w:t>
+              <w:t>64</w:t>
             </w:r>
           </w:p>
         </w:tc>
@@ -1261,7 +1261,7 @@
               <w:rPr>
                 <w:sz w:val="15"/>
               </w:rPr>
-              <w:t>$2.20</w:t>
+              <w:t>$2.23</w:t>
             </w:r>
           </w:p>
         </w:tc>
@@ -1275,7 +1275,7 @@
               <w:rPr>
                 <w:sz w:val="15"/>
               </w:rPr>
-              <w:t>2.8%</w:t>
+              <w:t>2.5%</w:t>
             </w:r>
           </w:p>
         </w:tc>
@@ -1289,7 +1289,7 @@
               <w:rPr>
                 <w:sz w:val="15"/>
               </w:rPr>
-              <w:t>$136.63</w:t>
+              <w:t>$142.89</w:t>
             </w:r>
           </w:p>
         </w:tc>
@@ -1303,7 +1303,7 @@
               <w:rPr>
                 <w:sz w:val="15"/>
               </w:rPr>
-              <w:t>12.4%</w:t>
+              <w:t>12.5%</w:t>
             </w:r>
           </w:p>
         </w:tc>
@@ -1830,7 +1830,7 @@
               <w:rPr>
                 <w:sz w:val="15"/>
               </w:rPr>
-              <w:t>1,045</w:t>
+              <w:t>1,073</w:t>
             </w:r>
           </w:p>
         </w:tc>

</xml_diff>

<commit_message>
Daily synthetic refresh: demo data through 2025-10-29
</commit_message>
<xml_diff>
--- a/outputs/reports/Marketing_Performance_Report_2025-10.docx
+++ b/outputs/reports/Marketing_Performance_Report_2025-10.docx
@@ -37,7 +37,7 @@
     </w:p>
     <w:p>
       <w:r>
-        <w:t>The synthetic portfolio acquired 1,073 players and generated 16.0% return on ad spend. D7 retention was 9.1%. Social iOS B produced the strongest D7 retention, while Social iOS B produced the lowest cost per D7 retained player.</w:t>
+        <w:t>The synthetic portfolio acquired 1,114 players and generated 16.1% return on ad spend. D7 retention was 9.1%. Social iOS B produced the strongest D7 retention, while Social iOS B produced the lowest cost per D7 retained player.</w:t>
       </w:r>
     </w:p>
     <w:tbl>
@@ -144,7 +144,7 @@
               <w:rPr>
                 <w:b/>
               </w:rPr>
-              <w:t>1,073</w:t>
+              <w:t>1,114</w:t>
             </w:r>
           </w:p>
         </w:tc>
@@ -161,7 +161,7 @@
               <w:rPr>
                 <w:b/>
               </w:rPr>
-              <w:t>84.2%</w:t>
+              <w:t>84.7%</w:t>
             </w:r>
           </w:p>
         </w:tc>
@@ -178,7 +178,7 @@
               <w:rPr>
                 <w:b/>
               </w:rPr>
-              <w:t>24.0%</w:t>
+              <w:t>24.5%</w:t>
             </w:r>
           </w:p>
         </w:tc>
@@ -212,7 +212,7 @@
               <w:rPr>
                 <w:b/>
               </w:rPr>
-              <w:t>16.0%</w:t>
+              <w:t>16.1%</w:t>
             </w:r>
           </w:p>
         </w:tc>
@@ -647,7 +647,7 @@
               <w:rPr>
                 <w:sz w:val="15"/>
               </w:rPr>
-              <w:t>108</w:t>
+              <w:t>118</w:t>
             </w:r>
           </w:p>
         </w:tc>
@@ -661,7 +661,7 @@
               <w:rPr>
                 <w:sz w:val="15"/>
               </w:rPr>
-              <w:t>$2.67</w:t>
+              <w:t>$2.68</w:t>
             </w:r>
           </w:p>
         </w:tc>
@@ -675,7 +675,7 @@
               <w:rPr>
                 <w:sz w:val="15"/>
               </w:rPr>
-              <w:t>18.5%</w:t>
+              <w:t>17.6%</w:t>
             </w:r>
           </w:p>
         </w:tc>
@@ -689,7 +689,7 @@
               <w:rPr>
                 <w:sz w:val="15"/>
               </w:rPr>
-              <w:t>$24.06</w:t>
+              <w:t>$26.34</w:t>
             </w:r>
           </w:p>
         </w:tc>
@@ -703,7 +703,7 @@
               <w:rPr>
                 <w:sz w:val="15"/>
               </w:rPr>
-              <w:t>39.5%</w:t>
+              <w:t>38.3%</w:t>
             </w:r>
           </w:p>
         </w:tc>
@@ -747,7 +747,7 @@
               <w:rPr>
                 <w:sz w:val="15"/>
               </w:rPr>
-              <w:t>222</w:t>
+              <w:t>231</w:t>
             </w:r>
           </w:p>
         </w:tc>
@@ -761,7 +761,7 @@
               <w:rPr>
                 <w:sz w:val="15"/>
               </w:rPr>
-              <w:t>$2.73</w:t>
+              <w:t>$2.74</w:t>
             </w:r>
           </w:p>
         </w:tc>
@@ -775,7 +775,7 @@
               <w:rPr>
                 <w:sz w:val="15"/>
               </w:rPr>
-              <w:t>13.0%</w:t>
+              <w:t>13.7%</w:t>
             </w:r>
           </w:p>
         </w:tc>
@@ -789,7 +789,7 @@
               <w:rPr>
                 <w:sz w:val="15"/>
               </w:rPr>
-              <w:t>$26.32</w:t>
+              <w:t>$25.28</w:t>
             </w:r>
           </w:p>
         </w:tc>
@@ -803,7 +803,7 @@
               <w:rPr>
                 <w:sz w:val="15"/>
               </w:rPr>
-              <w:t>15.3%</w:t>
+              <w:t>14.6%</w:t>
             </w:r>
           </w:p>
         </w:tc>
@@ -875,7 +875,7 @@
               <w:rPr>
                 <w:sz w:val="15"/>
               </w:rPr>
-              <w:t>11.8%</w:t>
+              <w:t>11.7%</w:t>
             </w:r>
           </w:p>
         </w:tc>
@@ -903,7 +903,7 @@
               <w:rPr>
                 <w:sz w:val="15"/>
               </w:rPr>
-              <w:t>4.5%</w:t>
+              <w:t>4.4%</w:t>
             </w:r>
           </w:p>
         </w:tc>
@@ -947,7 +947,7 @@
               <w:rPr>
                 <w:sz w:val="15"/>
               </w:rPr>
-              <w:t>175</w:t>
+              <w:t>189</w:t>
             </w:r>
           </w:p>
         </w:tc>
@@ -961,7 +961,7 @@
               <w:rPr>
                 <w:sz w:val="15"/>
               </w:rPr>
-              <w:t>$1.11</w:t>
+              <w:t>$1.08</w:t>
             </w:r>
           </w:p>
         </w:tc>
@@ -975,7 +975,7 @@
               <w:rPr>
                 <w:sz w:val="15"/>
               </w:rPr>
-              <w:t>10.5%</w:t>
+              <w:t>10.1%</w:t>
             </w:r>
           </w:p>
         </w:tc>
@@ -989,7 +989,7 @@
               <w:rPr>
                 <w:sz w:val="15"/>
               </w:rPr>
-              <w:t>$13.89</w:t>
+              <w:t>$14.56</w:t>
             </w:r>
           </w:p>
         </w:tc>
@@ -1003,7 +1003,7 @@
               <w:rPr>
                 <w:sz w:val="15"/>
               </w:rPr>
-              <w:t>29.0%</w:t>
+              <w:t>28.6%</w:t>
             </w:r>
           </w:p>
         </w:tc>
@@ -1047,7 +1047,7 @@
               <w:rPr>
                 <w:sz w:val="15"/>
               </w:rPr>
-              <w:t>165</w:t>
+              <w:t>171</w:t>
             </w:r>
           </w:p>
         </w:tc>
@@ -1075,7 +1075,7 @@
               <w:rPr>
                 <w:sz w:val="15"/>
               </w:rPr>
-              <w:t>7.6%</w:t>
+              <w:t>7.3%</w:t>
             </w:r>
           </w:p>
         </w:tc>
@@ -1089,7 +1089,7 @@
               <w:rPr>
                 <w:sz w:val="15"/>
               </w:rPr>
-              <w:t>$39.99</w:t>
+              <w:t>$41.38</w:t>
             </w:r>
           </w:p>
         </w:tc>
@@ -1103,7 +1103,7 @@
               <w:rPr>
                 <w:sz w:val="15"/>
               </w:rPr>
-              <w:t>14.0%</w:t>
+              <w:t>14.4%</w:t>
             </w:r>
           </w:p>
         </w:tc>
@@ -1247,7 +1247,7 @@
               <w:rPr>
                 <w:sz w:val="15"/>
               </w:rPr>
-              <w:t>64</w:t>
+              <w:t>66</w:t>
             </w:r>
           </w:p>
         </w:tc>
@@ -1261,7 +1261,7 @@
               <w:rPr>
                 <w:sz w:val="15"/>
               </w:rPr>
-              <w:t>$2.23</w:t>
+              <w:t>$2.26</w:t>
             </w:r>
           </w:p>
         </w:tc>
@@ -1275,7 +1275,7 @@
               <w:rPr>
                 <w:sz w:val="15"/>
               </w:rPr>
-              <w:t>2.5%</w:t>
+              <w:t>2.2%</w:t>
             </w:r>
           </w:p>
         </w:tc>
@@ -1289,7 +1289,7 @@
               <w:rPr>
                 <w:sz w:val="15"/>
               </w:rPr>
-              <w:t>$142.89</w:t>
+              <w:t>$149.17</w:t>
             </w:r>
           </w:p>
         </w:tc>
@@ -1303,7 +1303,7 @@
               <w:rPr>
                 <w:sz w:val="15"/>
               </w:rPr>
-              <w:t>12.5%</w:t>
+              <w:t>13.3%</w:t>
             </w:r>
           </w:p>
         </w:tc>
@@ -1830,7 +1830,7 @@
               <w:rPr>
                 <w:sz w:val="15"/>
               </w:rPr>
-              <w:t>1,073</w:t>
+              <w:t>1,114</w:t>
             </w:r>
           </w:p>
         </w:tc>

</xml_diff>

<commit_message>
Daily synthetic refresh: demo data through 2025-10-30
</commit_message>
<xml_diff>
--- a/outputs/reports/Marketing_Performance_Report_2025-10.docx
+++ b/outputs/reports/Marketing_Performance_Report_2025-10.docx
@@ -37,7 +37,7 @@
     </w:p>
     <w:p>
       <w:r>
-        <w:t>The synthetic portfolio acquired 1,114 players and generated 16.1% return on ad spend. D7 retention was 9.1%. Social iOS B produced the strongest D7 retention, while Social iOS B produced the lowest cost per D7 retained player.</w:t>
+        <w:t>The synthetic portfolio acquired 1,160 players and generated 15.6% return on ad spend. D7 retention was 9.2%. Social iOS B produced the strongest D7 retention, while Social iOS B produced the lowest cost per D7 retained player.</w:t>
       </w:r>
     </w:p>
     <w:tbl>
@@ -144,7 +144,7 @@
               <w:rPr>
                 <w:b/>
               </w:rPr>
-              <w:t>1,114</w:t>
+              <w:t>1,160</w:t>
             </w:r>
           </w:p>
         </w:tc>
@@ -161,7 +161,7 @@
               <w:rPr>
                 <w:b/>
               </w:rPr>
-              <w:t>84.7%</w:t>
+              <w:t>85.2%</w:t>
             </w:r>
           </w:p>
         </w:tc>
@@ -178,7 +178,7 @@
               <w:rPr>
                 <w:b/>
               </w:rPr>
-              <w:t>24.5%</w:t>
+              <w:t>24.6%</w:t>
             </w:r>
           </w:p>
         </w:tc>
@@ -195,7 +195,7 @@
               <w:rPr>
                 <w:b/>
               </w:rPr>
-              <w:t>9.1%</w:t>
+              <w:t>9.2%</w:t>
             </w:r>
           </w:p>
         </w:tc>
@@ -212,7 +212,7 @@
               <w:rPr>
                 <w:b/>
               </w:rPr>
-              <w:t>16.1%</w:t>
+              <w:t>15.6%</w:t>
             </w:r>
           </w:p>
         </w:tc>
@@ -647,7 +647,7 @@
               <w:rPr>
                 <w:sz w:val="15"/>
               </w:rPr>
-              <w:t>118</w:t>
+              <w:t>129</w:t>
             </w:r>
           </w:p>
         </w:tc>
@@ -661,7 +661,7 @@
               <w:rPr>
                 <w:sz w:val="15"/>
               </w:rPr>
-              <w:t>$2.68</w:t>
+              <w:t>$2.80</w:t>
             </w:r>
           </w:p>
         </w:tc>
@@ -675,7 +675,7 @@
               <w:rPr>
                 <w:sz w:val="15"/>
               </w:rPr>
-              <w:t>17.6%</w:t>
+              <w:t>15.8%</w:t>
             </w:r>
           </w:p>
         </w:tc>
@@ -689,7 +689,7 @@
               <w:rPr>
                 <w:sz w:val="15"/>
               </w:rPr>
-              <w:t>$26.34</w:t>
+              <w:t>$30.15</w:t>
             </w:r>
           </w:p>
         </w:tc>
@@ -703,7 +703,7 @@
               <w:rPr>
                 <w:sz w:val="15"/>
               </w:rPr>
-              <w:t>38.3%</w:t>
+              <w:t>32.9%</w:t>
             </w:r>
           </w:p>
         </w:tc>
@@ -747,7 +747,7 @@
               <w:rPr>
                 <w:sz w:val="15"/>
               </w:rPr>
-              <w:t>231</w:t>
+              <w:t>245</w:t>
             </w:r>
           </w:p>
         </w:tc>
@@ -761,7 +761,7 @@
               <w:rPr>
                 <w:sz w:val="15"/>
               </w:rPr>
-              <w:t>$2.74</w:t>
+              <w:t>$2.69</w:t>
             </w:r>
           </w:p>
         </w:tc>
@@ -775,7 +775,7 @@
               <w:rPr>
                 <w:sz w:val="15"/>
               </w:rPr>
-              <w:t>13.7%</w:t>
+              <w:t>13.4%</w:t>
             </w:r>
           </w:p>
         </w:tc>
@@ -789,7 +789,7 @@
               <w:rPr>
                 <w:sz w:val="15"/>
               </w:rPr>
-              <w:t>$25.28</w:t>
+              <w:t>$26.36</w:t>
             </w:r>
           </w:p>
         </w:tc>
@@ -803,7 +803,7 @@
               <w:rPr>
                 <w:sz w:val="15"/>
               </w:rPr>
-              <w:t>14.6%</w:t>
+              <w:t>15.2%</w:t>
             </w:r>
           </w:p>
         </w:tc>
@@ -903,7 +903,7 @@
               <w:rPr>
                 <w:sz w:val="15"/>
               </w:rPr>
-              <w:t>4.4%</w:t>
+              <w:t>4.5%</w:t>
             </w:r>
           </w:p>
         </w:tc>
@@ -947,7 +947,7 @@
               <w:rPr>
                 <w:sz w:val="15"/>
               </w:rPr>
-              <w:t>189</w:t>
+              <w:t>204</w:t>
             </w:r>
           </w:p>
         </w:tc>
@@ -961,7 +961,7 @@
               <w:rPr>
                 <w:sz w:val="15"/>
               </w:rPr>
-              <w:t>$1.08</w:t>
+              <w:t>$1.12</w:t>
             </w:r>
           </w:p>
         </w:tc>
@@ -975,7 +975,7 @@
               <w:rPr>
                 <w:sz w:val="15"/>
               </w:rPr>
-              <w:t>10.1%</w:t>
+              <w:t>11.3%</w:t>
             </w:r>
           </w:p>
         </w:tc>
@@ -989,7 +989,7 @@
               <w:rPr>
                 <w:sz w:val="15"/>
               </w:rPr>
-              <w:t>$14.56</w:t>
+              <w:t>$14.32</w:t>
             </w:r>
           </w:p>
         </w:tc>
@@ -1003,7 +1003,7 @@
               <w:rPr>
                 <w:sz w:val="15"/>
               </w:rPr>
-              <w:t>28.6%</w:t>
+              <w:t>25.7%</w:t>
             </w:r>
           </w:p>
         </w:tc>
@@ -1047,7 +1047,7 @@
               <w:rPr>
                 <w:sz w:val="15"/>
               </w:rPr>
-              <w:t>171</w:t>
+              <w:t>176</w:t>
             </w:r>
           </w:p>
         </w:tc>
@@ -1061,7 +1061,7 @@
               <w:rPr>
                 <w:sz w:val="15"/>
               </w:rPr>
-              <w:t>$2.18</w:t>
+              <w:t>$2.19</w:t>
             </w:r>
           </w:p>
         </w:tc>
@@ -1075,7 +1075,7 @@
               <w:rPr>
                 <w:sz w:val="15"/>
               </w:rPr>
-              <w:t>7.3%</w:t>
+              <w:t>6.9%</w:t>
             </w:r>
           </w:p>
         </w:tc>
@@ -1089,7 +1089,7 @@
               <w:rPr>
                 <w:sz w:val="15"/>
               </w:rPr>
-              <w:t>$41.38</w:t>
+              <w:t>$42.80</w:t>
             </w:r>
           </w:p>
         </w:tc>
@@ -1103,7 +1103,107 @@
               <w:rPr>
                 <w:sz w:val="15"/>
               </w:rPr>
-              <w:t>14.4%</w:t>
+              <w:t>11.6%</w:t>
+            </w:r>
+          </w:p>
+        </w:tc>
+      </w:tr>
+      <w:tr>
+        <w:tc>
+          <w:tcPr>
+            <w:tcW w:type="dxa" w:w="2880"/>
+            <w:vAlign w:val="center"/>
+          </w:tcPr>
+          <w:p>
+            <w:r>
+              <w:rPr>
+                <w:sz w:val="15"/>
+              </w:rPr>
+              <w:t>Game Android E</w:t>
+            </w:r>
+          </w:p>
+        </w:tc>
+        <w:tc>
+          <w:tcPr>
+            <w:tcW w:type="dxa" w:w="1080"/>
+            <w:vAlign w:val="center"/>
+          </w:tcPr>
+          <w:p>
+            <w:r>
+              <w:rPr>
+                <w:sz w:val="15"/>
+              </w:rPr>
+              <w:t>Active</w:t>
+            </w:r>
+          </w:p>
+        </w:tc>
+        <w:tc>
+          <w:tcPr>
+            <w:tcW w:type="dxa" w:w="864"/>
+            <w:vAlign w:val="center"/>
+          </w:tcPr>
+          <w:p>
+            <w:r>
+              <w:rPr>
+                <w:sz w:val="15"/>
+              </w:rPr>
+              <w:t>67</w:t>
+            </w:r>
+          </w:p>
+        </w:tc>
+        <w:tc>
+          <w:tcPr>
+            <w:tcW w:type="dxa" w:w="936"/>
+            <w:vAlign w:val="center"/>
+          </w:tcPr>
+          <w:p>
+            <w:r>
+              <w:rPr>
+                <w:sz w:val="15"/>
+              </w:rPr>
+              <w:t>$2.24</w:t>
+            </w:r>
+          </w:p>
+        </w:tc>
+        <w:tc>
+          <w:tcPr>
+            <w:tcW w:type="dxa" w:w="1152"/>
+            <w:vAlign w:val="center"/>
+          </w:tcPr>
+          <w:p>
+            <w:r>
+              <w:rPr>
+                <w:sz w:val="15"/>
+              </w:rPr>
+              <w:t>6.0%</w:t>
+            </w:r>
+          </w:p>
+        </w:tc>
+        <w:tc>
+          <w:tcPr>
+            <w:tcW w:type="dxa" w:w="1296"/>
+            <w:vAlign w:val="center"/>
+          </w:tcPr>
+          <w:p>
+            <w:r>
+              <w:rPr>
+                <w:sz w:val="15"/>
+              </w:rPr>
+              <w:t>$50.05</w:t>
+            </w:r>
+          </w:p>
+        </w:tc>
+        <w:tc>
+          <w:tcPr>
+            <w:tcW w:type="dxa" w:w="864"/>
+            <w:vAlign w:val="center"/>
+          </w:tcPr>
+          <w:p>
+            <w:r>
+              <w:rPr>
+                <w:sz w:val="15"/>
+              </w:rPr>
+              <w:t>13.5%</w:t>
             </w:r>
           </w:p>
         </w:tc>
@@ -1175,7 +1275,7 @@
               <w:rPr>
                 <w:sz w:val="15"/>
               </w:rPr>
-              <w:t>5.9%</w:t>
+              <w:t>5.6%</w:t>
             </w:r>
           </w:p>
         </w:tc>
@@ -1203,107 +1303,7 @@
               <w:rPr>
                 <w:sz w:val="15"/>
               </w:rPr>
-              <w:t>2.7%</w:t>
-            </w:r>
-          </w:p>
-        </w:tc>
-      </w:tr>
-      <w:tr>
-        <w:tc>
-          <w:tcPr>
-            <w:tcW w:type="dxa" w:w="2880"/>
-            <w:vAlign w:val="center"/>
-          </w:tcPr>
-          <w:p>
-            <w:r>
-              <w:rPr>
-                <w:sz w:val="15"/>
-              </w:rPr>
-              <w:t>Game Android E</w:t>
-            </w:r>
-          </w:p>
-        </w:tc>
-        <w:tc>
-          <w:tcPr>
-            <w:tcW w:type="dxa" w:w="1080"/>
-            <w:vAlign w:val="center"/>
-          </w:tcPr>
-          <w:p>
-            <w:r>
-              <w:rPr>
-                <w:sz w:val="15"/>
-              </w:rPr>
-              <w:t>Active</w:t>
-            </w:r>
-          </w:p>
-        </w:tc>
-        <w:tc>
-          <w:tcPr>
-            <w:tcW w:type="dxa" w:w="864"/>
-            <w:vAlign w:val="center"/>
-          </w:tcPr>
-          <w:p>
-            <w:r>
-              <w:rPr>
-                <w:sz w:val="15"/>
-              </w:rPr>
-              <w:t>66</w:t>
-            </w:r>
-          </w:p>
-        </w:tc>
-        <w:tc>
-          <w:tcPr>
-            <w:tcW w:type="dxa" w:w="936"/>
-            <w:vAlign w:val="center"/>
-          </w:tcPr>
-          <w:p>
-            <w:r>
-              <w:rPr>
-                <w:sz w:val="15"/>
-              </w:rPr>
-              <w:t>$2.26</w:t>
-            </w:r>
-          </w:p>
-        </w:tc>
-        <w:tc>
-          <w:tcPr>
-            <w:tcW w:type="dxa" w:w="1152"/>
-            <w:vAlign w:val="center"/>
-          </w:tcPr>
-          <w:p>
-            <w:r>
-              <w:rPr>
-                <w:sz w:val="15"/>
-              </w:rPr>
-              <w:t>2.2%</w:t>
-            </w:r>
-          </w:p>
-        </w:tc>
-        <w:tc>
-          <w:tcPr>
-            <w:tcW w:type="dxa" w:w="1296"/>
-            <w:vAlign w:val="center"/>
-          </w:tcPr>
-          <w:p>
-            <w:r>
-              <w:rPr>
-                <w:sz w:val="15"/>
-              </w:rPr>
-              <w:t>$149.17</w:t>
-            </w:r>
-          </w:p>
-        </w:tc>
-        <w:tc>
-          <w:tcPr>
-            <w:tcW w:type="dxa" w:w="864"/>
-            <w:vAlign w:val="center"/>
-          </w:tcPr>
-          <w:p>
-            <w:r>
-              <w:rPr>
-                <w:sz w:val="15"/>
-              </w:rPr>
-              <w:t>13.3%</w:t>
+              <w:t>6.8%</w:t>
             </w:r>
           </w:p>
         </w:tc>
@@ -1830,7 +1830,7 @@
               <w:rPr>
                 <w:sz w:val="15"/>
               </w:rPr>
-              <w:t>1,114</w:t>
+              <w:t>1,160</w:t>
             </w:r>
           </w:p>
         </w:tc>

</xml_diff>